<commit_message>
Getting datastamp from frontend
</commit_message>
<xml_diff>
--- a/documents/2027_13.S1D_4_vizsgaremek_Adatbázismodell-diagramm.docx
+++ b/documents/2027_13.S1D_4_vizsgaremek_Adatbázismodell-diagramm.docx
@@ -861,21 +861,7 @@
                 <w:rStyle w:val="Hiperhivatkozs"/>
                 <w:noProof/>
               </w:rPr>
-              <w:t>auth.us</w:t>
-            </w:r>
-            <w:r>
-              <w:rPr>
-                <w:rStyle w:val="Hiperhivatkozs"/>
-                <w:noProof/>
-              </w:rPr>
-              <w:t>e</w:t>
-            </w:r>
-            <w:r>
-              <w:rPr>
-                <w:rStyle w:val="Hiperhivatkozs"/>
-                <w:noProof/>
-              </w:rPr>
-              <w:t>rs</w:t>
+              <w:t>auth.users</w:t>
             </w:r>
             <w:r>
               <w:rPr>
@@ -3432,6 +3418,69 @@
           </w:p>
         </w:tc>
       </w:tr>
+      <w:tr>
+        <w:trPr>
+          <w:trHeight w:val="270"/>
+        </w:trPr>
+        <w:tc>
+          <w:tcPr>
+            <w:cnfStyle w:val="001000000000" w:firstRow="0" w:lastRow="0" w:firstColumn="1" w:lastColumn="0" w:oddVBand="0" w:evenVBand="0" w:oddHBand="0" w:evenHBand="0" w:firstRowFirstColumn="0" w:firstRowLastColumn="0" w:lastRowFirstColumn="0" w:lastRowLastColumn="0"/>
+            <w:tcW w:w="2030" w:type="dxa"/>
+            <w:shd w:val="clear" w:color="auto" w:fill="7030A0"/>
+          </w:tcPr>
+          <w:p>
+            <w:proofErr w:type="spellStart"/>
+            <w:r>
+              <w:t>profilkep</w:t>
+            </w:r>
+            <w:proofErr w:type="spellEnd"/>
+          </w:p>
+        </w:tc>
+        <w:tc>
+          <w:tcPr>
+            <w:tcW w:w="1942" w:type="dxa"/>
+            <w:shd w:val="clear" w:color="auto" w:fill="CC99FF"/>
+          </w:tcPr>
+          <w:p>
+            <w:pPr>
+              <w:cnfStyle w:val="000000000000" w:firstRow="0" w:lastRow="0" w:firstColumn="0" w:lastColumn="0" w:oddVBand="0" w:evenVBand="0" w:oddHBand="0" w:evenHBand="0" w:firstRowFirstColumn="0" w:firstRowLastColumn="0" w:lastRowFirstColumn="0" w:lastRowLastColumn="0"/>
+            </w:pPr>
+            <w:r>
+              <w:t>text</w:t>
+            </w:r>
+          </w:p>
+        </w:tc>
+        <w:tc>
+          <w:tcPr>
+            <w:tcW w:w="1954" w:type="dxa"/>
+            <w:shd w:val="clear" w:color="auto" w:fill="CC99FF"/>
+          </w:tcPr>
+          <w:p>
+            <w:pPr>
+              <w:cnfStyle w:val="000000000000" w:firstRow="0" w:lastRow="0" w:firstColumn="0" w:lastColumn="0" w:oddVBand="0" w:evenVBand="0" w:oddHBand="0" w:evenHBand="0" w:firstRowFirstColumn="0" w:firstRowLastColumn="0" w:lastRowFirstColumn="0" w:lastRowLastColumn="0"/>
+            </w:pPr>
+            <w:proofErr w:type="spellStart"/>
+            <w:r>
+              <w:t>nullable</w:t>
+            </w:r>
+            <w:proofErr w:type="spellEnd"/>
+          </w:p>
+        </w:tc>
+        <w:tc>
+          <w:tcPr>
+            <w:tcW w:w="2012" w:type="dxa"/>
+            <w:shd w:val="clear" w:color="auto" w:fill="CC99FF"/>
+          </w:tcPr>
+          <w:p>
+            <w:pPr>
+              <w:cnfStyle w:val="000000000000" w:firstRow="0" w:lastRow="0" w:firstColumn="0" w:lastColumn="0" w:oddVBand="0" w:evenVBand="0" w:oddHBand="0" w:evenHBand="0" w:firstRowFirstColumn="0" w:firstRowLastColumn="0" w:lastRowFirstColumn="0" w:lastRowLastColumn="0"/>
+            </w:pPr>
+            <w:r>
+              <w:t>nem</w:t>
+            </w:r>
+          </w:p>
+        </w:tc>
+      </w:tr>
     </w:tbl>
     <w:p>
       <w:pPr>
@@ -3485,7 +3534,39 @@
         <w:t xml:space="preserve">Az ’xp’ mező a felhasználóhoz tartozó a webalkalmazásban megszerzett pont mennyiséget tartalmazza. </w:t>
       </w:r>
     </w:p>
-    <w:p/>
+    <w:p>
+      <w:pPr>
+        <w:pStyle w:val="Listaszerbekezds"/>
+        <w:numPr>
+          <w:ilvl w:val="0"/>
+          <w:numId w:val="11"/>
+        </w:numPr>
+      </w:pPr>
+      <w:r>
+        <w:t xml:space="preserve">A ’profilkep’ </w:t>
+      </w:r>
+      <w:r>
+        <w:t xml:space="preserve">mező ’text’ típusú értékeket tatalmaz, mert itt adjuk meg a Supabase projekthez tartozó Bucket-ban található </w:t>
+      </w:r>
+      <w:r>
+        <w:t>profil</w:t>
+      </w:r>
+      <w:r>
+        <w:t xml:space="preserve">képek elérési útját. A mező lehet ’NULL’, ugyanis nem minden </w:t>
+      </w:r>
+      <w:r>
+        <w:t>felhasználóhoz</w:t>
+      </w:r>
+      <w:r>
+        <w:t xml:space="preserve"> tartozik </w:t>
+      </w:r>
+      <w:r>
+        <w:t>profil</w:t>
+      </w:r>
+      <w:r>
+        <w:t>kép is.</w:t>
+      </w:r>
+    </w:p>
     <w:p>
       <w:pPr>
         <w:pStyle w:val="Cmsor2"/>
@@ -3729,7 +3810,6 @@
         <w:rPr>
           <w:color w:val="3A1953"/>
         </w:rPr>
-        <w:lastRenderedPageBreak/>
         <w:t>feladatok</w:t>
       </w:r>
       <w:bookmarkEnd w:id="8"/>
@@ -7533,18 +7613,18 @@
       <w:r>
         <w:lastRenderedPageBreak/>
         <w:drawing>
-          <wp:anchor distT="0" distB="0" distL="114300" distR="114300" simplePos="0" relativeHeight="251674624" behindDoc="0" locked="0" layoutInCell="1" allowOverlap="1" wp14:anchorId="243D9627" wp14:editId="114CCCB5">
+          <wp:anchor distT="0" distB="0" distL="114300" distR="114300" simplePos="0" relativeHeight="251660288" behindDoc="0" locked="0" layoutInCell="1" allowOverlap="1" wp14:anchorId="6A534E16" wp14:editId="7491A393">
             <wp:simplePos x="0" y="0"/>
-            <wp:positionH relativeFrom="page">
-              <wp:posOffset>952500</wp:posOffset>
+            <wp:positionH relativeFrom="column">
+              <wp:posOffset>52705</wp:posOffset>
             </wp:positionH>
             <wp:positionV relativeFrom="paragraph">
-              <wp:posOffset>328930</wp:posOffset>
+              <wp:posOffset>431800</wp:posOffset>
             </wp:positionV>
-            <wp:extent cx="5938520" cy="4552950"/>
-            <wp:effectExtent l="0" t="0" r="5080" b="0"/>
-            <wp:wrapSquare wrapText="bothSides"/>
-            <wp:docPr id="24" name="Kép 24"/>
+            <wp:extent cx="5703570" cy="4752975"/>
+            <wp:effectExtent l="0" t="0" r="0" b="9525"/>
+            <wp:wrapTopAndBottom/>
+            <wp:docPr id="1" name="Kép 1"/>
             <wp:cNvGraphicFramePr>
               <a:graphicFrameLocks xmlns:a="http://schemas.openxmlformats.org/drawingml/2006/main" noChangeAspect="1"/>
             </wp:cNvGraphicFramePr>
@@ -7552,7 +7632,7 @@
               <a:graphicData uri="http://schemas.openxmlformats.org/drawingml/2006/picture">
                 <pic:pic xmlns:pic="http://schemas.openxmlformats.org/drawingml/2006/picture">
                   <pic:nvPicPr>
-                    <pic:cNvPr id="24" name="Kép 24"/>
+                    <pic:cNvPr id="1" name=""/>
                     <pic:cNvPicPr/>
                   </pic:nvPicPr>
                   <pic:blipFill rotWithShape="1">
@@ -7563,13 +7643,13 @@
                         </a:ext>
                       </a:extLst>
                     </a:blip>
-                    <a:srcRect l="16171" r="17996"/>
+                    <a:srcRect l="992" b="253"/>
                     <a:stretch/>
                   </pic:blipFill>
                   <pic:spPr bwMode="auto">
                     <a:xfrm>
                       <a:off x="0" y="0"/>
-                      <a:ext cx="5938520" cy="4552950"/>
+                      <a:ext cx="5703570" cy="4752975"/>
                     </a:xfrm>
                     <a:prstGeom prst="rect">
                       <a:avLst/>
@@ -7652,6 +7732,7 @@
         <w:docPartUnique/>
       </w:docPartObj>
     </w:sdtPr>
+    <w:sdtEndPr/>
     <w:sdtContent>
       <w:sdt>
         <w:sdtPr>
@@ -7661,6 +7742,7 @@
             <w:docPartUnique/>
           </w:docPartObj>
         </w:sdtPr>
+        <w:sdtEndPr/>
         <w:sdtContent>
           <w:p>
             <w:pPr>

</xml_diff>

<commit_message>
Task corrector service and its backend api endpoint
</commit_message>
<xml_diff>
--- a/documents/2027_13.S1D_4_vizsgaremek_Adatbázismodell-diagramm.docx
+++ b/documents/2027_13.S1D_4_vizsgaremek_Adatbázismodell-diagramm.docx
@@ -1,6 +1,6 @@
 
 <file path=word/document.xml><?xml version="1.0" encoding="utf-8"?>
-<w:document xmlns:wpc="http://schemas.microsoft.com/office/word/2010/wordprocessingCanvas" xmlns:cx="http://schemas.microsoft.com/office/drawing/2014/chartex" xmlns:cx1="http://schemas.microsoft.com/office/drawing/2015/9/8/chartex" xmlns:cx2="http://schemas.microsoft.com/office/drawing/2015/10/21/chartex" xmlns:cx3="http://schemas.microsoft.com/office/drawing/2016/5/9/chartex" xmlns:cx4="http://schemas.microsoft.com/office/drawing/2016/5/10/chartex" xmlns:cx5="http://schemas.microsoft.com/office/drawing/2016/5/11/chartex" xmlns:cx6="http://schemas.microsoft.com/office/drawing/2016/5/12/chartex" xmlns:cx7="http://schemas.microsoft.com/office/drawing/2016/5/13/chartex" xmlns:cx8="http://schemas.microsoft.com/office/drawing/2016/5/14/chartex" xmlns:mc="http://schemas.openxmlformats.org/markup-compatibility/2006" xmlns:aink="http://schemas.microsoft.com/office/drawing/2016/ink" xmlns:am3d="http://schemas.microsoft.com/office/drawing/2017/model3d" xmlns:o="urn:schemas-microsoft-com:office:office" xmlns:r="http://schemas.openxmlformats.org/officeDocument/2006/relationships" xmlns:m="http://schemas.openxmlformats.org/officeDocument/2006/math" xmlns:v="urn:schemas-microsoft-com:vml" xmlns:wp14="http://schemas.microsoft.com/office/word/2010/wordprocessingDrawing" xmlns:wp="http://schemas.openxmlformats.org/drawingml/2006/wordprocessingDrawing" xmlns:w10="urn:schemas-microsoft-com:office:word" xmlns:w="http://schemas.openxmlformats.org/wordprocessingml/2006/main" xmlns:w14="http://schemas.microsoft.com/office/word/2010/wordml" xmlns:w15="http://schemas.microsoft.com/office/word/2012/wordml" xmlns:w16cex="http://schemas.microsoft.com/office/word/2018/wordml/cex" xmlns:w16cid="http://schemas.microsoft.com/office/word/2016/wordml/cid" xmlns:w16="http://schemas.microsoft.com/office/word/2018/wordml" xmlns:w16sdtdh="http://schemas.microsoft.com/office/word/2020/wordml/sdtdatahash" xmlns:w16se="http://schemas.microsoft.com/office/word/2015/wordml/symex" xmlns:wpg="http://schemas.microsoft.com/office/word/2010/wordprocessingGroup" xmlns:wpi="http://schemas.microsoft.com/office/word/2010/wordprocessingInk" xmlns:wne="http://schemas.microsoft.com/office/word/2006/wordml" xmlns:wps="http://schemas.microsoft.com/office/word/2010/wordprocessingShape" mc:Ignorable="w14 w15 w16se w16cid w16 w16cex w16sdtdh wp14">
+<w:document xmlns:wpc="http://schemas.microsoft.com/office/word/2010/wordprocessingCanvas" xmlns:cx="http://schemas.microsoft.com/office/drawing/2014/chartex" xmlns:cx1="http://schemas.microsoft.com/office/drawing/2015/9/8/chartex" xmlns:cx2="http://schemas.microsoft.com/office/drawing/2015/10/21/chartex" xmlns:cx3="http://schemas.microsoft.com/office/drawing/2016/5/9/chartex" xmlns:cx4="http://schemas.microsoft.com/office/drawing/2016/5/10/chartex" xmlns:cx5="http://schemas.microsoft.com/office/drawing/2016/5/11/chartex" xmlns:cx6="http://schemas.microsoft.com/office/drawing/2016/5/12/chartex" xmlns:cx7="http://schemas.microsoft.com/office/drawing/2016/5/13/chartex" xmlns:cx8="http://schemas.microsoft.com/office/drawing/2016/5/14/chartex" xmlns:mc="http://schemas.openxmlformats.org/markup-compatibility/2006" xmlns:aink="http://schemas.microsoft.com/office/drawing/2016/ink" xmlns:am3d="http://schemas.microsoft.com/office/drawing/2017/model3d" xmlns:o="urn:schemas-microsoft-com:office:office" xmlns:oel="http://schemas.microsoft.com/office/2019/extlst" xmlns:r="http://schemas.openxmlformats.org/officeDocument/2006/relationships" xmlns:m="http://schemas.openxmlformats.org/officeDocument/2006/math" xmlns:v="urn:schemas-microsoft-com:vml" xmlns:wp14="http://schemas.microsoft.com/office/word/2010/wordprocessingDrawing" xmlns:wp="http://schemas.openxmlformats.org/drawingml/2006/wordprocessingDrawing" xmlns:w10="urn:schemas-microsoft-com:office:word" xmlns:w="http://schemas.openxmlformats.org/wordprocessingml/2006/main" xmlns:w14="http://schemas.microsoft.com/office/word/2010/wordml" xmlns:w15="http://schemas.microsoft.com/office/word/2012/wordml" xmlns:w16cex="http://schemas.microsoft.com/office/word/2018/wordml/cex" xmlns:w16cid="http://schemas.microsoft.com/office/word/2016/wordml/cid" xmlns:w16="http://schemas.microsoft.com/office/word/2018/wordml" xmlns:w16du="http://schemas.microsoft.com/office/word/2023/wordml/word16du" xmlns:w16sdtdh="http://schemas.microsoft.com/office/word/2020/wordml/sdtdatahash" xmlns:w16sdtfl="http://schemas.microsoft.com/office/word/2024/wordml/sdtformatlock" xmlns:w16se="http://schemas.microsoft.com/office/word/2015/wordml/symex" xmlns:wpg="http://schemas.microsoft.com/office/word/2010/wordprocessingGroup" xmlns:wpi="http://schemas.microsoft.com/office/word/2010/wordprocessingInk" xmlns:wne="http://schemas.microsoft.com/office/word/2006/wordml" xmlns:wps="http://schemas.microsoft.com/office/word/2010/wordprocessingShape" mc:Ignorable="w14 w15 w16se w16cid w16 w16cex w16sdtdh w16sdtfl w16du wp14">
   <w:body>
     <w:p>
       <w:pPr>
@@ -1676,14 +1676,12 @@
                 <w:bCs w:val="0"/>
               </w:rPr>
             </w:pPr>
-            <w:proofErr w:type="spellStart"/>
             <w:r>
               <w:rPr>
                 <w:bCs w:val="0"/>
               </w:rPr>
               <w:t>Nullable</w:t>
             </w:r>
-            <w:proofErr w:type="spellEnd"/>
           </w:p>
         </w:tc>
         <w:tc>
@@ -1700,14 +1698,12 @@
                 <w:bCs w:val="0"/>
               </w:rPr>
             </w:pPr>
-            <w:proofErr w:type="spellStart"/>
             <w:r>
               <w:rPr>
                 <w:bCs w:val="0"/>
               </w:rPr>
               <w:t>Unique</w:t>
             </w:r>
-            <w:proofErr w:type="spellEnd"/>
           </w:p>
         </w:tc>
       </w:tr>
@@ -1727,11 +1723,9 @@
             <w:pPr>
               <w:ind w:left="-304" w:firstLine="304"/>
             </w:pPr>
-            <w:proofErr w:type="spellStart"/>
             <w:r>
               <w:t>id</w:t>
             </w:r>
-            <w:proofErr w:type="spellEnd"/>
           </w:p>
         </w:tc>
         <w:tc>
@@ -1792,11 +1786,9 @@
             <w:hideMark/>
           </w:tcPr>
           <w:p>
-            <w:proofErr w:type="spellStart"/>
             <w:r>
               <w:t>nev</w:t>
             </w:r>
-            <w:proofErr w:type="spellEnd"/>
           </w:p>
         </w:tc>
         <w:tc>
@@ -1926,11 +1918,9 @@
               <w:jc w:val="center"/>
               <w:cnfStyle w:val="100000000000" w:firstRow="1" w:lastRow="0" w:firstColumn="0" w:lastColumn="0" w:oddVBand="0" w:evenVBand="0" w:oddHBand="0" w:evenHBand="0" w:firstRowFirstColumn="0" w:firstRowLastColumn="0" w:lastRowFirstColumn="0" w:lastRowLastColumn="0"/>
             </w:pPr>
-            <w:proofErr w:type="spellStart"/>
             <w:r>
               <w:t>Nullable</w:t>
             </w:r>
-            <w:proofErr w:type="spellEnd"/>
           </w:p>
         </w:tc>
         <w:tc>
@@ -1944,11 +1934,9 @@
               <w:jc w:val="center"/>
               <w:cnfStyle w:val="100000000000" w:firstRow="1" w:lastRow="0" w:firstColumn="0" w:lastColumn="0" w:oddVBand="0" w:evenVBand="0" w:oddHBand="0" w:evenHBand="0" w:firstRowFirstColumn="0" w:firstRowLastColumn="0" w:lastRowFirstColumn="0" w:lastRowLastColumn="0"/>
             </w:pPr>
-            <w:proofErr w:type="spellStart"/>
             <w:r>
               <w:t>Unique</w:t>
             </w:r>
-            <w:proofErr w:type="spellEnd"/>
           </w:p>
         </w:tc>
       </w:tr>
@@ -1964,11 +1952,9 @@
             <w:shd w:val="clear" w:color="auto" w:fill="7030A0"/>
           </w:tcPr>
           <w:p>
-            <w:proofErr w:type="spellStart"/>
             <w:r>
               <w:t>id</w:t>
             </w:r>
-            <w:proofErr w:type="spellEnd"/>
           </w:p>
         </w:tc>
         <w:tc>
@@ -2025,11 +2011,9 @@
             <w:shd w:val="clear" w:color="auto" w:fill="7030A0"/>
           </w:tcPr>
           <w:p>
-            <w:proofErr w:type="spellStart"/>
             <w:r>
               <w:t>tantargy_id</w:t>
             </w:r>
-            <w:proofErr w:type="spellEnd"/>
           </w:p>
         </w:tc>
         <w:tc>
@@ -2087,11 +2071,9 @@
             <w:shd w:val="clear" w:color="auto" w:fill="7030A0"/>
           </w:tcPr>
           <w:p>
-            <w:proofErr w:type="spellStart"/>
             <w:r>
               <w:t>nev</w:t>
             </w:r>
-            <w:proofErr w:type="spellEnd"/>
           </w:p>
         </w:tc>
         <w:tc>
@@ -2219,11 +2201,9 @@
               <w:jc w:val="center"/>
               <w:cnfStyle w:val="100000000000" w:firstRow="1" w:lastRow="0" w:firstColumn="0" w:lastColumn="0" w:oddVBand="0" w:evenVBand="0" w:oddHBand="0" w:evenHBand="0" w:firstRowFirstColumn="0" w:firstRowLastColumn="0" w:lastRowFirstColumn="0" w:lastRowLastColumn="0"/>
             </w:pPr>
-            <w:proofErr w:type="spellStart"/>
             <w:r>
               <w:t>Nullable</w:t>
             </w:r>
-            <w:proofErr w:type="spellEnd"/>
           </w:p>
         </w:tc>
         <w:tc>
@@ -2237,11 +2217,9 @@
               <w:jc w:val="center"/>
               <w:cnfStyle w:val="100000000000" w:firstRow="1" w:lastRow="0" w:firstColumn="0" w:lastColumn="0" w:oddVBand="0" w:evenVBand="0" w:oddHBand="0" w:evenHBand="0" w:firstRowFirstColumn="0" w:firstRowLastColumn="0" w:lastRowFirstColumn="0" w:lastRowLastColumn="0"/>
             </w:pPr>
-            <w:proofErr w:type="spellStart"/>
             <w:r>
               <w:t>Unique</w:t>
             </w:r>
-            <w:proofErr w:type="spellEnd"/>
           </w:p>
         </w:tc>
       </w:tr>
@@ -2257,11 +2235,9 @@
             <w:shd w:val="clear" w:color="auto" w:fill="7030A0"/>
           </w:tcPr>
           <w:p>
-            <w:proofErr w:type="spellStart"/>
             <w:r>
               <w:t>id</w:t>
             </w:r>
-            <w:proofErr w:type="spellEnd"/>
           </w:p>
         </w:tc>
         <w:tc>
@@ -2318,11 +2294,9 @@
             <w:shd w:val="clear" w:color="auto" w:fill="7030A0"/>
           </w:tcPr>
           <w:p>
-            <w:proofErr w:type="spellStart"/>
             <w:r>
               <w:t>szoveg</w:t>
             </w:r>
-            <w:proofErr w:type="spellEnd"/>
           </w:p>
         </w:tc>
         <w:tc>
@@ -2380,11 +2354,9 @@
             <w:shd w:val="clear" w:color="auto" w:fill="7030A0"/>
           </w:tcPr>
           <w:p>
-            <w:proofErr w:type="spellStart"/>
             <w:r>
               <w:t>kep</w:t>
             </w:r>
-            <w:proofErr w:type="spellEnd"/>
           </w:p>
         </w:tc>
         <w:tc>
@@ -2410,11 +2382,9 @@
             <w:pPr>
               <w:cnfStyle w:val="000000100000" w:firstRow="0" w:lastRow="0" w:firstColumn="0" w:lastColumn="0" w:oddVBand="0" w:evenVBand="0" w:oddHBand="1" w:evenHBand="0" w:firstRowFirstColumn="0" w:firstRowLastColumn="0" w:lastRowFirstColumn="0" w:lastRowLastColumn="0"/>
             </w:pPr>
-            <w:proofErr w:type="spellStart"/>
             <w:r>
               <w:t>nullable</w:t>
             </w:r>
-            <w:proofErr w:type="spellEnd"/>
           </w:p>
         </w:tc>
         <w:tc>
@@ -2556,11 +2526,9 @@
               <w:jc w:val="center"/>
               <w:cnfStyle w:val="100000000000" w:firstRow="1" w:lastRow="0" w:firstColumn="0" w:lastColumn="0" w:oddVBand="0" w:evenVBand="0" w:oddHBand="0" w:evenHBand="0" w:firstRowFirstColumn="0" w:firstRowLastColumn="0" w:lastRowFirstColumn="0" w:lastRowLastColumn="0"/>
             </w:pPr>
-            <w:proofErr w:type="spellStart"/>
             <w:r>
               <w:t>Nullable</w:t>
             </w:r>
-            <w:proofErr w:type="spellEnd"/>
           </w:p>
         </w:tc>
         <w:tc>
@@ -2574,11 +2542,9 @@
               <w:jc w:val="center"/>
               <w:cnfStyle w:val="100000000000" w:firstRow="1" w:lastRow="0" w:firstColumn="0" w:lastColumn="0" w:oddVBand="0" w:evenVBand="0" w:oddHBand="0" w:evenHBand="0" w:firstRowFirstColumn="0" w:firstRowLastColumn="0" w:lastRowFirstColumn="0" w:lastRowLastColumn="0"/>
             </w:pPr>
-            <w:proofErr w:type="spellStart"/>
             <w:r>
               <w:t>Unique</w:t>
             </w:r>
-            <w:proofErr w:type="spellEnd"/>
           </w:p>
         </w:tc>
       </w:tr>
@@ -2594,11 +2560,9 @@
             <w:shd w:val="clear" w:color="auto" w:fill="7030A0"/>
           </w:tcPr>
           <w:p>
-            <w:proofErr w:type="spellStart"/>
             <w:r>
               <w:t>id</w:t>
             </w:r>
-            <w:proofErr w:type="spellEnd"/>
           </w:p>
         </w:tc>
         <w:tc>
@@ -2655,11 +2619,9 @@
             <w:shd w:val="clear" w:color="auto" w:fill="7030A0"/>
           </w:tcPr>
           <w:p>
-            <w:proofErr w:type="spellStart"/>
             <w:r>
               <w:t>ev</w:t>
             </w:r>
-            <w:proofErr w:type="spellEnd"/>
           </w:p>
         </w:tc>
         <w:tc>
@@ -2731,11 +2693,9 @@
             <w:pPr>
               <w:cnfStyle w:val="000000100000" w:firstRow="0" w:lastRow="0" w:firstColumn="0" w:lastColumn="0" w:oddVBand="0" w:evenVBand="0" w:oddHBand="1" w:evenHBand="0" w:firstRowFirstColumn="0" w:firstRowLastColumn="0" w:lastRowFirstColumn="0" w:lastRowLastColumn="0"/>
             </w:pPr>
-            <w:proofErr w:type="spellStart"/>
             <w:r>
               <w:t>varchar</w:t>
             </w:r>
-            <w:proofErr w:type="spellEnd"/>
           </w:p>
         </w:tc>
         <w:tc>
@@ -2849,11 +2809,9 @@
               <w:jc w:val="center"/>
               <w:cnfStyle w:val="100000000000" w:firstRow="1" w:lastRow="0" w:firstColumn="0" w:lastColumn="0" w:oddVBand="0" w:evenVBand="0" w:oddHBand="0" w:evenHBand="0" w:firstRowFirstColumn="0" w:firstRowLastColumn="0" w:lastRowFirstColumn="0" w:lastRowLastColumn="0"/>
             </w:pPr>
-            <w:proofErr w:type="spellStart"/>
             <w:r>
               <w:t>Nullable</w:t>
             </w:r>
-            <w:proofErr w:type="spellEnd"/>
           </w:p>
         </w:tc>
         <w:tc>
@@ -2867,11 +2825,9 @@
               <w:jc w:val="center"/>
               <w:cnfStyle w:val="100000000000" w:firstRow="1" w:lastRow="0" w:firstColumn="0" w:lastColumn="0" w:oddVBand="0" w:evenVBand="0" w:oddHBand="0" w:evenHBand="0" w:firstRowFirstColumn="0" w:firstRowLastColumn="0" w:lastRowFirstColumn="0" w:lastRowLastColumn="0"/>
             </w:pPr>
-            <w:proofErr w:type="spellStart"/>
             <w:r>
               <w:t>Unique</w:t>
             </w:r>
-            <w:proofErr w:type="spellEnd"/>
           </w:p>
         </w:tc>
       </w:tr>
@@ -2887,11 +2843,9 @@
             <w:shd w:val="clear" w:color="auto" w:fill="7030A0"/>
           </w:tcPr>
           <w:p>
-            <w:proofErr w:type="spellStart"/>
             <w:r>
               <w:t>id</w:t>
             </w:r>
-            <w:proofErr w:type="spellEnd"/>
           </w:p>
         </w:tc>
         <w:tc>
@@ -2948,11 +2902,9 @@
             <w:shd w:val="clear" w:color="auto" w:fill="7030A0"/>
           </w:tcPr>
           <w:p>
-            <w:proofErr w:type="spellStart"/>
             <w:r>
               <w:t>nev</w:t>
             </w:r>
-            <w:proofErr w:type="spellEnd"/>
           </w:p>
         </w:tc>
         <w:tc>
@@ -3082,11 +3034,9 @@
               <w:jc w:val="center"/>
               <w:cnfStyle w:val="100000000000" w:firstRow="1" w:lastRow="0" w:firstColumn="0" w:lastColumn="0" w:oddVBand="0" w:evenVBand="0" w:oddHBand="0" w:evenHBand="0" w:firstRowFirstColumn="0" w:firstRowLastColumn="0" w:lastRowFirstColumn="0" w:lastRowLastColumn="0"/>
             </w:pPr>
-            <w:proofErr w:type="spellStart"/>
             <w:r>
               <w:t>Nullable</w:t>
             </w:r>
-            <w:proofErr w:type="spellEnd"/>
           </w:p>
         </w:tc>
         <w:tc>
@@ -3100,11 +3050,9 @@
               <w:jc w:val="center"/>
               <w:cnfStyle w:val="100000000000" w:firstRow="1" w:lastRow="0" w:firstColumn="0" w:lastColumn="0" w:oddVBand="0" w:evenVBand="0" w:oddHBand="0" w:evenHBand="0" w:firstRowFirstColumn="0" w:firstRowLastColumn="0" w:lastRowFirstColumn="0" w:lastRowLastColumn="0"/>
             </w:pPr>
-            <w:proofErr w:type="spellStart"/>
             <w:r>
               <w:t>Unique</w:t>
             </w:r>
-            <w:proofErr w:type="spellEnd"/>
           </w:p>
         </w:tc>
       </w:tr>
@@ -3120,11 +3068,9 @@
             <w:shd w:val="clear" w:color="auto" w:fill="7030A0"/>
           </w:tcPr>
           <w:p>
-            <w:proofErr w:type="spellStart"/>
             <w:r>
               <w:t>id</w:t>
             </w:r>
-            <w:proofErr w:type="spellEnd"/>
           </w:p>
         </w:tc>
         <w:tc>
@@ -3136,11 +3082,9 @@
             <w:pPr>
               <w:cnfStyle w:val="000000100000" w:firstRow="0" w:lastRow="0" w:firstColumn="0" w:lastColumn="0" w:oddVBand="0" w:evenVBand="0" w:oddHBand="1" w:evenHBand="0" w:firstRowFirstColumn="0" w:firstRowLastColumn="0" w:lastRowFirstColumn="0" w:lastRowLastColumn="0"/>
             </w:pPr>
-            <w:proofErr w:type="spellStart"/>
             <w:r>
               <w:t>uuid</w:t>
             </w:r>
-            <w:proofErr w:type="spellEnd"/>
           </w:p>
         </w:tc>
         <w:tc>
@@ -3183,11 +3127,9 @@
             <w:shd w:val="clear" w:color="auto" w:fill="7030A0"/>
           </w:tcPr>
           <w:p>
-            <w:proofErr w:type="spellStart"/>
             <w:r>
               <w:t>felhasznalonev</w:t>
             </w:r>
-            <w:proofErr w:type="spellEnd"/>
           </w:p>
         </w:tc>
         <w:tc>
@@ -3199,11 +3141,9 @@
             <w:pPr>
               <w:cnfStyle w:val="000000000000" w:firstRow="0" w:lastRow="0" w:firstColumn="0" w:lastColumn="0" w:oddVBand="0" w:evenVBand="0" w:oddHBand="0" w:evenHBand="0" w:firstRowFirstColumn="0" w:firstRowLastColumn="0" w:lastRowFirstColumn="0" w:lastRowLastColumn="0"/>
             </w:pPr>
-            <w:proofErr w:type="spellStart"/>
             <w:r>
               <w:t>varchar</w:t>
             </w:r>
-            <w:proofErr w:type="spellEnd"/>
           </w:p>
         </w:tc>
         <w:tc>
@@ -3261,11 +3201,9 @@
             <w:pPr>
               <w:cnfStyle w:val="000000100000" w:firstRow="0" w:lastRow="0" w:firstColumn="0" w:lastColumn="0" w:oddVBand="0" w:evenVBand="0" w:oddHBand="1" w:evenHBand="0" w:firstRowFirstColumn="0" w:firstRowLastColumn="0" w:lastRowFirstColumn="0" w:lastRowLastColumn="0"/>
             </w:pPr>
-            <w:proofErr w:type="spellStart"/>
             <w:r>
               <w:t>varchar</w:t>
             </w:r>
-            <w:proofErr w:type="spellEnd"/>
           </w:p>
         </w:tc>
         <w:tc>
@@ -3368,11 +3306,9 @@
             <w:shd w:val="clear" w:color="auto" w:fill="7030A0"/>
           </w:tcPr>
           <w:p>
-            <w:proofErr w:type="spellStart"/>
             <w:r>
               <w:t>xp</w:t>
             </w:r>
-            <w:proofErr w:type="spellEnd"/>
           </w:p>
         </w:tc>
         <w:tc>
@@ -3429,11 +3365,9 @@
             <w:shd w:val="clear" w:color="auto" w:fill="7030A0"/>
           </w:tcPr>
           <w:p>
-            <w:proofErr w:type="spellStart"/>
             <w:r>
               <w:t>profilkep</w:t>
             </w:r>
-            <w:proofErr w:type="spellEnd"/>
           </w:p>
         </w:tc>
         <w:tc>
@@ -3459,11 +3393,9 @@
             <w:pPr>
               <w:cnfStyle w:val="000000000000" w:firstRow="0" w:lastRow="0" w:firstColumn="0" w:lastColumn="0" w:oddVBand="0" w:evenVBand="0" w:oddHBand="0" w:evenHBand="0" w:firstRowFirstColumn="0" w:firstRowLastColumn="0" w:lastRowFirstColumn="0" w:lastRowLastColumn="0"/>
             </w:pPr>
-            <w:proofErr w:type="spellStart"/>
             <w:r>
               <w:t>nullable</w:t>
             </w:r>
-            <w:proofErr w:type="spellEnd"/>
           </w:p>
         </w:tc>
         <w:tc>
@@ -3543,28 +3475,7 @@
         </w:numPr>
       </w:pPr>
       <w:r>
-        <w:t xml:space="preserve">A ’profilkep’ </w:t>
-      </w:r>
-      <w:r>
-        <w:t xml:space="preserve">mező ’text’ típusú értékeket tatalmaz, mert itt adjuk meg a Supabase projekthez tartozó Bucket-ban található </w:t>
-      </w:r>
-      <w:r>
-        <w:t>profil</w:t>
-      </w:r>
-      <w:r>
-        <w:t xml:space="preserve">képek elérési útját. A mező lehet ’NULL’, ugyanis nem minden </w:t>
-      </w:r>
-      <w:r>
-        <w:t>felhasználóhoz</w:t>
-      </w:r>
-      <w:r>
-        <w:t xml:space="preserve"> tartozik </w:t>
-      </w:r>
-      <w:r>
-        <w:t>profil</w:t>
-      </w:r>
-      <w:r>
-        <w:t>kép is.</w:t>
+        <w:t>A ’profilkep’ mező ’text’ típusú értékeket tatalmaz, mert itt adjuk meg a Supabase projekthez tartozó Bucket-ban található profilképek elérési útját. A mező lehet ’NULL’, ugyanis nem minden felhasználóhoz tartozik profilkép is.</w:t>
       </w:r>
     </w:p>
     <w:p>
@@ -3603,115 +3514,7 @@
           <w:sz w:val="28"/>
           <w:szCs w:val="28"/>
         </w:rPr>
-        <w:t xml:space="preserve">A </w:t>
-      </w:r>
-      <w:proofErr w:type="spellStart"/>
-      <w:r>
-        <w:rPr>
-          <w:rFonts w:ascii="Times New Roman" w:hAnsi="Times New Roman" w:cs="Times New Roman"/>
-          <w:sz w:val="28"/>
-          <w:szCs w:val="28"/>
-        </w:rPr>
-        <w:t>Supabase</w:t>
-      </w:r>
-      <w:proofErr w:type="spellEnd"/>
-      <w:r>
-        <w:rPr>
-          <w:rFonts w:ascii="Times New Roman" w:hAnsi="Times New Roman" w:cs="Times New Roman"/>
-          <w:sz w:val="28"/>
-          <w:szCs w:val="28"/>
-        </w:rPr>
-        <w:t xml:space="preserve"> Auth által kezelt, beépített felhasználói tábla (’</w:t>
-      </w:r>
-      <w:proofErr w:type="spellStart"/>
-      <w:r>
-        <w:rPr>
-          <w:rFonts w:ascii="Times New Roman" w:hAnsi="Times New Roman" w:cs="Times New Roman"/>
-          <w:sz w:val="28"/>
-          <w:szCs w:val="28"/>
-        </w:rPr>
-        <w:t>auth</w:t>
-      </w:r>
-      <w:proofErr w:type="spellEnd"/>
-      <w:r>
-        <w:rPr>
-          <w:rFonts w:ascii="Times New Roman" w:hAnsi="Times New Roman" w:cs="Times New Roman"/>
-          <w:sz w:val="28"/>
-          <w:szCs w:val="28"/>
-        </w:rPr>
-        <w:t xml:space="preserve">’ séma). A hitelesítési adatokat (e-mail, jelszó </w:t>
-      </w:r>
-      <w:proofErr w:type="spellStart"/>
-      <w:r>
-        <w:rPr>
-          <w:rFonts w:ascii="Times New Roman" w:hAnsi="Times New Roman" w:cs="Times New Roman"/>
-          <w:sz w:val="28"/>
-          <w:szCs w:val="28"/>
-        </w:rPr>
-        <w:t>hash</w:t>
-      </w:r>
-      <w:proofErr w:type="spellEnd"/>
-      <w:r>
-        <w:rPr>
-          <w:rFonts w:ascii="Times New Roman" w:hAnsi="Times New Roman" w:cs="Times New Roman"/>
-          <w:sz w:val="28"/>
-          <w:szCs w:val="28"/>
-        </w:rPr>
-        <w:t>, bejelentkezési adatok) tárolja, és minden regisztrált felhasználóhoz egy egyedi ’</w:t>
-      </w:r>
-      <w:proofErr w:type="spellStart"/>
-      <w:r>
-        <w:rPr>
-          <w:rFonts w:ascii="Times New Roman" w:hAnsi="Times New Roman" w:cs="Times New Roman"/>
-          <w:sz w:val="28"/>
-          <w:szCs w:val="28"/>
-        </w:rPr>
-        <w:t>uuid</w:t>
-      </w:r>
-      <w:proofErr w:type="spellEnd"/>
-      <w:r>
-        <w:rPr>
-          <w:rFonts w:ascii="Times New Roman" w:hAnsi="Times New Roman" w:cs="Times New Roman"/>
-          <w:sz w:val="28"/>
-          <w:szCs w:val="28"/>
-        </w:rPr>
-        <w:t xml:space="preserve">’ azonosítót rendel. Az alkalmazás ezt nem módosítja közvetlenül, a regisztrációt és bejelentkezést a </w:t>
-      </w:r>
-      <w:proofErr w:type="spellStart"/>
-      <w:r>
-        <w:rPr>
-          <w:rFonts w:ascii="Times New Roman" w:hAnsi="Times New Roman" w:cs="Times New Roman"/>
-          <w:sz w:val="28"/>
-          <w:szCs w:val="28"/>
-        </w:rPr>
-        <w:t>Supabase</w:t>
-      </w:r>
-      <w:proofErr w:type="spellEnd"/>
-      <w:r>
-        <w:rPr>
-          <w:rFonts w:ascii="Times New Roman" w:hAnsi="Times New Roman" w:cs="Times New Roman"/>
-          <w:sz w:val="28"/>
-          <w:szCs w:val="28"/>
-        </w:rPr>
-        <w:t xml:space="preserve"> Auth végzi. Az alkalmazás saját felhasználói adatai a ’profilok’ táblában vannak, amelynek ’</w:t>
-      </w:r>
-      <w:proofErr w:type="spellStart"/>
-      <w:r>
-        <w:rPr>
-          <w:rFonts w:ascii="Times New Roman" w:hAnsi="Times New Roman" w:cs="Times New Roman"/>
-          <w:sz w:val="28"/>
-          <w:szCs w:val="28"/>
-        </w:rPr>
-        <w:t>id</w:t>
-      </w:r>
-      <w:proofErr w:type="spellEnd"/>
-      <w:r>
-        <w:rPr>
-          <w:rFonts w:ascii="Times New Roman" w:hAnsi="Times New Roman" w:cs="Times New Roman"/>
-          <w:sz w:val="28"/>
-          <w:szCs w:val="28"/>
-        </w:rPr>
-        <w:t>’ mezője az ’auth.users.id’-re hivatkozó idegen kulcs, így a kettő között 1:1 kapcsolat van.</w:t>
+        <w:t>A Supabase Auth által kezelt, beépített felhasználói tábla (’auth’ séma). A hitelesítési adatokat (e-mail, jelszó hash, bejelentkezési adatok) tárolja, és minden regisztrált felhasználóhoz egy egyedi ’uuid’ azonosítót rendel. Az alkalmazás ezt nem módosítja közvetlenül, a regisztrációt és bejelentkezést a Supabase Auth végzi. Az alkalmazás saját felhasználói adatai a ’profilok’ táblában vannak, amelynek ’id’ mezője az ’auth.users.id’-re hivatkozó idegen kulcs, így a kettő között 1:1 kapcsolat van.</w:t>
       </w:r>
     </w:p>
     <w:p>
@@ -3875,11 +3678,9 @@
               <w:jc w:val="center"/>
               <w:cnfStyle w:val="100000000000" w:firstRow="1" w:lastRow="0" w:firstColumn="0" w:lastColumn="0" w:oddVBand="0" w:evenVBand="0" w:oddHBand="0" w:evenHBand="0" w:firstRowFirstColumn="0" w:firstRowLastColumn="0" w:lastRowFirstColumn="0" w:lastRowLastColumn="0"/>
             </w:pPr>
-            <w:proofErr w:type="spellStart"/>
             <w:r>
               <w:t>Nullable</w:t>
             </w:r>
-            <w:proofErr w:type="spellEnd"/>
           </w:p>
         </w:tc>
         <w:tc>
@@ -3893,11 +3694,9 @@
               <w:jc w:val="center"/>
               <w:cnfStyle w:val="100000000000" w:firstRow="1" w:lastRow="0" w:firstColumn="0" w:lastColumn="0" w:oddVBand="0" w:evenVBand="0" w:oddHBand="0" w:evenHBand="0" w:firstRowFirstColumn="0" w:firstRowLastColumn="0" w:lastRowFirstColumn="0" w:lastRowLastColumn="0"/>
             </w:pPr>
-            <w:proofErr w:type="spellStart"/>
             <w:r>
               <w:t>Unique</w:t>
             </w:r>
-            <w:proofErr w:type="spellEnd"/>
           </w:p>
         </w:tc>
       </w:tr>
@@ -3913,11 +3712,9 @@
             <w:shd w:val="clear" w:color="auto" w:fill="7030A0"/>
           </w:tcPr>
           <w:p>
-            <w:proofErr w:type="spellStart"/>
             <w:r>
               <w:t>id</w:t>
             </w:r>
-            <w:proofErr w:type="spellEnd"/>
           </w:p>
         </w:tc>
         <w:tc>
@@ -3974,11 +3771,9 @@
             <w:shd w:val="clear" w:color="auto" w:fill="7030A0"/>
           </w:tcPr>
           <w:p>
-            <w:proofErr w:type="spellStart"/>
             <w:r>
               <w:t>temakor_id</w:t>
             </w:r>
-            <w:proofErr w:type="spellEnd"/>
           </w:p>
         </w:tc>
         <w:tc>
@@ -4036,11 +3831,9 @@
             <w:shd w:val="clear" w:color="auto" w:fill="7030A0"/>
           </w:tcPr>
           <w:p>
-            <w:proofErr w:type="spellStart"/>
             <w:r>
               <w:t>forras_id</w:t>
             </w:r>
-            <w:proofErr w:type="spellEnd"/>
           </w:p>
         </w:tc>
         <w:tc>
@@ -4066,11 +3859,9 @@
             <w:pPr>
               <w:cnfStyle w:val="000000100000" w:firstRow="0" w:lastRow="0" w:firstColumn="0" w:lastColumn="0" w:oddVBand="0" w:evenVBand="0" w:oddHBand="1" w:evenHBand="0" w:firstRowFirstColumn="0" w:firstRowLastColumn="0" w:lastRowFirstColumn="0" w:lastRowLastColumn="0"/>
             </w:pPr>
-            <w:proofErr w:type="spellStart"/>
             <w:r>
               <w:t>nullable</w:t>
             </w:r>
-            <w:proofErr w:type="spellEnd"/>
           </w:p>
         </w:tc>
         <w:tc>
@@ -4099,11 +3890,9 @@
             <w:shd w:val="clear" w:color="auto" w:fill="7030A0"/>
           </w:tcPr>
           <w:p>
-            <w:proofErr w:type="spellStart"/>
             <w:r>
               <w:t>kerdes</w:t>
             </w:r>
-            <w:proofErr w:type="spellEnd"/>
           </w:p>
         </w:tc>
         <w:tc>
@@ -4161,11 +3950,9 @@
             <w:shd w:val="clear" w:color="auto" w:fill="7030A0"/>
           </w:tcPr>
           <w:p>
-            <w:proofErr w:type="spellStart"/>
             <w:r>
               <w:t>valaszok</w:t>
             </w:r>
-            <w:proofErr w:type="spellEnd"/>
           </w:p>
         </w:tc>
         <w:tc>
@@ -4191,11 +3978,9 @@
             <w:pPr>
               <w:cnfStyle w:val="000000100000" w:firstRow="0" w:lastRow="0" w:firstColumn="0" w:lastColumn="0" w:oddVBand="0" w:evenVBand="0" w:oddHBand="1" w:evenHBand="0" w:firstRowFirstColumn="0" w:firstRowLastColumn="0" w:lastRowFirstColumn="0" w:lastRowLastColumn="0"/>
             </w:pPr>
-            <w:proofErr w:type="spellStart"/>
             <w:r>
               <w:t>nullable</w:t>
             </w:r>
-            <w:proofErr w:type="spellEnd"/>
           </w:p>
         </w:tc>
         <w:tc>
@@ -4284,11 +4069,9 @@
             <w:shd w:val="clear" w:color="auto" w:fill="7030A0"/>
           </w:tcPr>
           <w:p>
-            <w:proofErr w:type="spellStart"/>
             <w:r>
               <w:t>ev_id</w:t>
             </w:r>
-            <w:proofErr w:type="spellEnd"/>
           </w:p>
         </w:tc>
         <w:tc>
@@ -4345,11 +4128,9 @@
             <w:shd w:val="clear" w:color="auto" w:fill="7030A0"/>
           </w:tcPr>
           <w:p>
-            <w:proofErr w:type="spellStart"/>
             <w:r>
               <w:t>helyes_valaszok</w:t>
             </w:r>
-            <w:proofErr w:type="spellEnd"/>
           </w:p>
         </w:tc>
         <w:tc>
@@ -4375,11 +4156,9 @@
             <w:pPr>
               <w:cnfStyle w:val="000000000000" w:firstRow="0" w:lastRow="0" w:firstColumn="0" w:lastColumn="0" w:oddVBand="0" w:evenVBand="0" w:oddHBand="0" w:evenHBand="0" w:firstRowFirstColumn="0" w:firstRowLastColumn="0" w:lastRowFirstColumn="0" w:lastRowLastColumn="0"/>
             </w:pPr>
-            <w:proofErr w:type="spellStart"/>
             <w:r>
               <w:t>nullable</w:t>
             </w:r>
-            <w:proofErr w:type="spellEnd"/>
           </w:p>
         </w:tc>
         <w:tc>
@@ -4409,11 +4188,9 @@
             <w:shd w:val="clear" w:color="auto" w:fill="7030A0"/>
           </w:tcPr>
           <w:p>
-            <w:proofErr w:type="spellStart"/>
             <w:r>
               <w:t>tipus_id</w:t>
             </w:r>
-            <w:proofErr w:type="spellEnd"/>
           </w:p>
         </w:tc>
         <w:tc>
@@ -4618,11 +4395,9 @@
               <w:jc w:val="center"/>
               <w:cnfStyle w:val="100000000000" w:firstRow="1" w:lastRow="0" w:firstColumn="0" w:lastColumn="0" w:oddVBand="0" w:evenVBand="0" w:oddHBand="0" w:evenHBand="0" w:firstRowFirstColumn="0" w:firstRowLastColumn="0" w:lastRowFirstColumn="0" w:lastRowLastColumn="0"/>
             </w:pPr>
-            <w:proofErr w:type="spellStart"/>
             <w:r>
               <w:t>Nullable</w:t>
             </w:r>
-            <w:proofErr w:type="spellEnd"/>
           </w:p>
         </w:tc>
         <w:tc>
@@ -4636,11 +4411,9 @@
               <w:jc w:val="center"/>
               <w:cnfStyle w:val="100000000000" w:firstRow="1" w:lastRow="0" w:firstColumn="0" w:lastColumn="0" w:oddVBand="0" w:evenVBand="0" w:oddHBand="0" w:evenHBand="0" w:firstRowFirstColumn="0" w:firstRowLastColumn="0" w:lastRowFirstColumn="0" w:lastRowLastColumn="0"/>
             </w:pPr>
-            <w:proofErr w:type="spellStart"/>
             <w:r>
               <w:t>Unique</w:t>
             </w:r>
-            <w:proofErr w:type="spellEnd"/>
           </w:p>
         </w:tc>
       </w:tr>
@@ -4656,11 +4429,9 @@
             <w:shd w:val="clear" w:color="auto" w:fill="7030A0"/>
           </w:tcPr>
           <w:p>
-            <w:proofErr w:type="spellStart"/>
             <w:r>
               <w:t>id</w:t>
             </w:r>
-            <w:proofErr w:type="spellEnd"/>
           </w:p>
         </w:tc>
         <w:tc>
@@ -4717,11 +4488,9 @@
             <w:shd w:val="clear" w:color="auto" w:fill="7030A0"/>
           </w:tcPr>
           <w:p>
-            <w:proofErr w:type="spellStart"/>
             <w:r>
               <w:t>feladat_id</w:t>
             </w:r>
-            <w:proofErr w:type="spellEnd"/>
           </w:p>
         </w:tc>
         <w:tc>
@@ -4779,11 +4548,9 @@
             <w:shd w:val="clear" w:color="auto" w:fill="7030A0"/>
           </w:tcPr>
           <w:p>
-            <w:proofErr w:type="spellStart"/>
             <w:r>
               <w:t>oszlop_sorszam</w:t>
             </w:r>
-            <w:proofErr w:type="spellEnd"/>
           </w:p>
         </w:tc>
         <w:tc>
@@ -4840,11 +4607,9 @@
             <w:shd w:val="clear" w:color="auto" w:fill="7030A0"/>
           </w:tcPr>
           <w:p>
-            <w:proofErr w:type="spellStart"/>
             <w:r>
               <w:t>oszlop_nev</w:t>
             </w:r>
-            <w:proofErr w:type="spellEnd"/>
           </w:p>
         </w:tc>
         <w:tc>
@@ -5014,11 +4779,9 @@
               <w:jc w:val="center"/>
               <w:cnfStyle w:val="100000000000" w:firstRow="1" w:lastRow="0" w:firstColumn="0" w:lastColumn="0" w:oddVBand="0" w:evenVBand="0" w:oddHBand="0" w:evenHBand="0" w:firstRowFirstColumn="0" w:firstRowLastColumn="0" w:lastRowFirstColumn="0" w:lastRowLastColumn="0"/>
             </w:pPr>
-            <w:proofErr w:type="spellStart"/>
             <w:r>
               <w:t>Nullable</w:t>
             </w:r>
-            <w:proofErr w:type="spellEnd"/>
           </w:p>
         </w:tc>
         <w:tc>
@@ -5032,11 +4795,9 @@
               <w:jc w:val="center"/>
               <w:cnfStyle w:val="100000000000" w:firstRow="1" w:lastRow="0" w:firstColumn="0" w:lastColumn="0" w:oddVBand="0" w:evenVBand="0" w:oddHBand="0" w:evenHBand="0" w:firstRowFirstColumn="0" w:firstRowLastColumn="0" w:lastRowFirstColumn="0" w:lastRowLastColumn="0"/>
             </w:pPr>
-            <w:proofErr w:type="spellStart"/>
             <w:r>
               <w:t>Unique</w:t>
             </w:r>
-            <w:proofErr w:type="spellEnd"/>
           </w:p>
         </w:tc>
       </w:tr>
@@ -5052,11 +4813,9 @@
             <w:shd w:val="clear" w:color="auto" w:fill="7030A0"/>
           </w:tcPr>
           <w:p>
-            <w:proofErr w:type="spellStart"/>
             <w:r>
               <w:t>id</w:t>
             </w:r>
-            <w:proofErr w:type="spellEnd"/>
           </w:p>
         </w:tc>
         <w:tc>
@@ -5113,11 +4872,9 @@
             <w:shd w:val="clear" w:color="auto" w:fill="7030A0"/>
           </w:tcPr>
           <w:p>
-            <w:proofErr w:type="spellStart"/>
             <w:r>
               <w:t>feladat_id</w:t>
             </w:r>
-            <w:proofErr w:type="spellEnd"/>
           </w:p>
         </w:tc>
         <w:tc>
@@ -5175,11 +4932,9 @@
             <w:shd w:val="clear" w:color="auto" w:fill="7030A0"/>
           </w:tcPr>
           <w:p>
-            <w:proofErr w:type="spellStart"/>
             <w:r>
               <w:t>sor_sorszam</w:t>
             </w:r>
-            <w:proofErr w:type="spellEnd"/>
           </w:p>
         </w:tc>
         <w:tc>
@@ -5236,11 +4991,9 @@
             <w:shd w:val="clear" w:color="auto" w:fill="7030A0"/>
           </w:tcPr>
           <w:p>
-            <w:proofErr w:type="spellStart"/>
             <w:r>
               <w:t>oszlop_sorszam</w:t>
             </w:r>
-            <w:proofErr w:type="spellEnd"/>
           </w:p>
         </w:tc>
         <w:tc>
@@ -5298,11 +5051,9 @@
             <w:shd w:val="clear" w:color="auto" w:fill="7030A0"/>
           </w:tcPr>
           <w:p>
-            <w:proofErr w:type="spellStart"/>
             <w:r>
               <w:t>ertek</w:t>
             </w:r>
-            <w:proofErr w:type="spellEnd"/>
           </w:p>
         </w:tc>
         <w:tc>
@@ -5328,11 +5079,9 @@
             <w:pPr>
               <w:cnfStyle w:val="000000100000" w:firstRow="0" w:lastRow="0" w:firstColumn="0" w:lastColumn="0" w:oddVBand="0" w:evenVBand="0" w:oddHBand="1" w:evenHBand="0" w:firstRowFirstColumn="0" w:firstRowLastColumn="0" w:lastRowFirstColumn="0" w:lastRowLastColumn="0"/>
             </w:pPr>
-            <w:proofErr w:type="spellStart"/>
             <w:r>
               <w:t>nullable</w:t>
             </w:r>
-            <w:proofErr w:type="spellEnd"/>
           </w:p>
         </w:tc>
         <w:tc>
@@ -5361,11 +5110,9 @@
             <w:shd w:val="clear" w:color="auto" w:fill="7030A0"/>
           </w:tcPr>
           <w:p>
-            <w:proofErr w:type="spellStart"/>
             <w:r>
               <w:t>lathato</w:t>
             </w:r>
-            <w:proofErr w:type="spellEnd"/>
           </w:p>
         </w:tc>
         <w:tc>
@@ -5377,11 +5124,9 @@
             <w:pPr>
               <w:cnfStyle w:val="000000000000" w:firstRow="0" w:lastRow="0" w:firstColumn="0" w:lastColumn="0" w:oddVBand="0" w:evenVBand="0" w:oddHBand="0" w:evenHBand="0" w:firstRowFirstColumn="0" w:firstRowLastColumn="0" w:lastRowFirstColumn="0" w:lastRowLastColumn="0"/>
             </w:pPr>
-            <w:proofErr w:type="spellStart"/>
             <w:r>
               <w:t>bool</w:t>
             </w:r>
-            <w:proofErr w:type="spellEnd"/>
           </w:p>
         </w:tc>
         <w:tc>
@@ -5513,7 +5258,7 @@
         <w:tc>
           <w:tcPr>
             <w:cnfStyle w:val="001000000000" w:firstRow="0" w:lastRow="0" w:firstColumn="1" w:lastColumn="0" w:oddVBand="0" w:evenVBand="0" w:oddHBand="0" w:evenHBand="0" w:firstRowFirstColumn="0" w:firstRowLastColumn="0" w:lastRowFirstColumn="0" w:lastRowLastColumn="0"/>
-            <w:tcW w:w="2201" w:type="dxa"/>
+            <w:tcW w:w="2042" w:type="dxa"/>
             <w:shd w:val="clear" w:color="auto" w:fill="7030A0"/>
             <w:vAlign w:val="center"/>
           </w:tcPr>
@@ -5528,7 +5273,7 @@
         </w:tc>
         <w:tc>
           <w:tcPr>
-            <w:tcW w:w="2201" w:type="dxa"/>
+            <w:tcW w:w="1959" w:type="dxa"/>
             <w:shd w:val="clear" w:color="auto" w:fill="7030A0"/>
             <w:vAlign w:val="center"/>
           </w:tcPr>
@@ -5544,7 +5289,7 @@
         </w:tc>
         <w:tc>
           <w:tcPr>
-            <w:tcW w:w="2202" w:type="dxa"/>
+            <w:tcW w:w="1911" w:type="dxa"/>
             <w:shd w:val="clear" w:color="auto" w:fill="7030A0"/>
             <w:vAlign w:val="center"/>
           </w:tcPr>
@@ -5553,16 +5298,14 @@
               <w:jc w:val="center"/>
               <w:cnfStyle w:val="100000000000" w:firstRow="1" w:lastRow="0" w:firstColumn="0" w:lastColumn="0" w:oddVBand="0" w:evenVBand="0" w:oddHBand="0" w:evenHBand="0" w:firstRowFirstColumn="0" w:firstRowLastColumn="0" w:lastRowFirstColumn="0" w:lastRowLastColumn="0"/>
             </w:pPr>
-            <w:proofErr w:type="spellStart"/>
             <w:r>
               <w:t>Nullable</w:t>
             </w:r>
-            <w:proofErr w:type="spellEnd"/>
-          </w:p>
-        </w:tc>
-        <w:tc>
-          <w:tcPr>
-            <w:tcW w:w="2202" w:type="dxa"/>
+          </w:p>
+        </w:tc>
+        <w:tc>
+          <w:tcPr>
+            <w:tcW w:w="2026" w:type="dxa"/>
             <w:shd w:val="clear" w:color="auto" w:fill="7030A0"/>
             <w:vAlign w:val="center"/>
           </w:tcPr>
@@ -5571,11 +5314,9 @@
               <w:jc w:val="center"/>
               <w:cnfStyle w:val="100000000000" w:firstRow="1" w:lastRow="0" w:firstColumn="0" w:lastColumn="0" w:oddVBand="0" w:evenVBand="0" w:oddHBand="0" w:evenHBand="0" w:firstRowFirstColumn="0" w:firstRowLastColumn="0" w:lastRowFirstColumn="0" w:lastRowLastColumn="0"/>
             </w:pPr>
-            <w:proofErr w:type="spellStart"/>
             <w:r>
               <w:t>Unique</w:t>
             </w:r>
-            <w:proofErr w:type="spellEnd"/>
           </w:p>
         </w:tc>
       </w:tr>
@@ -5587,20 +5328,18 @@
         <w:tc>
           <w:tcPr>
             <w:cnfStyle w:val="001000000000" w:firstRow="0" w:lastRow="0" w:firstColumn="1" w:lastColumn="0" w:oddVBand="0" w:evenVBand="0" w:oddHBand="0" w:evenHBand="0" w:firstRowFirstColumn="0" w:firstRowLastColumn="0" w:lastRowFirstColumn="0" w:lastRowLastColumn="0"/>
-            <w:tcW w:w="2201" w:type="dxa"/>
+            <w:tcW w:w="2042" w:type="dxa"/>
             <w:shd w:val="clear" w:color="auto" w:fill="7030A0"/>
           </w:tcPr>
           <w:p>
-            <w:proofErr w:type="spellStart"/>
             <w:r>
               <w:t>id</w:t>
             </w:r>
-            <w:proofErr w:type="spellEnd"/>
-          </w:p>
-        </w:tc>
-        <w:tc>
-          <w:tcPr>
-            <w:tcW w:w="2201" w:type="dxa"/>
+          </w:p>
+        </w:tc>
+        <w:tc>
+          <w:tcPr>
+            <w:tcW w:w="1959" w:type="dxa"/>
             <w:shd w:val="clear" w:color="auto" w:fill="CC99FF"/>
           </w:tcPr>
           <w:p>
@@ -5614,7 +5353,7 @@
         </w:tc>
         <w:tc>
           <w:tcPr>
-            <w:tcW w:w="2202" w:type="dxa"/>
+            <w:tcW w:w="1911" w:type="dxa"/>
             <w:shd w:val="clear" w:color="auto" w:fill="CC99FF"/>
           </w:tcPr>
           <w:p>
@@ -5628,7 +5367,7 @@
         </w:tc>
         <w:tc>
           <w:tcPr>
-            <w:tcW w:w="2202" w:type="dxa"/>
+            <w:tcW w:w="2026" w:type="dxa"/>
             <w:shd w:val="clear" w:color="auto" w:fill="CC99FF"/>
           </w:tcPr>
           <w:p>
@@ -5648,36 +5387,32 @@
         <w:tc>
           <w:tcPr>
             <w:cnfStyle w:val="001000000000" w:firstRow="0" w:lastRow="0" w:firstColumn="1" w:lastColumn="0" w:oddVBand="0" w:evenVBand="0" w:oddHBand="0" w:evenHBand="0" w:firstRowFirstColumn="0" w:firstRowLastColumn="0" w:lastRowFirstColumn="0" w:lastRowLastColumn="0"/>
-            <w:tcW w:w="2201" w:type="dxa"/>
+            <w:tcW w:w="2042" w:type="dxa"/>
             <w:shd w:val="clear" w:color="auto" w:fill="7030A0"/>
           </w:tcPr>
           <w:p>
-            <w:proofErr w:type="spellStart"/>
             <w:r>
               <w:t>felhasznalo_id</w:t>
             </w:r>
-            <w:proofErr w:type="spellEnd"/>
-          </w:p>
-        </w:tc>
-        <w:tc>
-          <w:tcPr>
-            <w:tcW w:w="2201" w:type="dxa"/>
+          </w:p>
+        </w:tc>
+        <w:tc>
+          <w:tcPr>
+            <w:tcW w:w="1959" w:type="dxa"/>
             <w:shd w:val="clear" w:color="auto" w:fill="CC99FF"/>
           </w:tcPr>
           <w:p>
             <w:pPr>
               <w:cnfStyle w:val="000000000000" w:firstRow="0" w:lastRow="0" w:firstColumn="0" w:lastColumn="0" w:oddVBand="0" w:evenVBand="0" w:oddHBand="0" w:evenHBand="0" w:firstRowFirstColumn="0" w:firstRowLastColumn="0" w:lastRowFirstColumn="0" w:lastRowLastColumn="0"/>
             </w:pPr>
-            <w:proofErr w:type="spellStart"/>
             <w:r>
               <w:t>uuid</w:t>
             </w:r>
-            <w:proofErr w:type="spellEnd"/>
-          </w:p>
-        </w:tc>
-        <w:tc>
-          <w:tcPr>
-            <w:tcW w:w="2202" w:type="dxa"/>
+          </w:p>
+        </w:tc>
+        <w:tc>
+          <w:tcPr>
+            <w:tcW w:w="1911" w:type="dxa"/>
             <w:shd w:val="clear" w:color="auto" w:fill="CC99FF"/>
           </w:tcPr>
           <w:p>
@@ -5691,7 +5426,7 @@
         </w:tc>
         <w:tc>
           <w:tcPr>
-            <w:tcW w:w="2202" w:type="dxa"/>
+            <w:tcW w:w="2026" w:type="dxa"/>
             <w:shd w:val="clear" w:color="auto" w:fill="CC99FF"/>
           </w:tcPr>
           <w:p>
@@ -5712,20 +5447,18 @@
         <w:tc>
           <w:tcPr>
             <w:cnfStyle w:val="001000000000" w:firstRow="0" w:lastRow="0" w:firstColumn="1" w:lastColumn="0" w:oddVBand="0" w:evenVBand="0" w:oddHBand="0" w:evenHBand="0" w:firstRowFirstColumn="0" w:firstRowLastColumn="0" w:lastRowFirstColumn="0" w:lastRowLastColumn="0"/>
-            <w:tcW w:w="2201" w:type="dxa"/>
+            <w:tcW w:w="2042" w:type="dxa"/>
             <w:shd w:val="clear" w:color="auto" w:fill="7030A0"/>
           </w:tcPr>
           <w:p>
-            <w:proofErr w:type="spellStart"/>
             <w:r>
               <w:t>tantargy_id</w:t>
             </w:r>
-            <w:proofErr w:type="spellEnd"/>
-          </w:p>
-        </w:tc>
-        <w:tc>
-          <w:tcPr>
-            <w:tcW w:w="2201" w:type="dxa"/>
+          </w:p>
+        </w:tc>
+        <w:tc>
+          <w:tcPr>
+            <w:tcW w:w="1959" w:type="dxa"/>
             <w:shd w:val="clear" w:color="auto" w:fill="CC99FF"/>
           </w:tcPr>
           <w:p>
@@ -5739,7 +5472,7 @@
         </w:tc>
         <w:tc>
           <w:tcPr>
-            <w:tcW w:w="2202" w:type="dxa"/>
+            <w:tcW w:w="1911" w:type="dxa"/>
             <w:shd w:val="clear" w:color="auto" w:fill="CC99FF"/>
           </w:tcPr>
           <w:p>
@@ -5753,7 +5486,7 @@
         </w:tc>
         <w:tc>
           <w:tcPr>
-            <w:tcW w:w="2202" w:type="dxa"/>
+            <w:tcW w:w="2026" w:type="dxa"/>
             <w:shd w:val="clear" w:color="auto" w:fill="CC99FF"/>
           </w:tcPr>
           <w:p>
@@ -5773,36 +5506,32 @@
         <w:tc>
           <w:tcPr>
             <w:cnfStyle w:val="001000000000" w:firstRow="0" w:lastRow="0" w:firstColumn="1" w:lastColumn="0" w:oddVBand="0" w:evenVBand="0" w:oddHBand="0" w:evenHBand="0" w:firstRowFirstColumn="0" w:firstRowLastColumn="0" w:lastRowFirstColumn="0" w:lastRowLastColumn="0"/>
-            <w:tcW w:w="2201" w:type="dxa"/>
+            <w:tcW w:w="2042" w:type="dxa"/>
             <w:shd w:val="clear" w:color="auto" w:fill="7030A0"/>
           </w:tcPr>
           <w:p>
-            <w:proofErr w:type="spellStart"/>
             <w:r>
               <w:t>nev</w:t>
             </w:r>
-            <w:proofErr w:type="spellEnd"/>
-          </w:p>
-        </w:tc>
-        <w:tc>
-          <w:tcPr>
-            <w:tcW w:w="2201" w:type="dxa"/>
+          </w:p>
+        </w:tc>
+        <w:tc>
+          <w:tcPr>
+            <w:tcW w:w="1959" w:type="dxa"/>
             <w:shd w:val="clear" w:color="auto" w:fill="CC99FF"/>
           </w:tcPr>
           <w:p>
             <w:pPr>
               <w:cnfStyle w:val="000000000000" w:firstRow="0" w:lastRow="0" w:firstColumn="0" w:lastColumn="0" w:oddVBand="0" w:evenVBand="0" w:oddHBand="0" w:evenHBand="0" w:firstRowFirstColumn="0" w:firstRowLastColumn="0" w:lastRowFirstColumn="0" w:lastRowLastColumn="0"/>
             </w:pPr>
-            <w:proofErr w:type="spellStart"/>
             <w:r>
               <w:t>varchar</w:t>
             </w:r>
-            <w:proofErr w:type="spellEnd"/>
-          </w:p>
-        </w:tc>
-        <w:tc>
-          <w:tcPr>
-            <w:tcW w:w="2202" w:type="dxa"/>
+          </w:p>
+        </w:tc>
+        <w:tc>
+          <w:tcPr>
+            <w:tcW w:w="1911" w:type="dxa"/>
             <w:shd w:val="clear" w:color="auto" w:fill="CC99FF"/>
           </w:tcPr>
           <w:p>
@@ -5816,7 +5545,7 @@
         </w:tc>
         <w:tc>
           <w:tcPr>
-            <w:tcW w:w="2202" w:type="dxa"/>
+            <w:tcW w:w="2026" w:type="dxa"/>
             <w:shd w:val="clear" w:color="auto" w:fill="CC99FF"/>
           </w:tcPr>
           <w:p>
@@ -5837,36 +5566,32 @@
         <w:tc>
           <w:tcPr>
             <w:cnfStyle w:val="001000000000" w:firstRow="0" w:lastRow="0" w:firstColumn="1" w:lastColumn="0" w:oddVBand="0" w:evenVBand="0" w:oddHBand="0" w:evenHBand="0" w:firstRowFirstColumn="0" w:firstRowLastColumn="0" w:lastRowFirstColumn="0" w:lastRowLastColumn="0"/>
-            <w:tcW w:w="2201" w:type="dxa"/>
+            <w:tcW w:w="2042" w:type="dxa"/>
             <w:shd w:val="clear" w:color="auto" w:fill="7030A0"/>
           </w:tcPr>
           <w:p>
-            <w:proofErr w:type="spellStart"/>
             <w:r>
               <w:t>datum</w:t>
             </w:r>
-            <w:proofErr w:type="spellEnd"/>
-          </w:p>
-        </w:tc>
-        <w:tc>
-          <w:tcPr>
-            <w:tcW w:w="2201" w:type="dxa"/>
+          </w:p>
+        </w:tc>
+        <w:tc>
+          <w:tcPr>
+            <w:tcW w:w="1959" w:type="dxa"/>
             <w:shd w:val="clear" w:color="auto" w:fill="CC99FF"/>
           </w:tcPr>
           <w:p>
             <w:pPr>
               <w:cnfStyle w:val="000000100000" w:firstRow="0" w:lastRow="0" w:firstColumn="0" w:lastColumn="0" w:oddVBand="0" w:evenVBand="0" w:oddHBand="1" w:evenHBand="0" w:firstRowFirstColumn="0" w:firstRowLastColumn="0" w:lastRowFirstColumn="0" w:lastRowLastColumn="0"/>
             </w:pPr>
-            <w:proofErr w:type="spellStart"/>
             <w:r>
               <w:t>timestamp</w:t>
             </w:r>
-            <w:proofErr w:type="spellEnd"/>
-          </w:p>
-        </w:tc>
-        <w:tc>
-          <w:tcPr>
-            <w:tcW w:w="2202" w:type="dxa"/>
+          </w:p>
+        </w:tc>
+        <w:tc>
+          <w:tcPr>
+            <w:tcW w:w="1911" w:type="dxa"/>
             <w:shd w:val="clear" w:color="auto" w:fill="CC99FF"/>
           </w:tcPr>
           <w:p>
@@ -5880,7 +5605,7 @@
         </w:tc>
         <w:tc>
           <w:tcPr>
-            <w:tcW w:w="2202" w:type="dxa"/>
+            <w:tcW w:w="2026" w:type="dxa"/>
             <w:shd w:val="clear" w:color="auto" w:fill="CC99FF"/>
           </w:tcPr>
           <w:p>
@@ -5900,20 +5625,18 @@
         <w:tc>
           <w:tcPr>
             <w:cnfStyle w:val="001000000000" w:firstRow="0" w:lastRow="0" w:firstColumn="1" w:lastColumn="0" w:oddVBand="0" w:evenVBand="0" w:oddHBand="0" w:evenHBand="0" w:firstRowFirstColumn="0" w:firstRowLastColumn="0" w:lastRowFirstColumn="0" w:lastRowLastColumn="0"/>
-            <w:tcW w:w="2201" w:type="dxa"/>
+            <w:tcW w:w="2042" w:type="dxa"/>
             <w:shd w:val="clear" w:color="auto" w:fill="7030A0"/>
           </w:tcPr>
           <w:p>
-            <w:proofErr w:type="spellStart"/>
             <w:r>
               <w:t>kitoltesi_ido</w:t>
             </w:r>
-            <w:proofErr w:type="spellEnd"/>
-          </w:p>
-        </w:tc>
-        <w:tc>
-          <w:tcPr>
-            <w:tcW w:w="2201" w:type="dxa"/>
+          </w:p>
+        </w:tc>
+        <w:tc>
+          <w:tcPr>
+            <w:tcW w:w="1959" w:type="dxa"/>
             <w:shd w:val="clear" w:color="auto" w:fill="CC99FF"/>
           </w:tcPr>
           <w:p>
@@ -5927,28 +5650,86 @@
         </w:tc>
         <w:tc>
           <w:tcPr>
-            <w:tcW w:w="2202" w:type="dxa"/>
+            <w:tcW w:w="1911" w:type="dxa"/>
             <w:shd w:val="clear" w:color="auto" w:fill="CC99FF"/>
           </w:tcPr>
           <w:p>
             <w:pPr>
               <w:cnfStyle w:val="000000000000" w:firstRow="0" w:lastRow="0" w:firstColumn="0" w:lastColumn="0" w:oddVBand="0" w:evenVBand="0" w:oddHBand="0" w:evenHBand="0" w:firstRowFirstColumn="0" w:firstRowLastColumn="0" w:lastRowFirstColumn="0" w:lastRowLastColumn="0"/>
             </w:pPr>
-            <w:proofErr w:type="spellStart"/>
             <w:r>
               <w:t>nullable</w:t>
             </w:r>
-            <w:proofErr w:type="spellEnd"/>
-          </w:p>
-        </w:tc>
-        <w:tc>
-          <w:tcPr>
-            <w:tcW w:w="2202" w:type="dxa"/>
+          </w:p>
+        </w:tc>
+        <w:tc>
+          <w:tcPr>
+            <w:tcW w:w="2026" w:type="dxa"/>
             <w:shd w:val="clear" w:color="auto" w:fill="CC99FF"/>
           </w:tcPr>
           <w:p>
             <w:pPr>
               <w:cnfStyle w:val="000000000000" w:firstRow="0" w:lastRow="0" w:firstColumn="0" w:lastColumn="0" w:oddVBand="0" w:evenVBand="0" w:oddHBand="0" w:evenHBand="0" w:firstRowFirstColumn="0" w:firstRowLastColumn="0" w:lastRowFirstColumn="0" w:lastRowLastColumn="0"/>
+            </w:pPr>
+            <w:r>
+              <w:t>nem</w:t>
+            </w:r>
+          </w:p>
+        </w:tc>
+      </w:tr>
+      <w:tr>
+        <w:trPr>
+          <w:cnfStyle w:val="000000100000" w:firstRow="0" w:lastRow="0" w:firstColumn="0" w:lastColumn="0" w:oddVBand="0" w:evenVBand="0" w:oddHBand="1" w:evenHBand="0" w:firstRowFirstColumn="0" w:firstRowLastColumn="0" w:lastRowFirstColumn="0" w:lastRowLastColumn="0"/>
+          <w:trHeight w:val="266"/>
+        </w:trPr>
+        <w:tc>
+          <w:tcPr>
+            <w:cnfStyle w:val="001000000000" w:firstRow="0" w:lastRow="0" w:firstColumn="1" w:lastColumn="0" w:oddVBand="0" w:evenVBand="0" w:oddHBand="0" w:evenHBand="0" w:firstRowFirstColumn="0" w:firstRowLastColumn="0" w:lastRowFirstColumn="0" w:lastRowLastColumn="0"/>
+            <w:tcW w:w="2042" w:type="dxa"/>
+            <w:shd w:val="clear" w:color="auto" w:fill="7030A0"/>
+          </w:tcPr>
+          <w:p>
+            <w:r>
+              <w:t>statusz</w:t>
+            </w:r>
+          </w:p>
+        </w:tc>
+        <w:tc>
+          <w:tcPr>
+            <w:tcW w:w="1959" w:type="dxa"/>
+            <w:shd w:val="clear" w:color="auto" w:fill="CC99FF"/>
+          </w:tcPr>
+          <w:p>
+            <w:pPr>
+              <w:cnfStyle w:val="000000100000" w:firstRow="0" w:lastRow="0" w:firstColumn="0" w:lastColumn="0" w:oddVBand="0" w:evenVBand="0" w:oddHBand="1" w:evenHBand="0" w:firstRowFirstColumn="0" w:firstRowLastColumn="0" w:lastRowFirstColumn="0" w:lastRowLastColumn="0"/>
+            </w:pPr>
+            <w:r>
+              <w:t>text</w:t>
+            </w:r>
+          </w:p>
+        </w:tc>
+        <w:tc>
+          <w:tcPr>
+            <w:tcW w:w="1911" w:type="dxa"/>
+            <w:shd w:val="clear" w:color="auto" w:fill="CC99FF"/>
+          </w:tcPr>
+          <w:p>
+            <w:pPr>
+              <w:cnfStyle w:val="000000100000" w:firstRow="0" w:lastRow="0" w:firstColumn="0" w:lastColumn="0" w:oddVBand="0" w:evenVBand="0" w:oddHBand="1" w:evenHBand="0" w:firstRowFirstColumn="0" w:firstRowLastColumn="0" w:lastRowFirstColumn="0" w:lastRowLastColumn="0"/>
+            </w:pPr>
+            <w:r>
+              <w:t>NOT NULL</w:t>
+            </w:r>
+          </w:p>
+        </w:tc>
+        <w:tc>
+          <w:tcPr>
+            <w:tcW w:w="2026" w:type="dxa"/>
+            <w:shd w:val="clear" w:color="auto" w:fill="CC99FF"/>
+          </w:tcPr>
+          <w:p>
+            <w:pPr>
+              <w:cnfStyle w:val="000000100000" w:firstRow="0" w:lastRow="0" w:firstColumn="0" w:lastColumn="0" w:oddVBand="0" w:evenVBand="0" w:oddHBand="1" w:evenHBand="0" w:firstRowFirstColumn="0" w:firstRowLastColumn="0" w:lastRowFirstColumn="0" w:lastRowLastColumn="0"/>
             </w:pPr>
             <w:r>
               <w:t>nem</w:t>
@@ -5996,6 +5777,19 @@
       </w:pPr>
       <w:r>
         <w:t>A ’tesztek’ tábla a felhasználók által kitöltött tesztek adatait tartalmazza</w:t>
+      </w:r>
+    </w:p>
+    <w:p>
+      <w:pPr>
+        <w:pStyle w:val="Listaszerbekezds"/>
+        <w:numPr>
+          <w:ilvl w:val="0"/>
+          <w:numId w:val="13"/>
+        </w:numPr>
+        <w:ind w:left="1134"/>
+      </w:pPr>
+      <w:r>
+        <w:t>A ’statusz’ mező a felhasználó által elindított teszt állapotát menti, ami alapján a backend ellenőrizi hogy egy teszt milyen fázisban van</w:t>
       </w:r>
     </w:p>
     <w:p/>
@@ -6080,11 +5874,9 @@
               <w:jc w:val="center"/>
               <w:cnfStyle w:val="100000000000" w:firstRow="1" w:lastRow="0" w:firstColumn="0" w:lastColumn="0" w:oddVBand="0" w:evenVBand="0" w:oddHBand="0" w:evenHBand="0" w:firstRowFirstColumn="0" w:firstRowLastColumn="0" w:lastRowFirstColumn="0" w:lastRowLastColumn="0"/>
             </w:pPr>
-            <w:proofErr w:type="spellStart"/>
             <w:r>
               <w:t>Nullable</w:t>
             </w:r>
-            <w:proofErr w:type="spellEnd"/>
           </w:p>
         </w:tc>
         <w:tc>
@@ -6098,11 +5890,9 @@
               <w:jc w:val="center"/>
               <w:cnfStyle w:val="100000000000" w:firstRow="1" w:lastRow="0" w:firstColumn="0" w:lastColumn="0" w:oddVBand="0" w:evenVBand="0" w:oddHBand="0" w:evenHBand="0" w:firstRowFirstColumn="0" w:firstRowLastColumn="0" w:lastRowFirstColumn="0" w:lastRowLastColumn="0"/>
             </w:pPr>
-            <w:proofErr w:type="spellStart"/>
             <w:r>
               <w:t>Unique</w:t>
             </w:r>
-            <w:proofErr w:type="spellEnd"/>
           </w:p>
         </w:tc>
       </w:tr>
@@ -6118,11 +5908,9 @@
             <w:shd w:val="clear" w:color="auto" w:fill="7030A0"/>
           </w:tcPr>
           <w:p>
-            <w:proofErr w:type="spellStart"/>
             <w:r>
               <w:t>id</w:t>
             </w:r>
-            <w:proofErr w:type="spellEnd"/>
           </w:p>
         </w:tc>
         <w:tc>
@@ -6163,15 +5951,7 @@
               <w:cnfStyle w:val="000000100000" w:firstRow="0" w:lastRow="0" w:firstColumn="0" w:lastColumn="0" w:oddVBand="0" w:evenVBand="0" w:oddHBand="1" w:evenHBand="0" w:firstRowFirstColumn="0" w:firstRowLastColumn="0" w:lastRowFirstColumn="0" w:lastRowLastColumn="0"/>
             </w:pPr>
             <w:r>
-              <w:t>PK (</w:t>
-            </w:r>
-            <w:proofErr w:type="spellStart"/>
-            <w:r>
-              <w:t>identity</w:t>
-            </w:r>
-            <w:proofErr w:type="spellEnd"/>
-            <w:r>
-              <w:t>)</w:t>
+              <w:t>PK (identity)</w:t>
             </w:r>
           </w:p>
         </w:tc>
@@ -6187,11 +5967,9 @@
             <w:shd w:val="clear" w:color="auto" w:fill="7030A0"/>
           </w:tcPr>
           <w:p>
-            <w:proofErr w:type="spellStart"/>
             <w:r>
               <w:t>teszt_id</w:t>
             </w:r>
-            <w:proofErr w:type="spellEnd"/>
           </w:p>
         </w:tc>
         <w:tc>
@@ -6249,11 +6027,9 @@
             <w:shd w:val="clear" w:color="auto" w:fill="7030A0"/>
           </w:tcPr>
           <w:p>
-            <w:proofErr w:type="spellStart"/>
             <w:r>
               <w:t>feladat_id</w:t>
             </w:r>
-            <w:proofErr w:type="spellEnd"/>
           </w:p>
         </w:tc>
         <w:tc>
@@ -6310,11 +6086,9 @@
             <w:shd w:val="clear" w:color="auto" w:fill="7030A0"/>
           </w:tcPr>
           <w:p>
-            <w:proofErr w:type="spellStart"/>
             <w:r>
               <w:t>adott_valasz</w:t>
             </w:r>
-            <w:proofErr w:type="spellEnd"/>
           </w:p>
         </w:tc>
         <w:tc>
@@ -6340,11 +6114,9 @@
             <w:pPr>
               <w:cnfStyle w:val="000000000000" w:firstRow="0" w:lastRow="0" w:firstColumn="0" w:lastColumn="0" w:oddVBand="0" w:evenVBand="0" w:oddHBand="0" w:evenHBand="0" w:firstRowFirstColumn="0" w:firstRowLastColumn="0" w:lastRowFirstColumn="0" w:lastRowLastColumn="0"/>
             </w:pPr>
-            <w:proofErr w:type="spellStart"/>
             <w:r>
               <w:t>nullable</w:t>
             </w:r>
-            <w:proofErr w:type="spellEnd"/>
           </w:p>
         </w:tc>
         <w:tc>
@@ -6374,11 +6146,9 @@
             <w:shd w:val="clear" w:color="auto" w:fill="7030A0"/>
           </w:tcPr>
           <w:p>
-            <w:proofErr w:type="spellStart"/>
             <w:r>
               <w:t>elert_pont</w:t>
             </w:r>
-            <w:proofErr w:type="spellEnd"/>
           </w:p>
         </w:tc>
         <w:tc>
@@ -6390,11 +6160,9 @@
             <w:pPr>
               <w:cnfStyle w:val="000000100000" w:firstRow="0" w:lastRow="0" w:firstColumn="0" w:lastColumn="0" w:oddVBand="0" w:evenVBand="0" w:oddHBand="1" w:evenHBand="0" w:firstRowFirstColumn="0" w:firstRowLastColumn="0" w:lastRowFirstColumn="0" w:lastRowLastColumn="0"/>
             </w:pPr>
-            <w:proofErr w:type="spellStart"/>
             <w:r>
               <w:t>numeric</w:t>
             </w:r>
-            <w:proofErr w:type="spellEnd"/>
           </w:p>
         </w:tc>
         <w:tc>
@@ -6406,11 +6174,9 @@
             <w:pPr>
               <w:cnfStyle w:val="000000100000" w:firstRow="0" w:lastRow="0" w:firstColumn="0" w:lastColumn="0" w:oddVBand="0" w:evenVBand="0" w:oddHBand="1" w:evenHBand="0" w:firstRowFirstColumn="0" w:firstRowLastColumn="0" w:lastRowFirstColumn="0" w:lastRowLastColumn="0"/>
             </w:pPr>
-            <w:proofErr w:type="spellStart"/>
             <w:r>
               <w:t>nullable</w:t>
             </w:r>
-            <w:proofErr w:type="spellEnd"/>
           </w:p>
         </w:tc>
         <w:tc>
@@ -7698,7 +7464,7 @@
 </file>
 
 <file path=word/endnotes.xml><?xml version="1.0" encoding="utf-8"?>
-<w:endnotes xmlns:wpc="http://schemas.microsoft.com/office/word/2010/wordprocessingCanvas" xmlns:cx="http://schemas.microsoft.com/office/drawing/2014/chartex" xmlns:cx1="http://schemas.microsoft.com/office/drawing/2015/9/8/chartex" xmlns:cx2="http://schemas.microsoft.com/office/drawing/2015/10/21/chartex" xmlns:cx3="http://schemas.microsoft.com/office/drawing/2016/5/9/chartex" xmlns:cx4="http://schemas.microsoft.com/office/drawing/2016/5/10/chartex" xmlns:cx5="http://schemas.microsoft.com/office/drawing/2016/5/11/chartex" xmlns:cx6="http://schemas.microsoft.com/office/drawing/2016/5/12/chartex" xmlns:cx7="http://schemas.microsoft.com/office/drawing/2016/5/13/chartex" xmlns:cx8="http://schemas.microsoft.com/office/drawing/2016/5/14/chartex" xmlns:mc="http://schemas.openxmlformats.org/markup-compatibility/2006" xmlns:aink="http://schemas.microsoft.com/office/drawing/2016/ink" xmlns:am3d="http://schemas.microsoft.com/office/drawing/2017/model3d" xmlns:o="urn:schemas-microsoft-com:office:office" xmlns:r="http://schemas.openxmlformats.org/officeDocument/2006/relationships" xmlns:m="http://schemas.openxmlformats.org/officeDocument/2006/math" xmlns:v="urn:schemas-microsoft-com:vml" xmlns:wp14="http://schemas.microsoft.com/office/word/2010/wordprocessingDrawing" xmlns:wp="http://schemas.openxmlformats.org/drawingml/2006/wordprocessingDrawing" xmlns:w10="urn:schemas-microsoft-com:office:word" xmlns:w="http://schemas.openxmlformats.org/wordprocessingml/2006/main" xmlns:w14="http://schemas.microsoft.com/office/word/2010/wordml" xmlns:w15="http://schemas.microsoft.com/office/word/2012/wordml" xmlns:w16cex="http://schemas.microsoft.com/office/word/2018/wordml/cex" xmlns:w16cid="http://schemas.microsoft.com/office/word/2016/wordml/cid" xmlns:w16="http://schemas.microsoft.com/office/word/2018/wordml" xmlns:w16sdtdh="http://schemas.microsoft.com/office/word/2020/wordml/sdtdatahash" xmlns:w16se="http://schemas.microsoft.com/office/word/2015/wordml/symex" xmlns:wpg="http://schemas.microsoft.com/office/word/2010/wordprocessingGroup" xmlns:wpi="http://schemas.microsoft.com/office/word/2010/wordprocessingInk" xmlns:wne="http://schemas.microsoft.com/office/word/2006/wordml" xmlns:wps="http://schemas.microsoft.com/office/word/2010/wordprocessingShape" mc:Ignorable="w14 w15 w16se w16cid w16 w16cex w16sdtdh wp14">
+<w:endnotes xmlns:wpc="http://schemas.microsoft.com/office/word/2010/wordprocessingCanvas" xmlns:cx="http://schemas.microsoft.com/office/drawing/2014/chartex" xmlns:cx1="http://schemas.microsoft.com/office/drawing/2015/9/8/chartex" xmlns:cx2="http://schemas.microsoft.com/office/drawing/2015/10/21/chartex" xmlns:cx3="http://schemas.microsoft.com/office/drawing/2016/5/9/chartex" xmlns:cx4="http://schemas.microsoft.com/office/drawing/2016/5/10/chartex" xmlns:cx5="http://schemas.microsoft.com/office/drawing/2016/5/11/chartex" xmlns:cx6="http://schemas.microsoft.com/office/drawing/2016/5/12/chartex" xmlns:cx7="http://schemas.microsoft.com/office/drawing/2016/5/13/chartex" xmlns:cx8="http://schemas.microsoft.com/office/drawing/2016/5/14/chartex" xmlns:mc="http://schemas.openxmlformats.org/markup-compatibility/2006" xmlns:aink="http://schemas.microsoft.com/office/drawing/2016/ink" xmlns:am3d="http://schemas.microsoft.com/office/drawing/2017/model3d" xmlns:o="urn:schemas-microsoft-com:office:office" xmlns:oel="http://schemas.microsoft.com/office/2019/extlst" xmlns:r="http://schemas.openxmlformats.org/officeDocument/2006/relationships" xmlns:m="http://schemas.openxmlformats.org/officeDocument/2006/math" xmlns:v="urn:schemas-microsoft-com:vml" xmlns:wp14="http://schemas.microsoft.com/office/word/2010/wordprocessingDrawing" xmlns:wp="http://schemas.openxmlformats.org/drawingml/2006/wordprocessingDrawing" xmlns:w10="urn:schemas-microsoft-com:office:word" xmlns:w="http://schemas.openxmlformats.org/wordprocessingml/2006/main" xmlns:w14="http://schemas.microsoft.com/office/word/2010/wordml" xmlns:w15="http://schemas.microsoft.com/office/word/2012/wordml" xmlns:w16cex="http://schemas.microsoft.com/office/word/2018/wordml/cex" xmlns:w16cid="http://schemas.microsoft.com/office/word/2016/wordml/cid" xmlns:w16="http://schemas.microsoft.com/office/word/2018/wordml" xmlns:w16du="http://schemas.microsoft.com/office/word/2023/wordml/word16du" xmlns:w16sdtdh="http://schemas.microsoft.com/office/word/2020/wordml/sdtdatahash" xmlns:w16sdtfl="http://schemas.microsoft.com/office/word/2024/wordml/sdtformatlock" xmlns:w16se="http://schemas.microsoft.com/office/word/2015/wordml/symex" xmlns:wpg="http://schemas.microsoft.com/office/word/2010/wordprocessingGroup" xmlns:wpi="http://schemas.microsoft.com/office/word/2010/wordprocessingInk" xmlns:wne="http://schemas.microsoft.com/office/word/2006/wordml" xmlns:wps="http://schemas.microsoft.com/office/word/2010/wordprocessingShape" mc:Ignorable="w14 w15 w16se w16cid w16 w16cex w16sdtdh w16sdtfl w16du wp14">
   <w:endnote w:type="separator" w:id="-1">
     <w:p>
       <w:pPr>
@@ -7723,7 +7489,7 @@
 </file>
 
 <file path=word/footer1.xml><?xml version="1.0" encoding="utf-8"?>
-<w:ftr xmlns:wpc="http://schemas.microsoft.com/office/word/2010/wordprocessingCanvas" xmlns:cx="http://schemas.microsoft.com/office/drawing/2014/chartex" xmlns:cx1="http://schemas.microsoft.com/office/drawing/2015/9/8/chartex" xmlns:cx2="http://schemas.microsoft.com/office/drawing/2015/10/21/chartex" xmlns:cx3="http://schemas.microsoft.com/office/drawing/2016/5/9/chartex" xmlns:cx4="http://schemas.microsoft.com/office/drawing/2016/5/10/chartex" xmlns:cx5="http://schemas.microsoft.com/office/drawing/2016/5/11/chartex" xmlns:cx6="http://schemas.microsoft.com/office/drawing/2016/5/12/chartex" xmlns:cx7="http://schemas.microsoft.com/office/drawing/2016/5/13/chartex" xmlns:cx8="http://schemas.microsoft.com/office/drawing/2016/5/14/chartex" xmlns:mc="http://schemas.openxmlformats.org/markup-compatibility/2006" xmlns:aink="http://schemas.microsoft.com/office/drawing/2016/ink" xmlns:am3d="http://schemas.microsoft.com/office/drawing/2017/model3d" xmlns:o="urn:schemas-microsoft-com:office:office" xmlns:r="http://schemas.openxmlformats.org/officeDocument/2006/relationships" xmlns:m="http://schemas.openxmlformats.org/officeDocument/2006/math" xmlns:v="urn:schemas-microsoft-com:vml" xmlns:wp14="http://schemas.microsoft.com/office/word/2010/wordprocessingDrawing" xmlns:wp="http://schemas.openxmlformats.org/drawingml/2006/wordprocessingDrawing" xmlns:w10="urn:schemas-microsoft-com:office:word" xmlns:w="http://schemas.openxmlformats.org/wordprocessingml/2006/main" xmlns:w14="http://schemas.microsoft.com/office/word/2010/wordml" xmlns:w15="http://schemas.microsoft.com/office/word/2012/wordml" xmlns:w16cex="http://schemas.microsoft.com/office/word/2018/wordml/cex" xmlns:w16cid="http://schemas.microsoft.com/office/word/2016/wordml/cid" xmlns:w16="http://schemas.microsoft.com/office/word/2018/wordml" xmlns:w16sdtdh="http://schemas.microsoft.com/office/word/2020/wordml/sdtdatahash" xmlns:w16se="http://schemas.microsoft.com/office/word/2015/wordml/symex" xmlns:wpg="http://schemas.microsoft.com/office/word/2010/wordprocessingGroup" xmlns:wpi="http://schemas.microsoft.com/office/word/2010/wordprocessingInk" xmlns:wne="http://schemas.microsoft.com/office/word/2006/wordml" xmlns:wps="http://schemas.microsoft.com/office/word/2010/wordprocessingShape" mc:Ignorable="w14 w15 w16se w16cid w16 w16cex w16sdtdh wp14">
+<w:ftr xmlns:wpc="http://schemas.microsoft.com/office/word/2010/wordprocessingCanvas" xmlns:cx="http://schemas.microsoft.com/office/drawing/2014/chartex" xmlns:cx1="http://schemas.microsoft.com/office/drawing/2015/9/8/chartex" xmlns:cx2="http://schemas.microsoft.com/office/drawing/2015/10/21/chartex" xmlns:cx3="http://schemas.microsoft.com/office/drawing/2016/5/9/chartex" xmlns:cx4="http://schemas.microsoft.com/office/drawing/2016/5/10/chartex" xmlns:cx5="http://schemas.microsoft.com/office/drawing/2016/5/11/chartex" xmlns:cx6="http://schemas.microsoft.com/office/drawing/2016/5/12/chartex" xmlns:cx7="http://schemas.microsoft.com/office/drawing/2016/5/13/chartex" xmlns:cx8="http://schemas.microsoft.com/office/drawing/2016/5/14/chartex" xmlns:mc="http://schemas.openxmlformats.org/markup-compatibility/2006" xmlns:aink="http://schemas.microsoft.com/office/drawing/2016/ink" xmlns:am3d="http://schemas.microsoft.com/office/drawing/2017/model3d" xmlns:o="urn:schemas-microsoft-com:office:office" xmlns:oel="http://schemas.microsoft.com/office/2019/extlst" xmlns:r="http://schemas.openxmlformats.org/officeDocument/2006/relationships" xmlns:m="http://schemas.openxmlformats.org/officeDocument/2006/math" xmlns:v="urn:schemas-microsoft-com:vml" xmlns:wp14="http://schemas.microsoft.com/office/word/2010/wordprocessingDrawing" xmlns:wp="http://schemas.openxmlformats.org/drawingml/2006/wordprocessingDrawing" xmlns:w10="urn:schemas-microsoft-com:office:word" xmlns:w="http://schemas.openxmlformats.org/wordprocessingml/2006/main" xmlns:w14="http://schemas.microsoft.com/office/word/2010/wordml" xmlns:w15="http://schemas.microsoft.com/office/word/2012/wordml" xmlns:w16cex="http://schemas.microsoft.com/office/word/2018/wordml/cex" xmlns:w16cid="http://schemas.microsoft.com/office/word/2016/wordml/cid" xmlns:w16="http://schemas.microsoft.com/office/word/2018/wordml" xmlns:w16du="http://schemas.microsoft.com/office/word/2023/wordml/word16du" xmlns:w16sdtdh="http://schemas.microsoft.com/office/word/2020/wordml/sdtdatahash" xmlns:w16sdtfl="http://schemas.microsoft.com/office/word/2024/wordml/sdtformatlock" xmlns:w16se="http://schemas.microsoft.com/office/word/2015/wordml/symex" xmlns:wpg="http://schemas.microsoft.com/office/word/2010/wordprocessingGroup" xmlns:wpi="http://schemas.microsoft.com/office/word/2010/wordprocessingInk" xmlns:wne="http://schemas.microsoft.com/office/word/2006/wordml" xmlns:wps="http://schemas.microsoft.com/office/word/2010/wordprocessingShape" mc:Ignorable="w14 w15 w16se w16cid w16 w16cex w16sdtdh w16sdtfl w16du wp14">
   <w:sdt>
     <w:sdtPr>
       <w:id w:val="1274057105"/>
@@ -7732,7 +7498,6 @@
         <w:docPartUnique/>
       </w:docPartObj>
     </w:sdtPr>
-    <w:sdtEndPr/>
     <w:sdtContent>
       <w:sdt>
         <w:sdtPr>
@@ -7742,7 +7507,6 @@
             <w:docPartUnique/>
           </w:docPartObj>
         </w:sdtPr>
-        <w:sdtEndPr/>
         <w:sdtContent>
           <w:p>
             <w:pPr>
@@ -7860,7 +7624,7 @@
 </file>
 
 <file path=word/footnotes.xml><?xml version="1.0" encoding="utf-8"?>
-<w:footnotes xmlns:wpc="http://schemas.microsoft.com/office/word/2010/wordprocessingCanvas" xmlns:cx="http://schemas.microsoft.com/office/drawing/2014/chartex" xmlns:cx1="http://schemas.microsoft.com/office/drawing/2015/9/8/chartex" xmlns:cx2="http://schemas.microsoft.com/office/drawing/2015/10/21/chartex" xmlns:cx3="http://schemas.microsoft.com/office/drawing/2016/5/9/chartex" xmlns:cx4="http://schemas.microsoft.com/office/drawing/2016/5/10/chartex" xmlns:cx5="http://schemas.microsoft.com/office/drawing/2016/5/11/chartex" xmlns:cx6="http://schemas.microsoft.com/office/drawing/2016/5/12/chartex" xmlns:cx7="http://schemas.microsoft.com/office/drawing/2016/5/13/chartex" xmlns:cx8="http://schemas.microsoft.com/office/drawing/2016/5/14/chartex" xmlns:mc="http://schemas.openxmlformats.org/markup-compatibility/2006" xmlns:aink="http://schemas.microsoft.com/office/drawing/2016/ink" xmlns:am3d="http://schemas.microsoft.com/office/drawing/2017/model3d" xmlns:o="urn:schemas-microsoft-com:office:office" xmlns:r="http://schemas.openxmlformats.org/officeDocument/2006/relationships" xmlns:m="http://schemas.openxmlformats.org/officeDocument/2006/math" xmlns:v="urn:schemas-microsoft-com:vml" xmlns:wp14="http://schemas.microsoft.com/office/word/2010/wordprocessingDrawing" xmlns:wp="http://schemas.openxmlformats.org/drawingml/2006/wordprocessingDrawing" xmlns:w10="urn:schemas-microsoft-com:office:word" xmlns:w="http://schemas.openxmlformats.org/wordprocessingml/2006/main" xmlns:w14="http://schemas.microsoft.com/office/word/2010/wordml" xmlns:w15="http://schemas.microsoft.com/office/word/2012/wordml" xmlns:w16cex="http://schemas.microsoft.com/office/word/2018/wordml/cex" xmlns:w16cid="http://schemas.microsoft.com/office/word/2016/wordml/cid" xmlns:w16="http://schemas.microsoft.com/office/word/2018/wordml" xmlns:w16sdtdh="http://schemas.microsoft.com/office/word/2020/wordml/sdtdatahash" xmlns:w16se="http://schemas.microsoft.com/office/word/2015/wordml/symex" xmlns:wpg="http://schemas.microsoft.com/office/word/2010/wordprocessingGroup" xmlns:wpi="http://schemas.microsoft.com/office/word/2010/wordprocessingInk" xmlns:wne="http://schemas.microsoft.com/office/word/2006/wordml" xmlns:wps="http://schemas.microsoft.com/office/word/2010/wordprocessingShape" mc:Ignorable="w14 w15 w16se w16cid w16 w16cex w16sdtdh wp14">
+<w:footnotes xmlns:wpc="http://schemas.microsoft.com/office/word/2010/wordprocessingCanvas" xmlns:cx="http://schemas.microsoft.com/office/drawing/2014/chartex" xmlns:cx1="http://schemas.microsoft.com/office/drawing/2015/9/8/chartex" xmlns:cx2="http://schemas.microsoft.com/office/drawing/2015/10/21/chartex" xmlns:cx3="http://schemas.microsoft.com/office/drawing/2016/5/9/chartex" xmlns:cx4="http://schemas.microsoft.com/office/drawing/2016/5/10/chartex" xmlns:cx5="http://schemas.microsoft.com/office/drawing/2016/5/11/chartex" xmlns:cx6="http://schemas.microsoft.com/office/drawing/2016/5/12/chartex" xmlns:cx7="http://schemas.microsoft.com/office/drawing/2016/5/13/chartex" xmlns:cx8="http://schemas.microsoft.com/office/drawing/2016/5/14/chartex" xmlns:mc="http://schemas.openxmlformats.org/markup-compatibility/2006" xmlns:aink="http://schemas.microsoft.com/office/drawing/2016/ink" xmlns:am3d="http://schemas.microsoft.com/office/drawing/2017/model3d" xmlns:o="urn:schemas-microsoft-com:office:office" xmlns:oel="http://schemas.microsoft.com/office/2019/extlst" xmlns:r="http://schemas.openxmlformats.org/officeDocument/2006/relationships" xmlns:m="http://schemas.openxmlformats.org/officeDocument/2006/math" xmlns:v="urn:schemas-microsoft-com:vml" xmlns:wp14="http://schemas.microsoft.com/office/word/2010/wordprocessingDrawing" xmlns:wp="http://schemas.openxmlformats.org/drawingml/2006/wordprocessingDrawing" xmlns:w10="urn:schemas-microsoft-com:office:word" xmlns:w="http://schemas.openxmlformats.org/wordprocessingml/2006/main" xmlns:w14="http://schemas.microsoft.com/office/word/2010/wordml" xmlns:w15="http://schemas.microsoft.com/office/word/2012/wordml" xmlns:w16cex="http://schemas.microsoft.com/office/word/2018/wordml/cex" xmlns:w16cid="http://schemas.microsoft.com/office/word/2016/wordml/cid" xmlns:w16="http://schemas.microsoft.com/office/word/2018/wordml" xmlns:w16du="http://schemas.microsoft.com/office/word/2023/wordml/word16du" xmlns:w16sdtdh="http://schemas.microsoft.com/office/word/2020/wordml/sdtdatahash" xmlns:w16sdtfl="http://schemas.microsoft.com/office/word/2024/wordml/sdtformatlock" xmlns:w16se="http://schemas.microsoft.com/office/word/2015/wordml/symex" xmlns:wpg="http://schemas.microsoft.com/office/word/2010/wordprocessingGroup" xmlns:wpi="http://schemas.microsoft.com/office/word/2010/wordprocessingInk" xmlns:wne="http://schemas.microsoft.com/office/word/2006/wordml" xmlns:wps="http://schemas.microsoft.com/office/word/2010/wordprocessingShape" mc:Ignorable="w14 w15 w16se w16cid w16 w16cex w16sdtdh w16sdtfl w16du wp14">
   <w:footnote w:type="separator" w:id="-1">
     <w:p>
       <w:pPr>
@@ -7885,7 +7649,7 @@
 </file>
 
 <file path=word/header1.xml><?xml version="1.0" encoding="utf-8"?>
-<w:hdr xmlns:wpc="http://schemas.microsoft.com/office/word/2010/wordprocessingCanvas" xmlns:cx="http://schemas.microsoft.com/office/drawing/2014/chartex" xmlns:cx1="http://schemas.microsoft.com/office/drawing/2015/9/8/chartex" xmlns:cx2="http://schemas.microsoft.com/office/drawing/2015/10/21/chartex" xmlns:cx3="http://schemas.microsoft.com/office/drawing/2016/5/9/chartex" xmlns:cx4="http://schemas.microsoft.com/office/drawing/2016/5/10/chartex" xmlns:cx5="http://schemas.microsoft.com/office/drawing/2016/5/11/chartex" xmlns:cx6="http://schemas.microsoft.com/office/drawing/2016/5/12/chartex" xmlns:cx7="http://schemas.microsoft.com/office/drawing/2016/5/13/chartex" xmlns:cx8="http://schemas.microsoft.com/office/drawing/2016/5/14/chartex" xmlns:mc="http://schemas.openxmlformats.org/markup-compatibility/2006" xmlns:aink="http://schemas.microsoft.com/office/drawing/2016/ink" xmlns:am3d="http://schemas.microsoft.com/office/drawing/2017/model3d" xmlns:o="urn:schemas-microsoft-com:office:office" xmlns:r="http://schemas.openxmlformats.org/officeDocument/2006/relationships" xmlns:m="http://schemas.openxmlformats.org/officeDocument/2006/math" xmlns:v="urn:schemas-microsoft-com:vml" xmlns:wp14="http://schemas.microsoft.com/office/word/2010/wordprocessingDrawing" xmlns:wp="http://schemas.openxmlformats.org/drawingml/2006/wordprocessingDrawing" xmlns:w10="urn:schemas-microsoft-com:office:word" xmlns:w="http://schemas.openxmlformats.org/wordprocessingml/2006/main" xmlns:w14="http://schemas.microsoft.com/office/word/2010/wordml" xmlns:w15="http://schemas.microsoft.com/office/word/2012/wordml" xmlns:w16cex="http://schemas.microsoft.com/office/word/2018/wordml/cex" xmlns:w16cid="http://schemas.microsoft.com/office/word/2016/wordml/cid" xmlns:w16="http://schemas.microsoft.com/office/word/2018/wordml" xmlns:w16sdtdh="http://schemas.microsoft.com/office/word/2020/wordml/sdtdatahash" xmlns:w16se="http://schemas.microsoft.com/office/word/2015/wordml/symex" xmlns:wpg="http://schemas.microsoft.com/office/word/2010/wordprocessingGroup" xmlns:wpi="http://schemas.microsoft.com/office/word/2010/wordprocessingInk" xmlns:wne="http://schemas.microsoft.com/office/word/2006/wordml" xmlns:wps="http://schemas.microsoft.com/office/word/2010/wordprocessingShape" mc:Ignorable="w14 w15 w16se w16cid w16 w16cex w16sdtdh wp14">
+<w:hdr xmlns:wpc="http://schemas.microsoft.com/office/word/2010/wordprocessingCanvas" xmlns:cx="http://schemas.microsoft.com/office/drawing/2014/chartex" xmlns:cx1="http://schemas.microsoft.com/office/drawing/2015/9/8/chartex" xmlns:cx2="http://schemas.microsoft.com/office/drawing/2015/10/21/chartex" xmlns:cx3="http://schemas.microsoft.com/office/drawing/2016/5/9/chartex" xmlns:cx4="http://schemas.microsoft.com/office/drawing/2016/5/10/chartex" xmlns:cx5="http://schemas.microsoft.com/office/drawing/2016/5/11/chartex" xmlns:cx6="http://schemas.microsoft.com/office/drawing/2016/5/12/chartex" xmlns:cx7="http://schemas.microsoft.com/office/drawing/2016/5/13/chartex" xmlns:cx8="http://schemas.microsoft.com/office/drawing/2016/5/14/chartex" xmlns:mc="http://schemas.openxmlformats.org/markup-compatibility/2006" xmlns:aink="http://schemas.microsoft.com/office/drawing/2016/ink" xmlns:am3d="http://schemas.microsoft.com/office/drawing/2017/model3d" xmlns:o="urn:schemas-microsoft-com:office:office" xmlns:oel="http://schemas.microsoft.com/office/2019/extlst" xmlns:r="http://schemas.openxmlformats.org/officeDocument/2006/relationships" xmlns:m="http://schemas.openxmlformats.org/officeDocument/2006/math" xmlns:v="urn:schemas-microsoft-com:vml" xmlns:wp14="http://schemas.microsoft.com/office/word/2010/wordprocessingDrawing" xmlns:wp="http://schemas.openxmlformats.org/drawingml/2006/wordprocessingDrawing" xmlns:w10="urn:schemas-microsoft-com:office:word" xmlns:w="http://schemas.openxmlformats.org/wordprocessingml/2006/main" xmlns:w14="http://schemas.microsoft.com/office/word/2010/wordml" xmlns:w15="http://schemas.microsoft.com/office/word/2012/wordml" xmlns:w16cex="http://schemas.microsoft.com/office/word/2018/wordml/cex" xmlns:w16cid="http://schemas.microsoft.com/office/word/2016/wordml/cid" xmlns:w16="http://schemas.microsoft.com/office/word/2018/wordml" xmlns:w16du="http://schemas.microsoft.com/office/word/2023/wordml/word16du" xmlns:w16sdtdh="http://schemas.microsoft.com/office/word/2020/wordml/sdtdatahash" xmlns:w16sdtfl="http://schemas.microsoft.com/office/word/2024/wordml/sdtformatlock" xmlns:w16se="http://schemas.microsoft.com/office/word/2015/wordml/symex" xmlns:wpg="http://schemas.microsoft.com/office/word/2010/wordprocessingGroup" xmlns:wpi="http://schemas.microsoft.com/office/word/2010/wordprocessingInk" xmlns:wne="http://schemas.microsoft.com/office/word/2006/wordml" xmlns:wps="http://schemas.microsoft.com/office/word/2010/wordprocessingShape" mc:Ignorable="w14 w15 w16se w16cid w16 w16cex w16sdtdh w16sdtfl w16du wp14">
   <w:p>
     <w:pPr>
       <w:tabs>
@@ -8021,7 +7785,7 @@
 </file>
 
 <file path=word/numbering.xml><?xml version="1.0" encoding="utf-8"?>
-<w:numbering xmlns:wpc="http://schemas.microsoft.com/office/word/2010/wordprocessingCanvas" xmlns:cx="http://schemas.microsoft.com/office/drawing/2014/chartex" xmlns:cx1="http://schemas.microsoft.com/office/drawing/2015/9/8/chartex" xmlns:cx2="http://schemas.microsoft.com/office/drawing/2015/10/21/chartex" xmlns:cx3="http://schemas.microsoft.com/office/drawing/2016/5/9/chartex" xmlns:cx4="http://schemas.microsoft.com/office/drawing/2016/5/10/chartex" xmlns:cx5="http://schemas.microsoft.com/office/drawing/2016/5/11/chartex" xmlns:cx6="http://schemas.microsoft.com/office/drawing/2016/5/12/chartex" xmlns:cx7="http://schemas.microsoft.com/office/drawing/2016/5/13/chartex" xmlns:cx8="http://schemas.microsoft.com/office/drawing/2016/5/14/chartex" xmlns:mc="http://schemas.openxmlformats.org/markup-compatibility/2006" xmlns:aink="http://schemas.microsoft.com/office/drawing/2016/ink" xmlns:am3d="http://schemas.microsoft.com/office/drawing/2017/model3d" xmlns:o="urn:schemas-microsoft-com:office:office" xmlns:r="http://schemas.openxmlformats.org/officeDocument/2006/relationships" xmlns:m="http://schemas.openxmlformats.org/officeDocument/2006/math" xmlns:v="urn:schemas-microsoft-com:vml" xmlns:wp14="http://schemas.microsoft.com/office/word/2010/wordprocessingDrawing" xmlns:wp="http://schemas.openxmlformats.org/drawingml/2006/wordprocessingDrawing" xmlns:w10="urn:schemas-microsoft-com:office:word" xmlns:w="http://schemas.openxmlformats.org/wordprocessingml/2006/main" xmlns:w14="http://schemas.microsoft.com/office/word/2010/wordml" xmlns:w15="http://schemas.microsoft.com/office/word/2012/wordml" xmlns:w16cex="http://schemas.microsoft.com/office/word/2018/wordml/cex" xmlns:w16cid="http://schemas.microsoft.com/office/word/2016/wordml/cid" xmlns:w16="http://schemas.microsoft.com/office/word/2018/wordml" xmlns:w16sdtdh="http://schemas.microsoft.com/office/word/2020/wordml/sdtdatahash" xmlns:w16se="http://schemas.microsoft.com/office/word/2015/wordml/symex" xmlns:wpg="http://schemas.microsoft.com/office/word/2010/wordprocessingGroup" xmlns:wpi="http://schemas.microsoft.com/office/word/2010/wordprocessingInk" xmlns:wne="http://schemas.microsoft.com/office/word/2006/wordml" xmlns:wps="http://schemas.microsoft.com/office/word/2010/wordprocessingShape" mc:Ignorable="w14 w15 w16se w16cid w16 w16cex w16sdtdh wp14">
+<w:numbering xmlns:wpc="http://schemas.microsoft.com/office/word/2010/wordprocessingCanvas" xmlns:cx="http://schemas.microsoft.com/office/drawing/2014/chartex" xmlns:cx1="http://schemas.microsoft.com/office/drawing/2015/9/8/chartex" xmlns:cx2="http://schemas.microsoft.com/office/drawing/2015/10/21/chartex" xmlns:cx3="http://schemas.microsoft.com/office/drawing/2016/5/9/chartex" xmlns:cx4="http://schemas.microsoft.com/office/drawing/2016/5/10/chartex" xmlns:cx5="http://schemas.microsoft.com/office/drawing/2016/5/11/chartex" xmlns:cx6="http://schemas.microsoft.com/office/drawing/2016/5/12/chartex" xmlns:cx7="http://schemas.microsoft.com/office/drawing/2016/5/13/chartex" xmlns:cx8="http://schemas.microsoft.com/office/drawing/2016/5/14/chartex" xmlns:mc="http://schemas.openxmlformats.org/markup-compatibility/2006" xmlns:aink="http://schemas.microsoft.com/office/drawing/2016/ink" xmlns:am3d="http://schemas.microsoft.com/office/drawing/2017/model3d" xmlns:o="urn:schemas-microsoft-com:office:office" xmlns:oel="http://schemas.microsoft.com/office/2019/extlst" xmlns:r="http://schemas.openxmlformats.org/officeDocument/2006/relationships" xmlns:m="http://schemas.openxmlformats.org/officeDocument/2006/math" xmlns:v="urn:schemas-microsoft-com:vml" xmlns:wp14="http://schemas.microsoft.com/office/word/2010/wordprocessingDrawing" xmlns:wp="http://schemas.openxmlformats.org/drawingml/2006/wordprocessingDrawing" xmlns:w10="urn:schemas-microsoft-com:office:word" xmlns:w="http://schemas.openxmlformats.org/wordprocessingml/2006/main" xmlns:w14="http://schemas.microsoft.com/office/word/2010/wordml" xmlns:w15="http://schemas.microsoft.com/office/word/2012/wordml" xmlns:w16cex="http://schemas.microsoft.com/office/word/2018/wordml/cex" xmlns:w16cid="http://schemas.microsoft.com/office/word/2016/wordml/cid" xmlns:w16="http://schemas.microsoft.com/office/word/2018/wordml" xmlns:w16du="http://schemas.microsoft.com/office/word/2023/wordml/word16du" xmlns:w16sdtdh="http://schemas.microsoft.com/office/word/2020/wordml/sdtdatahash" xmlns:w16sdtfl="http://schemas.microsoft.com/office/word/2024/wordml/sdtformatlock" xmlns:w16se="http://schemas.microsoft.com/office/word/2015/wordml/symex" xmlns:wpg="http://schemas.microsoft.com/office/word/2010/wordprocessingGroup" xmlns:wpi="http://schemas.microsoft.com/office/word/2010/wordprocessingInk" xmlns:wne="http://schemas.microsoft.com/office/word/2006/wordml" xmlns:wps="http://schemas.microsoft.com/office/word/2010/wordprocessingShape" mc:Ignorable="w14 w15 w16se w16cid w16 w16cex w16sdtdh w16sdtfl w16du wp14">
   <w:abstractNum w:abstractNumId="0" w15:restartNumberingAfterBreak="0">
     <w:nsid w:val="0B73725B"/>
     <w:multiLevelType w:val="hybridMultilevel"/>
@@ -9735,56 +9499,56 @@
       </w:rPr>
     </w:lvl>
   </w:abstractNum>
-  <w:num w:numId="1">
+  <w:num w:numId="1" w16cid:durableId="2056077662">
     <w:abstractNumId w:val="14"/>
   </w:num>
-  <w:num w:numId="2">
+  <w:num w:numId="2" w16cid:durableId="207180683">
     <w:abstractNumId w:val="6"/>
   </w:num>
-  <w:num w:numId="3">
+  <w:num w:numId="3" w16cid:durableId="317997399">
     <w:abstractNumId w:val="5"/>
   </w:num>
-  <w:num w:numId="4">
+  <w:num w:numId="4" w16cid:durableId="1059671073">
     <w:abstractNumId w:val="8"/>
   </w:num>
-  <w:num w:numId="5">
+  <w:num w:numId="5" w16cid:durableId="941497926">
     <w:abstractNumId w:val="7"/>
   </w:num>
-  <w:num w:numId="6">
+  <w:num w:numId="6" w16cid:durableId="1201211801">
     <w:abstractNumId w:val="1"/>
   </w:num>
-  <w:num w:numId="7">
+  <w:num w:numId="7" w16cid:durableId="966663894">
     <w:abstractNumId w:val="13"/>
   </w:num>
-  <w:num w:numId="8">
+  <w:num w:numId="8" w16cid:durableId="496580968">
     <w:abstractNumId w:val="3"/>
   </w:num>
-  <w:num w:numId="9">
+  <w:num w:numId="9" w16cid:durableId="1229918295">
     <w:abstractNumId w:val="0"/>
   </w:num>
-  <w:num w:numId="10">
+  <w:num w:numId="10" w16cid:durableId="63450755">
     <w:abstractNumId w:val="4"/>
   </w:num>
-  <w:num w:numId="11">
+  <w:num w:numId="11" w16cid:durableId="1894080372">
     <w:abstractNumId w:val="12"/>
   </w:num>
-  <w:num w:numId="12">
+  <w:num w:numId="12" w16cid:durableId="2063364277">
     <w:abstractNumId w:val="9"/>
   </w:num>
-  <w:num w:numId="13">
+  <w:num w:numId="13" w16cid:durableId="422265359">
     <w:abstractNumId w:val="11"/>
   </w:num>
-  <w:num w:numId="14">
+  <w:num w:numId="14" w16cid:durableId="520823779">
     <w:abstractNumId w:val="10"/>
   </w:num>
-  <w:num w:numId="15">
+  <w:num w:numId="15" w16cid:durableId="398672926">
     <w:abstractNumId w:val="2"/>
   </w:num>
 </w:numbering>
 </file>
 
 <file path=word/styles.xml><?xml version="1.0" encoding="utf-8"?>
-<w:styles xmlns:mc="http://schemas.openxmlformats.org/markup-compatibility/2006" xmlns:r="http://schemas.openxmlformats.org/officeDocument/2006/relationships" xmlns:w="http://schemas.openxmlformats.org/wordprocessingml/2006/main" xmlns:w14="http://schemas.microsoft.com/office/word/2010/wordml" xmlns:w15="http://schemas.microsoft.com/office/word/2012/wordml" xmlns:w16cex="http://schemas.microsoft.com/office/word/2018/wordml/cex" xmlns:w16cid="http://schemas.microsoft.com/office/word/2016/wordml/cid" xmlns:w16="http://schemas.microsoft.com/office/word/2018/wordml" xmlns:w16sdtdh="http://schemas.microsoft.com/office/word/2020/wordml/sdtdatahash" xmlns:w16se="http://schemas.microsoft.com/office/word/2015/wordml/symex" mc:Ignorable="w14 w15 w16se w16cid w16 w16cex w16sdtdh">
+<w:styles xmlns:mc="http://schemas.openxmlformats.org/markup-compatibility/2006" xmlns:r="http://schemas.openxmlformats.org/officeDocument/2006/relationships" xmlns:w="http://schemas.openxmlformats.org/wordprocessingml/2006/main" xmlns:w14="http://schemas.microsoft.com/office/word/2010/wordml" xmlns:w15="http://schemas.microsoft.com/office/word/2012/wordml" xmlns:w16cex="http://schemas.microsoft.com/office/word/2018/wordml/cex" xmlns:w16cid="http://schemas.microsoft.com/office/word/2016/wordml/cid" xmlns:w16="http://schemas.microsoft.com/office/word/2018/wordml" xmlns:w16du="http://schemas.microsoft.com/office/word/2023/wordml/word16du" xmlns:w16sdtdh="http://schemas.microsoft.com/office/word/2020/wordml/sdtdatahash" xmlns:w16sdtfl="http://schemas.microsoft.com/office/word/2024/wordml/sdtformatlock" xmlns:w16se="http://schemas.microsoft.com/office/word/2015/wordml/symex" mc:Ignorable="w14 w15 w16se w16cid w16 w16cex w16sdtdh w16sdtfl w16du">
   <w:docDefaults>
     <w:rPrDefault>
       <w:rPr>

</xml_diff>

<commit_message>
full test starting chain
</commit_message>
<xml_diff>
--- a/documents/2027_13.S1D_4_vizsgaremek_Adatbázismodell-diagramm.docx
+++ b/documents/2027_13.S1D_4_vizsgaremek_Adatbázismodell-diagramm.docx
@@ -1,6 +1,6 @@
 
 <file path=word/document.xml><?xml version="1.0" encoding="utf-8"?>
-<w:document xmlns:wpc="http://schemas.microsoft.com/office/word/2010/wordprocessingCanvas" xmlns:cx="http://schemas.microsoft.com/office/drawing/2014/chartex" xmlns:cx1="http://schemas.microsoft.com/office/drawing/2015/9/8/chartex" xmlns:cx2="http://schemas.microsoft.com/office/drawing/2015/10/21/chartex" xmlns:cx3="http://schemas.microsoft.com/office/drawing/2016/5/9/chartex" xmlns:cx4="http://schemas.microsoft.com/office/drawing/2016/5/10/chartex" xmlns:cx5="http://schemas.microsoft.com/office/drawing/2016/5/11/chartex" xmlns:cx6="http://schemas.microsoft.com/office/drawing/2016/5/12/chartex" xmlns:cx7="http://schemas.microsoft.com/office/drawing/2016/5/13/chartex" xmlns:cx8="http://schemas.microsoft.com/office/drawing/2016/5/14/chartex" xmlns:mc="http://schemas.openxmlformats.org/markup-compatibility/2006" xmlns:aink="http://schemas.microsoft.com/office/drawing/2016/ink" xmlns:am3d="http://schemas.microsoft.com/office/drawing/2017/model3d" xmlns:o="urn:schemas-microsoft-com:office:office" xmlns:oel="http://schemas.microsoft.com/office/2019/extlst" xmlns:r="http://schemas.openxmlformats.org/officeDocument/2006/relationships" xmlns:m="http://schemas.openxmlformats.org/officeDocument/2006/math" xmlns:v="urn:schemas-microsoft-com:vml" xmlns:wp14="http://schemas.microsoft.com/office/word/2010/wordprocessingDrawing" xmlns:wp="http://schemas.openxmlformats.org/drawingml/2006/wordprocessingDrawing" xmlns:w10="urn:schemas-microsoft-com:office:word" xmlns:w="http://schemas.openxmlformats.org/wordprocessingml/2006/main" xmlns:w14="http://schemas.microsoft.com/office/word/2010/wordml" xmlns:w15="http://schemas.microsoft.com/office/word/2012/wordml" xmlns:w16cex="http://schemas.microsoft.com/office/word/2018/wordml/cex" xmlns:w16cid="http://schemas.microsoft.com/office/word/2016/wordml/cid" xmlns:w16="http://schemas.microsoft.com/office/word/2018/wordml" xmlns:w16du="http://schemas.microsoft.com/office/word/2023/wordml/word16du" xmlns:w16sdtdh="http://schemas.microsoft.com/office/word/2020/wordml/sdtdatahash" xmlns:w16sdtfl="http://schemas.microsoft.com/office/word/2024/wordml/sdtformatlock" xmlns:w16se="http://schemas.microsoft.com/office/word/2015/wordml/symex" xmlns:wpg="http://schemas.microsoft.com/office/word/2010/wordprocessingGroup" xmlns:wpi="http://schemas.microsoft.com/office/word/2010/wordprocessingInk" xmlns:wne="http://schemas.microsoft.com/office/word/2006/wordml" xmlns:wps="http://schemas.microsoft.com/office/word/2010/wordprocessingShape" mc:Ignorable="w14 w15 w16se w16cid w16 w16cex w16sdtdh w16sdtfl w16du wp14">
+<w:document xmlns:wpc="http://schemas.microsoft.com/office/word/2010/wordprocessingCanvas" xmlns:cx="http://schemas.microsoft.com/office/drawing/2014/chartex" xmlns:cx1="http://schemas.microsoft.com/office/drawing/2015/9/8/chartex" xmlns:cx2="http://schemas.microsoft.com/office/drawing/2015/10/21/chartex" xmlns:cx3="http://schemas.microsoft.com/office/drawing/2016/5/9/chartex" xmlns:cx4="http://schemas.microsoft.com/office/drawing/2016/5/10/chartex" xmlns:cx5="http://schemas.microsoft.com/office/drawing/2016/5/11/chartex" xmlns:cx6="http://schemas.microsoft.com/office/drawing/2016/5/12/chartex" xmlns:cx7="http://schemas.microsoft.com/office/drawing/2016/5/13/chartex" xmlns:cx8="http://schemas.microsoft.com/office/drawing/2016/5/14/chartex" xmlns:mc="http://schemas.openxmlformats.org/markup-compatibility/2006" xmlns:aink="http://schemas.microsoft.com/office/drawing/2016/ink" xmlns:am3d="http://schemas.microsoft.com/office/drawing/2017/model3d" xmlns:o="urn:schemas-microsoft-com:office:office" xmlns:r="http://schemas.openxmlformats.org/officeDocument/2006/relationships" xmlns:m="http://schemas.openxmlformats.org/officeDocument/2006/math" xmlns:v="urn:schemas-microsoft-com:vml" xmlns:wp14="http://schemas.microsoft.com/office/word/2010/wordprocessingDrawing" xmlns:wp="http://schemas.openxmlformats.org/drawingml/2006/wordprocessingDrawing" xmlns:w10="urn:schemas-microsoft-com:office:word" xmlns:w="http://schemas.openxmlformats.org/wordprocessingml/2006/main" xmlns:w14="http://schemas.microsoft.com/office/word/2010/wordml" xmlns:w15="http://schemas.microsoft.com/office/word/2012/wordml" xmlns:w16cex="http://schemas.microsoft.com/office/word/2018/wordml/cex" xmlns:w16cid="http://schemas.microsoft.com/office/word/2016/wordml/cid" xmlns:w16="http://schemas.microsoft.com/office/word/2018/wordml" xmlns:w16sdtdh="http://schemas.microsoft.com/office/word/2020/wordml/sdtdatahash" xmlns:w16se="http://schemas.microsoft.com/office/word/2015/wordml/symex" xmlns:wpg="http://schemas.microsoft.com/office/word/2010/wordprocessingGroup" xmlns:wpi="http://schemas.microsoft.com/office/word/2010/wordprocessingInk" xmlns:wne="http://schemas.microsoft.com/office/word/2006/wordml" xmlns:wps="http://schemas.microsoft.com/office/word/2010/wordprocessingShape" mc:Ignorable="w14 w15 w16se w16cid w16 w16cex w16sdtdh wp14">
   <w:body>
     <w:p>
       <w:pPr>
@@ -1676,12 +1676,14 @@
                 <w:bCs w:val="0"/>
               </w:rPr>
             </w:pPr>
+            <w:proofErr w:type="spellStart"/>
             <w:r>
               <w:rPr>
                 <w:bCs w:val="0"/>
               </w:rPr>
               <w:t>Nullable</w:t>
             </w:r>
+            <w:proofErr w:type="spellEnd"/>
           </w:p>
         </w:tc>
         <w:tc>
@@ -1698,12 +1700,14 @@
                 <w:bCs w:val="0"/>
               </w:rPr>
             </w:pPr>
+            <w:proofErr w:type="spellStart"/>
             <w:r>
               <w:rPr>
                 <w:bCs w:val="0"/>
               </w:rPr>
               <w:t>Unique</w:t>
             </w:r>
+            <w:proofErr w:type="spellEnd"/>
           </w:p>
         </w:tc>
       </w:tr>
@@ -1723,9 +1727,11 @@
             <w:pPr>
               <w:ind w:left="-304" w:firstLine="304"/>
             </w:pPr>
+            <w:proofErr w:type="spellStart"/>
             <w:r>
               <w:t>id</w:t>
             </w:r>
+            <w:proofErr w:type="spellEnd"/>
           </w:p>
         </w:tc>
         <w:tc>
@@ -1786,9 +1792,11 @@
             <w:hideMark/>
           </w:tcPr>
           <w:p>
+            <w:proofErr w:type="spellStart"/>
             <w:r>
               <w:t>nev</w:t>
             </w:r>
+            <w:proofErr w:type="spellEnd"/>
           </w:p>
         </w:tc>
         <w:tc>
@@ -1918,9 +1926,11 @@
               <w:jc w:val="center"/>
               <w:cnfStyle w:val="100000000000" w:firstRow="1" w:lastRow="0" w:firstColumn="0" w:lastColumn="0" w:oddVBand="0" w:evenVBand="0" w:oddHBand="0" w:evenHBand="0" w:firstRowFirstColumn="0" w:firstRowLastColumn="0" w:lastRowFirstColumn="0" w:lastRowLastColumn="0"/>
             </w:pPr>
+            <w:proofErr w:type="spellStart"/>
             <w:r>
               <w:t>Nullable</w:t>
             </w:r>
+            <w:proofErr w:type="spellEnd"/>
           </w:p>
         </w:tc>
         <w:tc>
@@ -1934,9 +1944,11 @@
               <w:jc w:val="center"/>
               <w:cnfStyle w:val="100000000000" w:firstRow="1" w:lastRow="0" w:firstColumn="0" w:lastColumn="0" w:oddVBand="0" w:evenVBand="0" w:oddHBand="0" w:evenHBand="0" w:firstRowFirstColumn="0" w:firstRowLastColumn="0" w:lastRowFirstColumn="0" w:lastRowLastColumn="0"/>
             </w:pPr>
+            <w:proofErr w:type="spellStart"/>
             <w:r>
               <w:t>Unique</w:t>
             </w:r>
+            <w:proofErr w:type="spellEnd"/>
           </w:p>
         </w:tc>
       </w:tr>
@@ -1952,9 +1964,11 @@
             <w:shd w:val="clear" w:color="auto" w:fill="7030A0"/>
           </w:tcPr>
           <w:p>
+            <w:proofErr w:type="spellStart"/>
             <w:r>
               <w:t>id</w:t>
             </w:r>
+            <w:proofErr w:type="spellEnd"/>
           </w:p>
         </w:tc>
         <w:tc>
@@ -2011,9 +2025,11 @@
             <w:shd w:val="clear" w:color="auto" w:fill="7030A0"/>
           </w:tcPr>
           <w:p>
+            <w:proofErr w:type="spellStart"/>
             <w:r>
               <w:t>tantargy_id</w:t>
             </w:r>
+            <w:proofErr w:type="spellEnd"/>
           </w:p>
         </w:tc>
         <w:tc>
@@ -2071,9 +2087,11 @@
             <w:shd w:val="clear" w:color="auto" w:fill="7030A0"/>
           </w:tcPr>
           <w:p>
+            <w:proofErr w:type="spellStart"/>
             <w:r>
               <w:t>nev</w:t>
             </w:r>
+            <w:proofErr w:type="spellEnd"/>
           </w:p>
         </w:tc>
         <w:tc>
@@ -2201,9 +2219,11 @@
               <w:jc w:val="center"/>
               <w:cnfStyle w:val="100000000000" w:firstRow="1" w:lastRow="0" w:firstColumn="0" w:lastColumn="0" w:oddVBand="0" w:evenVBand="0" w:oddHBand="0" w:evenHBand="0" w:firstRowFirstColumn="0" w:firstRowLastColumn="0" w:lastRowFirstColumn="0" w:lastRowLastColumn="0"/>
             </w:pPr>
+            <w:proofErr w:type="spellStart"/>
             <w:r>
               <w:t>Nullable</w:t>
             </w:r>
+            <w:proofErr w:type="spellEnd"/>
           </w:p>
         </w:tc>
         <w:tc>
@@ -2217,9 +2237,11 @@
               <w:jc w:val="center"/>
               <w:cnfStyle w:val="100000000000" w:firstRow="1" w:lastRow="0" w:firstColumn="0" w:lastColumn="0" w:oddVBand="0" w:evenVBand="0" w:oddHBand="0" w:evenHBand="0" w:firstRowFirstColumn="0" w:firstRowLastColumn="0" w:lastRowFirstColumn="0" w:lastRowLastColumn="0"/>
             </w:pPr>
+            <w:proofErr w:type="spellStart"/>
             <w:r>
               <w:t>Unique</w:t>
             </w:r>
+            <w:proofErr w:type="spellEnd"/>
           </w:p>
         </w:tc>
       </w:tr>
@@ -2235,9 +2257,11 @@
             <w:shd w:val="clear" w:color="auto" w:fill="7030A0"/>
           </w:tcPr>
           <w:p>
+            <w:proofErr w:type="spellStart"/>
             <w:r>
               <w:t>id</w:t>
             </w:r>
+            <w:proofErr w:type="spellEnd"/>
           </w:p>
         </w:tc>
         <w:tc>
@@ -2294,9 +2318,11 @@
             <w:shd w:val="clear" w:color="auto" w:fill="7030A0"/>
           </w:tcPr>
           <w:p>
+            <w:proofErr w:type="spellStart"/>
             <w:r>
               <w:t>szoveg</w:t>
             </w:r>
+            <w:proofErr w:type="spellEnd"/>
           </w:p>
         </w:tc>
         <w:tc>
@@ -2354,9 +2380,11 @@
             <w:shd w:val="clear" w:color="auto" w:fill="7030A0"/>
           </w:tcPr>
           <w:p>
+            <w:proofErr w:type="spellStart"/>
             <w:r>
               <w:t>kep</w:t>
             </w:r>
+            <w:proofErr w:type="spellEnd"/>
           </w:p>
         </w:tc>
         <w:tc>
@@ -2382,9 +2410,11 @@
             <w:pPr>
               <w:cnfStyle w:val="000000100000" w:firstRow="0" w:lastRow="0" w:firstColumn="0" w:lastColumn="0" w:oddVBand="0" w:evenVBand="0" w:oddHBand="1" w:evenHBand="0" w:firstRowFirstColumn="0" w:firstRowLastColumn="0" w:lastRowFirstColumn="0" w:lastRowLastColumn="0"/>
             </w:pPr>
+            <w:proofErr w:type="spellStart"/>
             <w:r>
               <w:t>nullable</w:t>
             </w:r>
+            <w:proofErr w:type="spellEnd"/>
           </w:p>
         </w:tc>
         <w:tc>
@@ -2526,9 +2556,11 @@
               <w:jc w:val="center"/>
               <w:cnfStyle w:val="100000000000" w:firstRow="1" w:lastRow="0" w:firstColumn="0" w:lastColumn="0" w:oddVBand="0" w:evenVBand="0" w:oddHBand="0" w:evenHBand="0" w:firstRowFirstColumn="0" w:firstRowLastColumn="0" w:lastRowFirstColumn="0" w:lastRowLastColumn="0"/>
             </w:pPr>
+            <w:proofErr w:type="spellStart"/>
             <w:r>
               <w:t>Nullable</w:t>
             </w:r>
+            <w:proofErr w:type="spellEnd"/>
           </w:p>
         </w:tc>
         <w:tc>
@@ -2542,9 +2574,11 @@
               <w:jc w:val="center"/>
               <w:cnfStyle w:val="100000000000" w:firstRow="1" w:lastRow="0" w:firstColumn="0" w:lastColumn="0" w:oddVBand="0" w:evenVBand="0" w:oddHBand="0" w:evenHBand="0" w:firstRowFirstColumn="0" w:firstRowLastColumn="0" w:lastRowFirstColumn="0" w:lastRowLastColumn="0"/>
             </w:pPr>
+            <w:proofErr w:type="spellStart"/>
             <w:r>
               <w:t>Unique</w:t>
             </w:r>
+            <w:proofErr w:type="spellEnd"/>
           </w:p>
         </w:tc>
       </w:tr>
@@ -2560,9 +2594,11 @@
             <w:shd w:val="clear" w:color="auto" w:fill="7030A0"/>
           </w:tcPr>
           <w:p>
+            <w:proofErr w:type="spellStart"/>
             <w:r>
               <w:t>id</w:t>
             </w:r>
+            <w:proofErr w:type="spellEnd"/>
           </w:p>
         </w:tc>
         <w:tc>
@@ -2619,9 +2655,11 @@
             <w:shd w:val="clear" w:color="auto" w:fill="7030A0"/>
           </w:tcPr>
           <w:p>
+            <w:proofErr w:type="spellStart"/>
             <w:r>
               <w:t>ev</w:t>
             </w:r>
+            <w:proofErr w:type="spellEnd"/>
           </w:p>
         </w:tc>
         <w:tc>
@@ -2693,9 +2731,11 @@
             <w:pPr>
               <w:cnfStyle w:val="000000100000" w:firstRow="0" w:lastRow="0" w:firstColumn="0" w:lastColumn="0" w:oddVBand="0" w:evenVBand="0" w:oddHBand="1" w:evenHBand="0" w:firstRowFirstColumn="0" w:firstRowLastColumn="0" w:lastRowFirstColumn="0" w:lastRowLastColumn="0"/>
             </w:pPr>
+            <w:proofErr w:type="spellStart"/>
             <w:r>
               <w:t>varchar</w:t>
             </w:r>
+            <w:proofErr w:type="spellEnd"/>
           </w:p>
         </w:tc>
         <w:tc>
@@ -2809,9 +2849,11 @@
               <w:jc w:val="center"/>
               <w:cnfStyle w:val="100000000000" w:firstRow="1" w:lastRow="0" w:firstColumn="0" w:lastColumn="0" w:oddVBand="0" w:evenVBand="0" w:oddHBand="0" w:evenHBand="0" w:firstRowFirstColumn="0" w:firstRowLastColumn="0" w:lastRowFirstColumn="0" w:lastRowLastColumn="0"/>
             </w:pPr>
+            <w:proofErr w:type="spellStart"/>
             <w:r>
               <w:t>Nullable</w:t>
             </w:r>
+            <w:proofErr w:type="spellEnd"/>
           </w:p>
         </w:tc>
         <w:tc>
@@ -2825,9 +2867,11 @@
               <w:jc w:val="center"/>
               <w:cnfStyle w:val="100000000000" w:firstRow="1" w:lastRow="0" w:firstColumn="0" w:lastColumn="0" w:oddVBand="0" w:evenVBand="0" w:oddHBand="0" w:evenHBand="0" w:firstRowFirstColumn="0" w:firstRowLastColumn="0" w:lastRowFirstColumn="0" w:lastRowLastColumn="0"/>
             </w:pPr>
+            <w:proofErr w:type="spellStart"/>
             <w:r>
               <w:t>Unique</w:t>
             </w:r>
+            <w:proofErr w:type="spellEnd"/>
           </w:p>
         </w:tc>
       </w:tr>
@@ -2843,9 +2887,11 @@
             <w:shd w:val="clear" w:color="auto" w:fill="7030A0"/>
           </w:tcPr>
           <w:p>
+            <w:proofErr w:type="spellStart"/>
             <w:r>
               <w:t>id</w:t>
             </w:r>
+            <w:proofErr w:type="spellEnd"/>
           </w:p>
         </w:tc>
         <w:tc>
@@ -2902,9 +2948,11 @@
             <w:shd w:val="clear" w:color="auto" w:fill="7030A0"/>
           </w:tcPr>
           <w:p>
+            <w:proofErr w:type="spellStart"/>
             <w:r>
               <w:t>nev</w:t>
             </w:r>
+            <w:proofErr w:type="spellEnd"/>
           </w:p>
         </w:tc>
         <w:tc>
@@ -3034,9 +3082,11 @@
               <w:jc w:val="center"/>
               <w:cnfStyle w:val="100000000000" w:firstRow="1" w:lastRow="0" w:firstColumn="0" w:lastColumn="0" w:oddVBand="0" w:evenVBand="0" w:oddHBand="0" w:evenHBand="0" w:firstRowFirstColumn="0" w:firstRowLastColumn="0" w:lastRowFirstColumn="0" w:lastRowLastColumn="0"/>
             </w:pPr>
+            <w:proofErr w:type="spellStart"/>
             <w:r>
               <w:t>Nullable</w:t>
             </w:r>
+            <w:proofErr w:type="spellEnd"/>
           </w:p>
         </w:tc>
         <w:tc>
@@ -3050,9 +3100,11 @@
               <w:jc w:val="center"/>
               <w:cnfStyle w:val="100000000000" w:firstRow="1" w:lastRow="0" w:firstColumn="0" w:lastColumn="0" w:oddVBand="0" w:evenVBand="0" w:oddHBand="0" w:evenHBand="0" w:firstRowFirstColumn="0" w:firstRowLastColumn="0" w:lastRowFirstColumn="0" w:lastRowLastColumn="0"/>
             </w:pPr>
+            <w:proofErr w:type="spellStart"/>
             <w:r>
               <w:t>Unique</w:t>
             </w:r>
+            <w:proofErr w:type="spellEnd"/>
           </w:p>
         </w:tc>
       </w:tr>
@@ -3068,9 +3120,11 @@
             <w:shd w:val="clear" w:color="auto" w:fill="7030A0"/>
           </w:tcPr>
           <w:p>
+            <w:proofErr w:type="spellStart"/>
             <w:r>
               <w:t>id</w:t>
             </w:r>
+            <w:proofErr w:type="spellEnd"/>
           </w:p>
         </w:tc>
         <w:tc>
@@ -3082,9 +3136,11 @@
             <w:pPr>
               <w:cnfStyle w:val="000000100000" w:firstRow="0" w:lastRow="0" w:firstColumn="0" w:lastColumn="0" w:oddVBand="0" w:evenVBand="0" w:oddHBand="1" w:evenHBand="0" w:firstRowFirstColumn="0" w:firstRowLastColumn="0" w:lastRowFirstColumn="0" w:lastRowLastColumn="0"/>
             </w:pPr>
+            <w:proofErr w:type="spellStart"/>
             <w:r>
               <w:t>uuid</w:t>
             </w:r>
+            <w:proofErr w:type="spellEnd"/>
           </w:p>
         </w:tc>
         <w:tc>
@@ -3127,9 +3183,11 @@
             <w:shd w:val="clear" w:color="auto" w:fill="7030A0"/>
           </w:tcPr>
           <w:p>
+            <w:proofErr w:type="spellStart"/>
             <w:r>
               <w:t>felhasznalonev</w:t>
             </w:r>
+            <w:proofErr w:type="spellEnd"/>
           </w:p>
         </w:tc>
         <w:tc>
@@ -3141,9 +3199,11 @@
             <w:pPr>
               <w:cnfStyle w:val="000000000000" w:firstRow="0" w:lastRow="0" w:firstColumn="0" w:lastColumn="0" w:oddVBand="0" w:evenVBand="0" w:oddHBand="0" w:evenHBand="0" w:firstRowFirstColumn="0" w:firstRowLastColumn="0" w:lastRowFirstColumn="0" w:lastRowLastColumn="0"/>
             </w:pPr>
+            <w:proofErr w:type="spellStart"/>
             <w:r>
               <w:t>varchar</w:t>
             </w:r>
+            <w:proofErr w:type="spellEnd"/>
           </w:p>
         </w:tc>
         <w:tc>
@@ -3201,9 +3261,11 @@
             <w:pPr>
               <w:cnfStyle w:val="000000100000" w:firstRow="0" w:lastRow="0" w:firstColumn="0" w:lastColumn="0" w:oddVBand="0" w:evenVBand="0" w:oddHBand="1" w:evenHBand="0" w:firstRowFirstColumn="0" w:firstRowLastColumn="0" w:lastRowFirstColumn="0" w:lastRowLastColumn="0"/>
             </w:pPr>
+            <w:proofErr w:type="spellStart"/>
             <w:r>
               <w:t>varchar</w:t>
             </w:r>
+            <w:proofErr w:type="spellEnd"/>
           </w:p>
         </w:tc>
         <w:tc>
@@ -3306,9 +3368,11 @@
             <w:shd w:val="clear" w:color="auto" w:fill="7030A0"/>
           </w:tcPr>
           <w:p>
+            <w:proofErr w:type="spellStart"/>
             <w:r>
               <w:t>xp</w:t>
             </w:r>
+            <w:proofErr w:type="spellEnd"/>
           </w:p>
         </w:tc>
         <w:tc>
@@ -3365,9 +3429,11 @@
             <w:shd w:val="clear" w:color="auto" w:fill="7030A0"/>
           </w:tcPr>
           <w:p>
+            <w:proofErr w:type="spellStart"/>
             <w:r>
               <w:t>profilkep</w:t>
             </w:r>
+            <w:proofErr w:type="spellEnd"/>
           </w:p>
         </w:tc>
         <w:tc>
@@ -3393,9 +3459,11 @@
             <w:pPr>
               <w:cnfStyle w:val="000000000000" w:firstRow="0" w:lastRow="0" w:firstColumn="0" w:lastColumn="0" w:oddVBand="0" w:evenVBand="0" w:oddHBand="0" w:evenHBand="0" w:firstRowFirstColumn="0" w:firstRowLastColumn="0" w:lastRowFirstColumn="0" w:lastRowLastColumn="0"/>
             </w:pPr>
+            <w:proofErr w:type="spellStart"/>
             <w:r>
               <w:t>nullable</w:t>
             </w:r>
+            <w:proofErr w:type="spellEnd"/>
           </w:p>
         </w:tc>
         <w:tc>
@@ -3514,7 +3582,115 @@
           <w:sz w:val="28"/>
           <w:szCs w:val="28"/>
         </w:rPr>
-        <w:t>A Supabase Auth által kezelt, beépített felhasználói tábla (’auth’ séma). A hitelesítési adatokat (e-mail, jelszó hash, bejelentkezési adatok) tárolja, és minden regisztrált felhasználóhoz egy egyedi ’uuid’ azonosítót rendel. Az alkalmazás ezt nem módosítja közvetlenül, a regisztrációt és bejelentkezést a Supabase Auth végzi. Az alkalmazás saját felhasználói adatai a ’profilok’ táblában vannak, amelynek ’id’ mezője az ’auth.users.id’-re hivatkozó idegen kulcs, így a kettő között 1:1 kapcsolat van.</w:t>
+        <w:t xml:space="preserve">A </w:t>
+      </w:r>
+      <w:proofErr w:type="spellStart"/>
+      <w:r>
+        <w:rPr>
+          <w:rFonts w:ascii="Times New Roman" w:hAnsi="Times New Roman" w:cs="Times New Roman"/>
+          <w:sz w:val="28"/>
+          <w:szCs w:val="28"/>
+        </w:rPr>
+        <w:t>Supabase</w:t>
+      </w:r>
+      <w:proofErr w:type="spellEnd"/>
+      <w:r>
+        <w:rPr>
+          <w:rFonts w:ascii="Times New Roman" w:hAnsi="Times New Roman" w:cs="Times New Roman"/>
+          <w:sz w:val="28"/>
+          <w:szCs w:val="28"/>
+        </w:rPr>
+        <w:t xml:space="preserve"> Auth által kezelt, beépített felhasználói tábla (’</w:t>
+      </w:r>
+      <w:proofErr w:type="spellStart"/>
+      <w:r>
+        <w:rPr>
+          <w:rFonts w:ascii="Times New Roman" w:hAnsi="Times New Roman" w:cs="Times New Roman"/>
+          <w:sz w:val="28"/>
+          <w:szCs w:val="28"/>
+        </w:rPr>
+        <w:t>auth</w:t>
+      </w:r>
+      <w:proofErr w:type="spellEnd"/>
+      <w:r>
+        <w:rPr>
+          <w:rFonts w:ascii="Times New Roman" w:hAnsi="Times New Roman" w:cs="Times New Roman"/>
+          <w:sz w:val="28"/>
+          <w:szCs w:val="28"/>
+        </w:rPr>
+        <w:t xml:space="preserve">’ séma). A hitelesítési adatokat (e-mail, jelszó </w:t>
+      </w:r>
+      <w:proofErr w:type="spellStart"/>
+      <w:r>
+        <w:rPr>
+          <w:rFonts w:ascii="Times New Roman" w:hAnsi="Times New Roman" w:cs="Times New Roman"/>
+          <w:sz w:val="28"/>
+          <w:szCs w:val="28"/>
+        </w:rPr>
+        <w:t>hash</w:t>
+      </w:r>
+      <w:proofErr w:type="spellEnd"/>
+      <w:r>
+        <w:rPr>
+          <w:rFonts w:ascii="Times New Roman" w:hAnsi="Times New Roman" w:cs="Times New Roman"/>
+          <w:sz w:val="28"/>
+          <w:szCs w:val="28"/>
+        </w:rPr>
+        <w:t>, bejelentkezési adatok) tárolja, és minden regisztrált felhasználóhoz egy egyedi ’</w:t>
+      </w:r>
+      <w:proofErr w:type="spellStart"/>
+      <w:r>
+        <w:rPr>
+          <w:rFonts w:ascii="Times New Roman" w:hAnsi="Times New Roman" w:cs="Times New Roman"/>
+          <w:sz w:val="28"/>
+          <w:szCs w:val="28"/>
+        </w:rPr>
+        <w:t>uuid</w:t>
+      </w:r>
+      <w:proofErr w:type="spellEnd"/>
+      <w:r>
+        <w:rPr>
+          <w:rFonts w:ascii="Times New Roman" w:hAnsi="Times New Roman" w:cs="Times New Roman"/>
+          <w:sz w:val="28"/>
+          <w:szCs w:val="28"/>
+        </w:rPr>
+        <w:t xml:space="preserve">’ azonosítót rendel. Az alkalmazás ezt nem módosítja közvetlenül, a regisztrációt és bejelentkezést a </w:t>
+      </w:r>
+      <w:proofErr w:type="spellStart"/>
+      <w:r>
+        <w:rPr>
+          <w:rFonts w:ascii="Times New Roman" w:hAnsi="Times New Roman" w:cs="Times New Roman"/>
+          <w:sz w:val="28"/>
+          <w:szCs w:val="28"/>
+        </w:rPr>
+        <w:t>Supabase</w:t>
+      </w:r>
+      <w:proofErr w:type="spellEnd"/>
+      <w:r>
+        <w:rPr>
+          <w:rFonts w:ascii="Times New Roman" w:hAnsi="Times New Roman" w:cs="Times New Roman"/>
+          <w:sz w:val="28"/>
+          <w:szCs w:val="28"/>
+        </w:rPr>
+        <w:t xml:space="preserve"> Auth végzi. Az alkalmazás saját felhasználói adatai a ’profilok’ táblában vannak, amelynek ’</w:t>
+      </w:r>
+      <w:proofErr w:type="spellStart"/>
+      <w:r>
+        <w:rPr>
+          <w:rFonts w:ascii="Times New Roman" w:hAnsi="Times New Roman" w:cs="Times New Roman"/>
+          <w:sz w:val="28"/>
+          <w:szCs w:val="28"/>
+        </w:rPr>
+        <w:t>id</w:t>
+      </w:r>
+      <w:proofErr w:type="spellEnd"/>
+      <w:r>
+        <w:rPr>
+          <w:rFonts w:ascii="Times New Roman" w:hAnsi="Times New Roman" w:cs="Times New Roman"/>
+          <w:sz w:val="28"/>
+          <w:szCs w:val="28"/>
+        </w:rPr>
+        <w:t>’ mezője az ’auth.users.id’-re hivatkozó idegen kulcs, így a kettő között 1:1 kapcsolat van.</w:t>
       </w:r>
     </w:p>
     <w:p>
@@ -3678,9 +3854,11 @@
               <w:jc w:val="center"/>
               <w:cnfStyle w:val="100000000000" w:firstRow="1" w:lastRow="0" w:firstColumn="0" w:lastColumn="0" w:oddVBand="0" w:evenVBand="0" w:oddHBand="0" w:evenHBand="0" w:firstRowFirstColumn="0" w:firstRowLastColumn="0" w:lastRowFirstColumn="0" w:lastRowLastColumn="0"/>
             </w:pPr>
+            <w:proofErr w:type="spellStart"/>
             <w:r>
               <w:t>Nullable</w:t>
             </w:r>
+            <w:proofErr w:type="spellEnd"/>
           </w:p>
         </w:tc>
         <w:tc>
@@ -3694,9 +3872,11 @@
               <w:jc w:val="center"/>
               <w:cnfStyle w:val="100000000000" w:firstRow="1" w:lastRow="0" w:firstColumn="0" w:lastColumn="0" w:oddVBand="0" w:evenVBand="0" w:oddHBand="0" w:evenHBand="0" w:firstRowFirstColumn="0" w:firstRowLastColumn="0" w:lastRowFirstColumn="0" w:lastRowLastColumn="0"/>
             </w:pPr>
+            <w:proofErr w:type="spellStart"/>
             <w:r>
               <w:t>Unique</w:t>
             </w:r>
+            <w:proofErr w:type="spellEnd"/>
           </w:p>
         </w:tc>
       </w:tr>
@@ -3712,9 +3892,11 @@
             <w:shd w:val="clear" w:color="auto" w:fill="7030A0"/>
           </w:tcPr>
           <w:p>
+            <w:proofErr w:type="spellStart"/>
             <w:r>
               <w:t>id</w:t>
             </w:r>
+            <w:proofErr w:type="spellEnd"/>
           </w:p>
         </w:tc>
         <w:tc>
@@ -3771,9 +3953,11 @@
             <w:shd w:val="clear" w:color="auto" w:fill="7030A0"/>
           </w:tcPr>
           <w:p>
+            <w:proofErr w:type="spellStart"/>
             <w:r>
               <w:t>temakor_id</w:t>
             </w:r>
+            <w:proofErr w:type="spellEnd"/>
           </w:p>
         </w:tc>
         <w:tc>
@@ -3831,9 +4015,11 @@
             <w:shd w:val="clear" w:color="auto" w:fill="7030A0"/>
           </w:tcPr>
           <w:p>
+            <w:proofErr w:type="spellStart"/>
             <w:r>
               <w:t>forras_id</w:t>
             </w:r>
+            <w:proofErr w:type="spellEnd"/>
           </w:p>
         </w:tc>
         <w:tc>
@@ -3859,9 +4045,11 @@
             <w:pPr>
               <w:cnfStyle w:val="000000100000" w:firstRow="0" w:lastRow="0" w:firstColumn="0" w:lastColumn="0" w:oddVBand="0" w:evenVBand="0" w:oddHBand="1" w:evenHBand="0" w:firstRowFirstColumn="0" w:firstRowLastColumn="0" w:lastRowFirstColumn="0" w:lastRowLastColumn="0"/>
             </w:pPr>
+            <w:proofErr w:type="spellStart"/>
             <w:r>
               <w:t>nullable</w:t>
             </w:r>
+            <w:proofErr w:type="spellEnd"/>
           </w:p>
         </w:tc>
         <w:tc>
@@ -3890,9 +4078,11 @@
             <w:shd w:val="clear" w:color="auto" w:fill="7030A0"/>
           </w:tcPr>
           <w:p>
+            <w:proofErr w:type="spellStart"/>
             <w:r>
               <w:t>kerdes</w:t>
             </w:r>
+            <w:proofErr w:type="spellEnd"/>
           </w:p>
         </w:tc>
         <w:tc>
@@ -3950,9 +4140,11 @@
             <w:shd w:val="clear" w:color="auto" w:fill="7030A0"/>
           </w:tcPr>
           <w:p>
+            <w:proofErr w:type="spellStart"/>
             <w:r>
               <w:t>valaszok</w:t>
             </w:r>
+            <w:proofErr w:type="spellEnd"/>
           </w:p>
         </w:tc>
         <w:tc>
@@ -3978,9 +4170,11 @@
             <w:pPr>
               <w:cnfStyle w:val="000000100000" w:firstRow="0" w:lastRow="0" w:firstColumn="0" w:lastColumn="0" w:oddVBand="0" w:evenVBand="0" w:oddHBand="1" w:evenHBand="0" w:firstRowFirstColumn="0" w:firstRowLastColumn="0" w:lastRowFirstColumn="0" w:lastRowLastColumn="0"/>
             </w:pPr>
+            <w:proofErr w:type="spellStart"/>
             <w:r>
               <w:t>nullable</w:t>
             </w:r>
+            <w:proofErr w:type="spellEnd"/>
           </w:p>
         </w:tc>
         <w:tc>
@@ -4069,9 +4263,11 @@
             <w:shd w:val="clear" w:color="auto" w:fill="7030A0"/>
           </w:tcPr>
           <w:p>
+            <w:proofErr w:type="spellStart"/>
             <w:r>
               <w:t>ev_id</w:t>
             </w:r>
+            <w:proofErr w:type="spellEnd"/>
           </w:p>
         </w:tc>
         <w:tc>
@@ -4128,9 +4324,11 @@
             <w:shd w:val="clear" w:color="auto" w:fill="7030A0"/>
           </w:tcPr>
           <w:p>
+            <w:proofErr w:type="spellStart"/>
             <w:r>
               <w:t>helyes_valaszok</w:t>
             </w:r>
+            <w:proofErr w:type="spellEnd"/>
           </w:p>
         </w:tc>
         <w:tc>
@@ -4156,9 +4354,11 @@
             <w:pPr>
               <w:cnfStyle w:val="000000000000" w:firstRow="0" w:lastRow="0" w:firstColumn="0" w:lastColumn="0" w:oddVBand="0" w:evenVBand="0" w:oddHBand="0" w:evenHBand="0" w:firstRowFirstColumn="0" w:firstRowLastColumn="0" w:lastRowFirstColumn="0" w:lastRowLastColumn="0"/>
             </w:pPr>
+            <w:proofErr w:type="spellStart"/>
             <w:r>
               <w:t>nullable</w:t>
             </w:r>
+            <w:proofErr w:type="spellEnd"/>
           </w:p>
         </w:tc>
         <w:tc>
@@ -4188,9 +4388,11 @@
             <w:shd w:val="clear" w:color="auto" w:fill="7030A0"/>
           </w:tcPr>
           <w:p>
+            <w:proofErr w:type="spellStart"/>
             <w:r>
               <w:t>tipus_id</w:t>
             </w:r>
+            <w:proofErr w:type="spellEnd"/>
           </w:p>
         </w:tc>
         <w:tc>
@@ -4395,9 +4597,11 @@
               <w:jc w:val="center"/>
               <w:cnfStyle w:val="100000000000" w:firstRow="1" w:lastRow="0" w:firstColumn="0" w:lastColumn="0" w:oddVBand="0" w:evenVBand="0" w:oddHBand="0" w:evenHBand="0" w:firstRowFirstColumn="0" w:firstRowLastColumn="0" w:lastRowFirstColumn="0" w:lastRowLastColumn="0"/>
             </w:pPr>
+            <w:proofErr w:type="spellStart"/>
             <w:r>
               <w:t>Nullable</w:t>
             </w:r>
+            <w:proofErr w:type="spellEnd"/>
           </w:p>
         </w:tc>
         <w:tc>
@@ -4411,9 +4615,11 @@
               <w:jc w:val="center"/>
               <w:cnfStyle w:val="100000000000" w:firstRow="1" w:lastRow="0" w:firstColumn="0" w:lastColumn="0" w:oddVBand="0" w:evenVBand="0" w:oddHBand="0" w:evenHBand="0" w:firstRowFirstColumn="0" w:firstRowLastColumn="0" w:lastRowFirstColumn="0" w:lastRowLastColumn="0"/>
             </w:pPr>
+            <w:proofErr w:type="spellStart"/>
             <w:r>
               <w:t>Unique</w:t>
             </w:r>
+            <w:proofErr w:type="spellEnd"/>
           </w:p>
         </w:tc>
       </w:tr>
@@ -4429,9 +4635,11 @@
             <w:shd w:val="clear" w:color="auto" w:fill="7030A0"/>
           </w:tcPr>
           <w:p>
+            <w:proofErr w:type="spellStart"/>
             <w:r>
               <w:t>id</w:t>
             </w:r>
+            <w:proofErr w:type="spellEnd"/>
           </w:p>
         </w:tc>
         <w:tc>
@@ -4488,9 +4696,11 @@
             <w:shd w:val="clear" w:color="auto" w:fill="7030A0"/>
           </w:tcPr>
           <w:p>
+            <w:proofErr w:type="spellStart"/>
             <w:r>
               <w:t>feladat_id</w:t>
             </w:r>
+            <w:proofErr w:type="spellEnd"/>
           </w:p>
         </w:tc>
         <w:tc>
@@ -4548,9 +4758,11 @@
             <w:shd w:val="clear" w:color="auto" w:fill="7030A0"/>
           </w:tcPr>
           <w:p>
+            <w:proofErr w:type="spellStart"/>
             <w:r>
               <w:t>oszlop_sorszam</w:t>
             </w:r>
+            <w:proofErr w:type="spellEnd"/>
           </w:p>
         </w:tc>
         <w:tc>
@@ -4607,9 +4819,11 @@
             <w:shd w:val="clear" w:color="auto" w:fill="7030A0"/>
           </w:tcPr>
           <w:p>
+            <w:proofErr w:type="spellStart"/>
             <w:r>
               <w:t>oszlop_nev</w:t>
             </w:r>
+            <w:proofErr w:type="spellEnd"/>
           </w:p>
         </w:tc>
         <w:tc>
@@ -4779,9 +4993,11 @@
               <w:jc w:val="center"/>
               <w:cnfStyle w:val="100000000000" w:firstRow="1" w:lastRow="0" w:firstColumn="0" w:lastColumn="0" w:oddVBand="0" w:evenVBand="0" w:oddHBand="0" w:evenHBand="0" w:firstRowFirstColumn="0" w:firstRowLastColumn="0" w:lastRowFirstColumn="0" w:lastRowLastColumn="0"/>
             </w:pPr>
+            <w:proofErr w:type="spellStart"/>
             <w:r>
               <w:t>Nullable</w:t>
             </w:r>
+            <w:proofErr w:type="spellEnd"/>
           </w:p>
         </w:tc>
         <w:tc>
@@ -4795,9 +5011,11 @@
               <w:jc w:val="center"/>
               <w:cnfStyle w:val="100000000000" w:firstRow="1" w:lastRow="0" w:firstColumn="0" w:lastColumn="0" w:oddVBand="0" w:evenVBand="0" w:oddHBand="0" w:evenHBand="0" w:firstRowFirstColumn="0" w:firstRowLastColumn="0" w:lastRowFirstColumn="0" w:lastRowLastColumn="0"/>
             </w:pPr>
+            <w:proofErr w:type="spellStart"/>
             <w:r>
               <w:t>Unique</w:t>
             </w:r>
+            <w:proofErr w:type="spellEnd"/>
           </w:p>
         </w:tc>
       </w:tr>
@@ -4813,9 +5031,11 @@
             <w:shd w:val="clear" w:color="auto" w:fill="7030A0"/>
           </w:tcPr>
           <w:p>
+            <w:proofErr w:type="spellStart"/>
             <w:r>
               <w:t>id</w:t>
             </w:r>
+            <w:proofErr w:type="spellEnd"/>
           </w:p>
         </w:tc>
         <w:tc>
@@ -4872,9 +5092,11 @@
             <w:shd w:val="clear" w:color="auto" w:fill="7030A0"/>
           </w:tcPr>
           <w:p>
+            <w:proofErr w:type="spellStart"/>
             <w:r>
               <w:t>feladat_id</w:t>
             </w:r>
+            <w:proofErr w:type="spellEnd"/>
           </w:p>
         </w:tc>
         <w:tc>
@@ -4932,9 +5154,11 @@
             <w:shd w:val="clear" w:color="auto" w:fill="7030A0"/>
           </w:tcPr>
           <w:p>
+            <w:proofErr w:type="spellStart"/>
             <w:r>
               <w:t>sor_sorszam</w:t>
             </w:r>
+            <w:proofErr w:type="spellEnd"/>
           </w:p>
         </w:tc>
         <w:tc>
@@ -4991,9 +5215,11 @@
             <w:shd w:val="clear" w:color="auto" w:fill="7030A0"/>
           </w:tcPr>
           <w:p>
+            <w:proofErr w:type="spellStart"/>
             <w:r>
               <w:t>oszlop_sorszam</w:t>
             </w:r>
+            <w:proofErr w:type="spellEnd"/>
           </w:p>
         </w:tc>
         <w:tc>
@@ -5051,9 +5277,11 @@
             <w:shd w:val="clear" w:color="auto" w:fill="7030A0"/>
           </w:tcPr>
           <w:p>
+            <w:proofErr w:type="spellStart"/>
             <w:r>
               <w:t>ertek</w:t>
             </w:r>
+            <w:proofErr w:type="spellEnd"/>
           </w:p>
         </w:tc>
         <w:tc>
@@ -5079,9 +5307,11 @@
             <w:pPr>
               <w:cnfStyle w:val="000000100000" w:firstRow="0" w:lastRow="0" w:firstColumn="0" w:lastColumn="0" w:oddVBand="0" w:evenVBand="0" w:oddHBand="1" w:evenHBand="0" w:firstRowFirstColumn="0" w:firstRowLastColumn="0" w:lastRowFirstColumn="0" w:lastRowLastColumn="0"/>
             </w:pPr>
+            <w:proofErr w:type="spellStart"/>
             <w:r>
               <w:t>nullable</w:t>
             </w:r>
+            <w:proofErr w:type="spellEnd"/>
           </w:p>
         </w:tc>
         <w:tc>
@@ -5110,9 +5340,11 @@
             <w:shd w:val="clear" w:color="auto" w:fill="7030A0"/>
           </w:tcPr>
           <w:p>
+            <w:proofErr w:type="spellStart"/>
             <w:r>
               <w:t>lathato</w:t>
             </w:r>
+            <w:proofErr w:type="spellEnd"/>
           </w:p>
         </w:tc>
         <w:tc>
@@ -5124,9 +5356,11 @@
             <w:pPr>
               <w:cnfStyle w:val="000000000000" w:firstRow="0" w:lastRow="0" w:firstColumn="0" w:lastColumn="0" w:oddVBand="0" w:evenVBand="0" w:oddHBand="0" w:evenHBand="0" w:firstRowFirstColumn="0" w:firstRowLastColumn="0" w:lastRowFirstColumn="0" w:lastRowLastColumn="0"/>
             </w:pPr>
+            <w:proofErr w:type="spellStart"/>
             <w:r>
               <w:t>bool</w:t>
             </w:r>
+            <w:proofErr w:type="spellEnd"/>
           </w:p>
         </w:tc>
         <w:tc>
@@ -5298,9 +5532,11 @@
               <w:jc w:val="center"/>
               <w:cnfStyle w:val="100000000000" w:firstRow="1" w:lastRow="0" w:firstColumn="0" w:lastColumn="0" w:oddVBand="0" w:evenVBand="0" w:oddHBand="0" w:evenHBand="0" w:firstRowFirstColumn="0" w:firstRowLastColumn="0" w:lastRowFirstColumn="0" w:lastRowLastColumn="0"/>
             </w:pPr>
+            <w:proofErr w:type="spellStart"/>
             <w:r>
               <w:t>Nullable</w:t>
             </w:r>
+            <w:proofErr w:type="spellEnd"/>
           </w:p>
         </w:tc>
         <w:tc>
@@ -5314,9 +5550,11 @@
               <w:jc w:val="center"/>
               <w:cnfStyle w:val="100000000000" w:firstRow="1" w:lastRow="0" w:firstColumn="0" w:lastColumn="0" w:oddVBand="0" w:evenVBand="0" w:oddHBand="0" w:evenHBand="0" w:firstRowFirstColumn="0" w:firstRowLastColumn="0" w:lastRowFirstColumn="0" w:lastRowLastColumn="0"/>
             </w:pPr>
+            <w:proofErr w:type="spellStart"/>
             <w:r>
               <w:t>Unique</w:t>
             </w:r>
+            <w:proofErr w:type="spellEnd"/>
           </w:p>
         </w:tc>
       </w:tr>
@@ -5332,9 +5570,11 @@
             <w:shd w:val="clear" w:color="auto" w:fill="7030A0"/>
           </w:tcPr>
           <w:p>
+            <w:proofErr w:type="spellStart"/>
             <w:r>
               <w:t>id</w:t>
             </w:r>
+            <w:proofErr w:type="spellEnd"/>
           </w:p>
         </w:tc>
         <w:tc>
@@ -5391,9 +5631,11 @@
             <w:shd w:val="clear" w:color="auto" w:fill="7030A0"/>
           </w:tcPr>
           <w:p>
+            <w:proofErr w:type="spellStart"/>
             <w:r>
               <w:t>felhasznalo_id</w:t>
             </w:r>
+            <w:proofErr w:type="spellEnd"/>
           </w:p>
         </w:tc>
         <w:tc>
@@ -5405,9 +5647,11 @@
             <w:pPr>
               <w:cnfStyle w:val="000000000000" w:firstRow="0" w:lastRow="0" w:firstColumn="0" w:lastColumn="0" w:oddVBand="0" w:evenVBand="0" w:oddHBand="0" w:evenHBand="0" w:firstRowFirstColumn="0" w:firstRowLastColumn="0" w:lastRowFirstColumn="0" w:lastRowLastColumn="0"/>
             </w:pPr>
+            <w:proofErr w:type="spellStart"/>
             <w:r>
               <w:t>uuid</w:t>
             </w:r>
+            <w:proofErr w:type="spellEnd"/>
           </w:p>
         </w:tc>
         <w:tc>
@@ -5451,9 +5695,11 @@
             <w:shd w:val="clear" w:color="auto" w:fill="7030A0"/>
           </w:tcPr>
           <w:p>
+            <w:proofErr w:type="spellStart"/>
             <w:r>
               <w:t>tantargy_id</w:t>
             </w:r>
+            <w:proofErr w:type="spellEnd"/>
           </w:p>
         </w:tc>
         <w:tc>
@@ -5510,9 +5756,11 @@
             <w:shd w:val="clear" w:color="auto" w:fill="7030A0"/>
           </w:tcPr>
           <w:p>
+            <w:proofErr w:type="spellStart"/>
             <w:r>
               <w:t>nev</w:t>
             </w:r>
+            <w:proofErr w:type="spellEnd"/>
           </w:p>
         </w:tc>
         <w:tc>
@@ -5524,9 +5772,11 @@
             <w:pPr>
               <w:cnfStyle w:val="000000000000" w:firstRow="0" w:lastRow="0" w:firstColumn="0" w:lastColumn="0" w:oddVBand="0" w:evenVBand="0" w:oddHBand="0" w:evenHBand="0" w:firstRowFirstColumn="0" w:firstRowLastColumn="0" w:lastRowFirstColumn="0" w:lastRowLastColumn="0"/>
             </w:pPr>
+            <w:proofErr w:type="spellStart"/>
             <w:r>
               <w:t>varchar</w:t>
             </w:r>
+            <w:proofErr w:type="spellEnd"/>
           </w:p>
         </w:tc>
         <w:tc>
@@ -5570,9 +5820,11 @@
             <w:shd w:val="clear" w:color="auto" w:fill="7030A0"/>
           </w:tcPr>
           <w:p>
+            <w:proofErr w:type="spellStart"/>
             <w:r>
               <w:t>datum</w:t>
             </w:r>
+            <w:proofErr w:type="spellEnd"/>
           </w:p>
         </w:tc>
         <w:tc>
@@ -5584,9 +5836,11 @@
             <w:pPr>
               <w:cnfStyle w:val="000000100000" w:firstRow="0" w:lastRow="0" w:firstColumn="0" w:lastColumn="0" w:oddVBand="0" w:evenVBand="0" w:oddHBand="1" w:evenHBand="0" w:firstRowFirstColumn="0" w:firstRowLastColumn="0" w:lastRowFirstColumn="0" w:lastRowLastColumn="0"/>
             </w:pPr>
+            <w:proofErr w:type="spellStart"/>
             <w:r>
               <w:t>timestamp</w:t>
             </w:r>
+            <w:proofErr w:type="spellEnd"/>
           </w:p>
         </w:tc>
         <w:tc>
@@ -5629,9 +5883,11 @@
             <w:shd w:val="clear" w:color="auto" w:fill="7030A0"/>
           </w:tcPr>
           <w:p>
+            <w:proofErr w:type="spellStart"/>
             <w:r>
               <w:t>kitoltesi_ido</w:t>
             </w:r>
+            <w:proofErr w:type="spellEnd"/>
           </w:p>
         </w:tc>
         <w:tc>
@@ -5657,9 +5913,11 @@
             <w:pPr>
               <w:cnfStyle w:val="000000000000" w:firstRow="0" w:lastRow="0" w:firstColumn="0" w:lastColumn="0" w:oddVBand="0" w:evenVBand="0" w:oddHBand="0" w:evenHBand="0" w:firstRowFirstColumn="0" w:firstRowLastColumn="0" w:lastRowFirstColumn="0" w:lastRowLastColumn="0"/>
             </w:pPr>
+            <w:proofErr w:type="spellStart"/>
             <w:r>
               <w:t>nullable</w:t>
             </w:r>
+            <w:proofErr w:type="spellEnd"/>
           </w:p>
         </w:tc>
         <w:tc>
@@ -5689,9 +5947,11 @@
             <w:shd w:val="clear" w:color="auto" w:fill="7030A0"/>
           </w:tcPr>
           <w:p>
+            <w:proofErr w:type="spellStart"/>
             <w:r>
               <w:t>statusz</w:t>
             </w:r>
+            <w:proofErr w:type="spellEnd"/>
           </w:p>
         </w:tc>
         <w:tc>
@@ -5874,9 +6134,11 @@
               <w:jc w:val="center"/>
               <w:cnfStyle w:val="100000000000" w:firstRow="1" w:lastRow="0" w:firstColumn="0" w:lastColumn="0" w:oddVBand="0" w:evenVBand="0" w:oddHBand="0" w:evenHBand="0" w:firstRowFirstColumn="0" w:firstRowLastColumn="0" w:lastRowFirstColumn="0" w:lastRowLastColumn="0"/>
             </w:pPr>
+            <w:proofErr w:type="spellStart"/>
             <w:r>
               <w:t>Nullable</w:t>
             </w:r>
+            <w:proofErr w:type="spellEnd"/>
           </w:p>
         </w:tc>
         <w:tc>
@@ -5890,9 +6152,11 @@
               <w:jc w:val="center"/>
               <w:cnfStyle w:val="100000000000" w:firstRow="1" w:lastRow="0" w:firstColumn="0" w:lastColumn="0" w:oddVBand="0" w:evenVBand="0" w:oddHBand="0" w:evenHBand="0" w:firstRowFirstColumn="0" w:firstRowLastColumn="0" w:lastRowFirstColumn="0" w:lastRowLastColumn="0"/>
             </w:pPr>
+            <w:proofErr w:type="spellStart"/>
             <w:r>
               <w:t>Unique</w:t>
             </w:r>
+            <w:proofErr w:type="spellEnd"/>
           </w:p>
         </w:tc>
       </w:tr>
@@ -5908,9 +6172,11 @@
             <w:shd w:val="clear" w:color="auto" w:fill="7030A0"/>
           </w:tcPr>
           <w:p>
+            <w:proofErr w:type="spellStart"/>
             <w:r>
               <w:t>id</w:t>
             </w:r>
+            <w:proofErr w:type="spellEnd"/>
           </w:p>
         </w:tc>
         <w:tc>
@@ -5951,7 +6217,15 @@
               <w:cnfStyle w:val="000000100000" w:firstRow="0" w:lastRow="0" w:firstColumn="0" w:lastColumn="0" w:oddVBand="0" w:evenVBand="0" w:oddHBand="1" w:evenHBand="0" w:firstRowFirstColumn="0" w:firstRowLastColumn="0" w:lastRowFirstColumn="0" w:lastRowLastColumn="0"/>
             </w:pPr>
             <w:r>
-              <w:t>PK (identity)</w:t>
+              <w:t>PK (</w:t>
+            </w:r>
+            <w:proofErr w:type="spellStart"/>
+            <w:r>
+              <w:t>identity</w:t>
+            </w:r>
+            <w:proofErr w:type="spellEnd"/>
+            <w:r>
+              <w:t>)</w:t>
             </w:r>
           </w:p>
         </w:tc>
@@ -5967,9 +6241,11 @@
             <w:shd w:val="clear" w:color="auto" w:fill="7030A0"/>
           </w:tcPr>
           <w:p>
+            <w:proofErr w:type="spellStart"/>
             <w:r>
               <w:t>teszt_id</w:t>
             </w:r>
+            <w:proofErr w:type="spellEnd"/>
           </w:p>
         </w:tc>
         <w:tc>
@@ -6027,9 +6303,11 @@
             <w:shd w:val="clear" w:color="auto" w:fill="7030A0"/>
           </w:tcPr>
           <w:p>
+            <w:proofErr w:type="spellStart"/>
             <w:r>
               <w:t>feladat_id</w:t>
             </w:r>
+            <w:proofErr w:type="spellEnd"/>
           </w:p>
         </w:tc>
         <w:tc>
@@ -6086,9 +6364,11 @@
             <w:shd w:val="clear" w:color="auto" w:fill="7030A0"/>
           </w:tcPr>
           <w:p>
+            <w:proofErr w:type="spellStart"/>
             <w:r>
               <w:t>adott_valasz</w:t>
             </w:r>
+            <w:proofErr w:type="spellEnd"/>
           </w:p>
         </w:tc>
         <w:tc>
@@ -6114,9 +6394,11 @@
             <w:pPr>
               <w:cnfStyle w:val="000000000000" w:firstRow="0" w:lastRow="0" w:firstColumn="0" w:lastColumn="0" w:oddVBand="0" w:evenVBand="0" w:oddHBand="0" w:evenHBand="0" w:firstRowFirstColumn="0" w:firstRowLastColumn="0" w:lastRowFirstColumn="0" w:lastRowLastColumn="0"/>
             </w:pPr>
+            <w:proofErr w:type="spellStart"/>
             <w:r>
               <w:t>nullable</w:t>
             </w:r>
+            <w:proofErr w:type="spellEnd"/>
           </w:p>
         </w:tc>
         <w:tc>
@@ -6146,9 +6428,11 @@
             <w:shd w:val="clear" w:color="auto" w:fill="7030A0"/>
           </w:tcPr>
           <w:p>
+            <w:proofErr w:type="spellStart"/>
             <w:r>
               <w:t>elert_pont</w:t>
             </w:r>
+            <w:proofErr w:type="spellEnd"/>
           </w:p>
         </w:tc>
         <w:tc>
@@ -6160,9 +6444,11 @@
             <w:pPr>
               <w:cnfStyle w:val="000000100000" w:firstRow="0" w:lastRow="0" w:firstColumn="0" w:lastColumn="0" w:oddVBand="0" w:evenVBand="0" w:oddHBand="1" w:evenHBand="0" w:firstRowFirstColumn="0" w:firstRowLastColumn="0" w:lastRowFirstColumn="0" w:lastRowLastColumn="0"/>
             </w:pPr>
+            <w:proofErr w:type="spellStart"/>
             <w:r>
               <w:t>numeric</w:t>
             </w:r>
+            <w:proofErr w:type="spellEnd"/>
           </w:p>
         </w:tc>
         <w:tc>
@@ -6174,9 +6460,11 @@
             <w:pPr>
               <w:cnfStyle w:val="000000100000" w:firstRow="0" w:lastRow="0" w:firstColumn="0" w:lastColumn="0" w:oddVBand="0" w:evenVBand="0" w:oddHBand="1" w:evenHBand="0" w:firstRowFirstColumn="0" w:firstRowLastColumn="0" w:lastRowFirstColumn="0" w:lastRowLastColumn="0"/>
             </w:pPr>
+            <w:proofErr w:type="spellStart"/>
             <w:r>
               <w:t>nullable</w:t>
             </w:r>
+            <w:proofErr w:type="spellEnd"/>
           </w:p>
         </w:tc>
         <w:tc>
@@ -7377,18 +7665,27 @@
       </w:pPr>
       <w:bookmarkStart w:id="14" w:name="_Toc241834373"/>
       <w:r>
+        <w:rPr>
+          <w:color w:val="3A1953"/>
+        </w:rPr>
         <w:lastRenderedPageBreak/>
+        <w:t>ER diagram</w:t>
+      </w:r>
+      <w:bookmarkEnd w:id="14"/>
+    </w:p>
+    <w:p>
+      <w:r>
         <w:drawing>
-          <wp:anchor distT="0" distB="0" distL="114300" distR="114300" simplePos="0" relativeHeight="251660288" behindDoc="0" locked="0" layoutInCell="1" allowOverlap="1" wp14:anchorId="6A534E16" wp14:editId="7491A393">
+          <wp:anchor distT="0" distB="0" distL="114300" distR="114300" simplePos="0" relativeHeight="251660288" behindDoc="0" locked="0" layoutInCell="1" allowOverlap="1" wp14:anchorId="7E5CC29D" wp14:editId="4F575693">
             <wp:simplePos x="0" y="0"/>
             <wp:positionH relativeFrom="column">
-              <wp:posOffset>52705</wp:posOffset>
+              <wp:posOffset>-4445</wp:posOffset>
             </wp:positionH>
             <wp:positionV relativeFrom="paragraph">
-              <wp:posOffset>431800</wp:posOffset>
+              <wp:posOffset>-4445</wp:posOffset>
             </wp:positionV>
-            <wp:extent cx="5703570" cy="4752975"/>
-            <wp:effectExtent l="0" t="0" r="0" b="9525"/>
+            <wp:extent cx="5760720" cy="4744085"/>
+            <wp:effectExtent l="0" t="0" r="0" b="0"/>
             <wp:wrapTopAndBottom/>
             <wp:docPr id="1" name="Kép 1"/>
             <wp:cNvGraphicFramePr>
@@ -7401,7 +7698,7 @@
                     <pic:cNvPr id="1" name=""/>
                     <pic:cNvPicPr/>
                   </pic:nvPicPr>
-                  <pic:blipFill rotWithShape="1">
+                  <pic:blipFill>
                     <a:blip r:embed="rId9">
                       <a:extLst>
                         <a:ext uri="{28A0092B-C50C-407E-A947-70E740481C1C}">
@@ -7409,47 +7706,26 @@
                         </a:ext>
                       </a:extLst>
                     </a:blip>
-                    <a:srcRect l="992" b="253"/>
-                    <a:stretch/>
+                    <a:stretch>
+                      <a:fillRect/>
+                    </a:stretch>
                   </pic:blipFill>
-                  <pic:spPr bwMode="auto">
+                  <pic:spPr>
                     <a:xfrm>
                       <a:off x="0" y="0"/>
-                      <a:ext cx="5703570" cy="4752975"/>
+                      <a:ext cx="5760720" cy="4744085"/>
                     </a:xfrm>
                     <a:prstGeom prst="rect">
                       <a:avLst/>
                     </a:prstGeom>
-                    <a:ln>
-                      <a:noFill/>
-                    </a:ln>
-                    <a:extLst>
-                      <a:ext uri="{53640926-AAD7-44D8-BBD7-CCE9431645EC}">
-                        <a14:shadowObscured xmlns:a14="http://schemas.microsoft.com/office/drawing/2010/main"/>
-                      </a:ext>
-                    </a:extLst>
                   </pic:spPr>
                 </pic:pic>
               </a:graphicData>
             </a:graphic>
-            <wp14:sizeRelH relativeFrom="margin">
-              <wp14:pctWidth>0</wp14:pctWidth>
-            </wp14:sizeRelH>
-            <wp14:sizeRelV relativeFrom="margin">
-              <wp14:pctHeight>0</wp14:pctHeight>
-            </wp14:sizeRelV>
           </wp:anchor>
         </w:drawing>
       </w:r>
-      <w:r>
-        <w:rPr>
-          <w:color w:val="3A1953"/>
-        </w:rPr>
-        <w:t>ER diagram</w:t>
-      </w:r>
-      <w:bookmarkEnd w:id="14"/>
     </w:p>
-    <w:p/>
     <w:sectPr>
       <w:headerReference w:type="default" r:id="rId10"/>
       <w:footerReference w:type="default" r:id="rId11"/>
@@ -7464,7 +7740,7 @@
 </file>
 
 <file path=word/endnotes.xml><?xml version="1.0" encoding="utf-8"?>
-<w:endnotes xmlns:wpc="http://schemas.microsoft.com/office/word/2010/wordprocessingCanvas" xmlns:cx="http://schemas.microsoft.com/office/drawing/2014/chartex" xmlns:cx1="http://schemas.microsoft.com/office/drawing/2015/9/8/chartex" xmlns:cx2="http://schemas.microsoft.com/office/drawing/2015/10/21/chartex" xmlns:cx3="http://schemas.microsoft.com/office/drawing/2016/5/9/chartex" xmlns:cx4="http://schemas.microsoft.com/office/drawing/2016/5/10/chartex" xmlns:cx5="http://schemas.microsoft.com/office/drawing/2016/5/11/chartex" xmlns:cx6="http://schemas.microsoft.com/office/drawing/2016/5/12/chartex" xmlns:cx7="http://schemas.microsoft.com/office/drawing/2016/5/13/chartex" xmlns:cx8="http://schemas.microsoft.com/office/drawing/2016/5/14/chartex" xmlns:mc="http://schemas.openxmlformats.org/markup-compatibility/2006" xmlns:aink="http://schemas.microsoft.com/office/drawing/2016/ink" xmlns:am3d="http://schemas.microsoft.com/office/drawing/2017/model3d" xmlns:o="urn:schemas-microsoft-com:office:office" xmlns:oel="http://schemas.microsoft.com/office/2019/extlst" xmlns:r="http://schemas.openxmlformats.org/officeDocument/2006/relationships" xmlns:m="http://schemas.openxmlformats.org/officeDocument/2006/math" xmlns:v="urn:schemas-microsoft-com:vml" xmlns:wp14="http://schemas.microsoft.com/office/word/2010/wordprocessingDrawing" xmlns:wp="http://schemas.openxmlformats.org/drawingml/2006/wordprocessingDrawing" xmlns:w10="urn:schemas-microsoft-com:office:word" xmlns:w="http://schemas.openxmlformats.org/wordprocessingml/2006/main" xmlns:w14="http://schemas.microsoft.com/office/word/2010/wordml" xmlns:w15="http://schemas.microsoft.com/office/word/2012/wordml" xmlns:w16cex="http://schemas.microsoft.com/office/word/2018/wordml/cex" xmlns:w16cid="http://schemas.microsoft.com/office/word/2016/wordml/cid" xmlns:w16="http://schemas.microsoft.com/office/word/2018/wordml" xmlns:w16du="http://schemas.microsoft.com/office/word/2023/wordml/word16du" xmlns:w16sdtdh="http://schemas.microsoft.com/office/word/2020/wordml/sdtdatahash" xmlns:w16sdtfl="http://schemas.microsoft.com/office/word/2024/wordml/sdtformatlock" xmlns:w16se="http://schemas.microsoft.com/office/word/2015/wordml/symex" xmlns:wpg="http://schemas.microsoft.com/office/word/2010/wordprocessingGroup" xmlns:wpi="http://schemas.microsoft.com/office/word/2010/wordprocessingInk" xmlns:wne="http://schemas.microsoft.com/office/word/2006/wordml" xmlns:wps="http://schemas.microsoft.com/office/word/2010/wordprocessingShape" mc:Ignorable="w14 w15 w16se w16cid w16 w16cex w16sdtdh w16sdtfl w16du wp14">
+<w:endnotes xmlns:wpc="http://schemas.microsoft.com/office/word/2010/wordprocessingCanvas" xmlns:cx="http://schemas.microsoft.com/office/drawing/2014/chartex" xmlns:cx1="http://schemas.microsoft.com/office/drawing/2015/9/8/chartex" xmlns:cx2="http://schemas.microsoft.com/office/drawing/2015/10/21/chartex" xmlns:cx3="http://schemas.microsoft.com/office/drawing/2016/5/9/chartex" xmlns:cx4="http://schemas.microsoft.com/office/drawing/2016/5/10/chartex" xmlns:cx5="http://schemas.microsoft.com/office/drawing/2016/5/11/chartex" xmlns:cx6="http://schemas.microsoft.com/office/drawing/2016/5/12/chartex" xmlns:cx7="http://schemas.microsoft.com/office/drawing/2016/5/13/chartex" xmlns:cx8="http://schemas.microsoft.com/office/drawing/2016/5/14/chartex" xmlns:mc="http://schemas.openxmlformats.org/markup-compatibility/2006" xmlns:aink="http://schemas.microsoft.com/office/drawing/2016/ink" xmlns:am3d="http://schemas.microsoft.com/office/drawing/2017/model3d" xmlns:o="urn:schemas-microsoft-com:office:office" xmlns:r="http://schemas.openxmlformats.org/officeDocument/2006/relationships" xmlns:m="http://schemas.openxmlformats.org/officeDocument/2006/math" xmlns:v="urn:schemas-microsoft-com:vml" xmlns:wp14="http://schemas.microsoft.com/office/word/2010/wordprocessingDrawing" xmlns:wp="http://schemas.openxmlformats.org/drawingml/2006/wordprocessingDrawing" xmlns:w10="urn:schemas-microsoft-com:office:word" xmlns:w="http://schemas.openxmlformats.org/wordprocessingml/2006/main" xmlns:w14="http://schemas.microsoft.com/office/word/2010/wordml" xmlns:w15="http://schemas.microsoft.com/office/word/2012/wordml" xmlns:w16cex="http://schemas.microsoft.com/office/word/2018/wordml/cex" xmlns:w16cid="http://schemas.microsoft.com/office/word/2016/wordml/cid" xmlns:w16="http://schemas.microsoft.com/office/word/2018/wordml" xmlns:w16sdtdh="http://schemas.microsoft.com/office/word/2020/wordml/sdtdatahash" xmlns:w16se="http://schemas.microsoft.com/office/word/2015/wordml/symex" xmlns:wpg="http://schemas.microsoft.com/office/word/2010/wordprocessingGroup" xmlns:wpi="http://schemas.microsoft.com/office/word/2010/wordprocessingInk" xmlns:wne="http://schemas.microsoft.com/office/word/2006/wordml" xmlns:wps="http://schemas.microsoft.com/office/word/2010/wordprocessingShape" mc:Ignorable="w14 w15 w16se w16cid w16 w16cex w16sdtdh wp14">
   <w:endnote w:type="separator" w:id="-1">
     <w:p>
       <w:pPr>
@@ -7489,7 +7765,7 @@
 </file>
 
 <file path=word/footer1.xml><?xml version="1.0" encoding="utf-8"?>
-<w:ftr xmlns:wpc="http://schemas.microsoft.com/office/word/2010/wordprocessingCanvas" xmlns:cx="http://schemas.microsoft.com/office/drawing/2014/chartex" xmlns:cx1="http://schemas.microsoft.com/office/drawing/2015/9/8/chartex" xmlns:cx2="http://schemas.microsoft.com/office/drawing/2015/10/21/chartex" xmlns:cx3="http://schemas.microsoft.com/office/drawing/2016/5/9/chartex" xmlns:cx4="http://schemas.microsoft.com/office/drawing/2016/5/10/chartex" xmlns:cx5="http://schemas.microsoft.com/office/drawing/2016/5/11/chartex" xmlns:cx6="http://schemas.microsoft.com/office/drawing/2016/5/12/chartex" xmlns:cx7="http://schemas.microsoft.com/office/drawing/2016/5/13/chartex" xmlns:cx8="http://schemas.microsoft.com/office/drawing/2016/5/14/chartex" xmlns:mc="http://schemas.openxmlformats.org/markup-compatibility/2006" xmlns:aink="http://schemas.microsoft.com/office/drawing/2016/ink" xmlns:am3d="http://schemas.microsoft.com/office/drawing/2017/model3d" xmlns:o="urn:schemas-microsoft-com:office:office" xmlns:oel="http://schemas.microsoft.com/office/2019/extlst" xmlns:r="http://schemas.openxmlformats.org/officeDocument/2006/relationships" xmlns:m="http://schemas.openxmlformats.org/officeDocument/2006/math" xmlns:v="urn:schemas-microsoft-com:vml" xmlns:wp14="http://schemas.microsoft.com/office/word/2010/wordprocessingDrawing" xmlns:wp="http://schemas.openxmlformats.org/drawingml/2006/wordprocessingDrawing" xmlns:w10="urn:schemas-microsoft-com:office:word" xmlns:w="http://schemas.openxmlformats.org/wordprocessingml/2006/main" xmlns:w14="http://schemas.microsoft.com/office/word/2010/wordml" xmlns:w15="http://schemas.microsoft.com/office/word/2012/wordml" xmlns:w16cex="http://schemas.microsoft.com/office/word/2018/wordml/cex" xmlns:w16cid="http://schemas.microsoft.com/office/word/2016/wordml/cid" xmlns:w16="http://schemas.microsoft.com/office/word/2018/wordml" xmlns:w16du="http://schemas.microsoft.com/office/word/2023/wordml/word16du" xmlns:w16sdtdh="http://schemas.microsoft.com/office/word/2020/wordml/sdtdatahash" xmlns:w16sdtfl="http://schemas.microsoft.com/office/word/2024/wordml/sdtformatlock" xmlns:w16se="http://schemas.microsoft.com/office/word/2015/wordml/symex" xmlns:wpg="http://schemas.microsoft.com/office/word/2010/wordprocessingGroup" xmlns:wpi="http://schemas.microsoft.com/office/word/2010/wordprocessingInk" xmlns:wne="http://schemas.microsoft.com/office/word/2006/wordml" xmlns:wps="http://schemas.microsoft.com/office/word/2010/wordprocessingShape" mc:Ignorable="w14 w15 w16se w16cid w16 w16cex w16sdtdh w16sdtfl w16du wp14">
+<w:ftr xmlns:wpc="http://schemas.microsoft.com/office/word/2010/wordprocessingCanvas" xmlns:cx="http://schemas.microsoft.com/office/drawing/2014/chartex" xmlns:cx1="http://schemas.microsoft.com/office/drawing/2015/9/8/chartex" xmlns:cx2="http://schemas.microsoft.com/office/drawing/2015/10/21/chartex" xmlns:cx3="http://schemas.microsoft.com/office/drawing/2016/5/9/chartex" xmlns:cx4="http://schemas.microsoft.com/office/drawing/2016/5/10/chartex" xmlns:cx5="http://schemas.microsoft.com/office/drawing/2016/5/11/chartex" xmlns:cx6="http://schemas.microsoft.com/office/drawing/2016/5/12/chartex" xmlns:cx7="http://schemas.microsoft.com/office/drawing/2016/5/13/chartex" xmlns:cx8="http://schemas.microsoft.com/office/drawing/2016/5/14/chartex" xmlns:mc="http://schemas.openxmlformats.org/markup-compatibility/2006" xmlns:aink="http://schemas.microsoft.com/office/drawing/2016/ink" xmlns:am3d="http://schemas.microsoft.com/office/drawing/2017/model3d" xmlns:o="urn:schemas-microsoft-com:office:office" xmlns:r="http://schemas.openxmlformats.org/officeDocument/2006/relationships" xmlns:m="http://schemas.openxmlformats.org/officeDocument/2006/math" xmlns:v="urn:schemas-microsoft-com:vml" xmlns:wp14="http://schemas.microsoft.com/office/word/2010/wordprocessingDrawing" xmlns:wp="http://schemas.openxmlformats.org/drawingml/2006/wordprocessingDrawing" xmlns:w10="urn:schemas-microsoft-com:office:word" xmlns:w="http://schemas.openxmlformats.org/wordprocessingml/2006/main" xmlns:w14="http://schemas.microsoft.com/office/word/2010/wordml" xmlns:w15="http://schemas.microsoft.com/office/word/2012/wordml" xmlns:w16cex="http://schemas.microsoft.com/office/word/2018/wordml/cex" xmlns:w16cid="http://schemas.microsoft.com/office/word/2016/wordml/cid" xmlns:w16="http://schemas.microsoft.com/office/word/2018/wordml" xmlns:w16sdtdh="http://schemas.microsoft.com/office/word/2020/wordml/sdtdatahash" xmlns:w16se="http://schemas.microsoft.com/office/word/2015/wordml/symex" xmlns:wpg="http://schemas.microsoft.com/office/word/2010/wordprocessingGroup" xmlns:wpi="http://schemas.microsoft.com/office/word/2010/wordprocessingInk" xmlns:wne="http://schemas.microsoft.com/office/word/2006/wordml" xmlns:wps="http://schemas.microsoft.com/office/word/2010/wordprocessingShape" mc:Ignorable="w14 w15 w16se w16cid w16 w16cex w16sdtdh wp14">
   <w:sdt>
     <w:sdtPr>
       <w:id w:val="1274057105"/>
@@ -7498,6 +7774,7 @@
         <w:docPartUnique/>
       </w:docPartObj>
     </w:sdtPr>
+    <w:sdtEndPr/>
     <w:sdtContent>
       <w:sdt>
         <w:sdtPr>
@@ -7507,6 +7784,7 @@
             <w:docPartUnique/>
           </w:docPartObj>
         </w:sdtPr>
+        <w:sdtEndPr/>
         <w:sdtContent>
           <w:p>
             <w:pPr>
@@ -7624,7 +7902,7 @@
 </file>
 
 <file path=word/footnotes.xml><?xml version="1.0" encoding="utf-8"?>
-<w:footnotes xmlns:wpc="http://schemas.microsoft.com/office/word/2010/wordprocessingCanvas" xmlns:cx="http://schemas.microsoft.com/office/drawing/2014/chartex" xmlns:cx1="http://schemas.microsoft.com/office/drawing/2015/9/8/chartex" xmlns:cx2="http://schemas.microsoft.com/office/drawing/2015/10/21/chartex" xmlns:cx3="http://schemas.microsoft.com/office/drawing/2016/5/9/chartex" xmlns:cx4="http://schemas.microsoft.com/office/drawing/2016/5/10/chartex" xmlns:cx5="http://schemas.microsoft.com/office/drawing/2016/5/11/chartex" xmlns:cx6="http://schemas.microsoft.com/office/drawing/2016/5/12/chartex" xmlns:cx7="http://schemas.microsoft.com/office/drawing/2016/5/13/chartex" xmlns:cx8="http://schemas.microsoft.com/office/drawing/2016/5/14/chartex" xmlns:mc="http://schemas.openxmlformats.org/markup-compatibility/2006" xmlns:aink="http://schemas.microsoft.com/office/drawing/2016/ink" xmlns:am3d="http://schemas.microsoft.com/office/drawing/2017/model3d" xmlns:o="urn:schemas-microsoft-com:office:office" xmlns:oel="http://schemas.microsoft.com/office/2019/extlst" xmlns:r="http://schemas.openxmlformats.org/officeDocument/2006/relationships" xmlns:m="http://schemas.openxmlformats.org/officeDocument/2006/math" xmlns:v="urn:schemas-microsoft-com:vml" xmlns:wp14="http://schemas.microsoft.com/office/word/2010/wordprocessingDrawing" xmlns:wp="http://schemas.openxmlformats.org/drawingml/2006/wordprocessingDrawing" xmlns:w10="urn:schemas-microsoft-com:office:word" xmlns:w="http://schemas.openxmlformats.org/wordprocessingml/2006/main" xmlns:w14="http://schemas.microsoft.com/office/word/2010/wordml" xmlns:w15="http://schemas.microsoft.com/office/word/2012/wordml" xmlns:w16cex="http://schemas.microsoft.com/office/word/2018/wordml/cex" xmlns:w16cid="http://schemas.microsoft.com/office/word/2016/wordml/cid" xmlns:w16="http://schemas.microsoft.com/office/word/2018/wordml" xmlns:w16du="http://schemas.microsoft.com/office/word/2023/wordml/word16du" xmlns:w16sdtdh="http://schemas.microsoft.com/office/word/2020/wordml/sdtdatahash" xmlns:w16sdtfl="http://schemas.microsoft.com/office/word/2024/wordml/sdtformatlock" xmlns:w16se="http://schemas.microsoft.com/office/word/2015/wordml/symex" xmlns:wpg="http://schemas.microsoft.com/office/word/2010/wordprocessingGroup" xmlns:wpi="http://schemas.microsoft.com/office/word/2010/wordprocessingInk" xmlns:wne="http://schemas.microsoft.com/office/word/2006/wordml" xmlns:wps="http://schemas.microsoft.com/office/word/2010/wordprocessingShape" mc:Ignorable="w14 w15 w16se w16cid w16 w16cex w16sdtdh w16sdtfl w16du wp14">
+<w:footnotes xmlns:wpc="http://schemas.microsoft.com/office/word/2010/wordprocessingCanvas" xmlns:cx="http://schemas.microsoft.com/office/drawing/2014/chartex" xmlns:cx1="http://schemas.microsoft.com/office/drawing/2015/9/8/chartex" xmlns:cx2="http://schemas.microsoft.com/office/drawing/2015/10/21/chartex" xmlns:cx3="http://schemas.microsoft.com/office/drawing/2016/5/9/chartex" xmlns:cx4="http://schemas.microsoft.com/office/drawing/2016/5/10/chartex" xmlns:cx5="http://schemas.microsoft.com/office/drawing/2016/5/11/chartex" xmlns:cx6="http://schemas.microsoft.com/office/drawing/2016/5/12/chartex" xmlns:cx7="http://schemas.microsoft.com/office/drawing/2016/5/13/chartex" xmlns:cx8="http://schemas.microsoft.com/office/drawing/2016/5/14/chartex" xmlns:mc="http://schemas.openxmlformats.org/markup-compatibility/2006" xmlns:aink="http://schemas.microsoft.com/office/drawing/2016/ink" xmlns:am3d="http://schemas.microsoft.com/office/drawing/2017/model3d" xmlns:o="urn:schemas-microsoft-com:office:office" xmlns:r="http://schemas.openxmlformats.org/officeDocument/2006/relationships" xmlns:m="http://schemas.openxmlformats.org/officeDocument/2006/math" xmlns:v="urn:schemas-microsoft-com:vml" xmlns:wp14="http://schemas.microsoft.com/office/word/2010/wordprocessingDrawing" xmlns:wp="http://schemas.openxmlformats.org/drawingml/2006/wordprocessingDrawing" xmlns:w10="urn:schemas-microsoft-com:office:word" xmlns:w="http://schemas.openxmlformats.org/wordprocessingml/2006/main" xmlns:w14="http://schemas.microsoft.com/office/word/2010/wordml" xmlns:w15="http://schemas.microsoft.com/office/word/2012/wordml" xmlns:w16cex="http://schemas.microsoft.com/office/word/2018/wordml/cex" xmlns:w16cid="http://schemas.microsoft.com/office/word/2016/wordml/cid" xmlns:w16="http://schemas.microsoft.com/office/word/2018/wordml" xmlns:w16sdtdh="http://schemas.microsoft.com/office/word/2020/wordml/sdtdatahash" xmlns:w16se="http://schemas.microsoft.com/office/word/2015/wordml/symex" xmlns:wpg="http://schemas.microsoft.com/office/word/2010/wordprocessingGroup" xmlns:wpi="http://schemas.microsoft.com/office/word/2010/wordprocessingInk" xmlns:wne="http://schemas.microsoft.com/office/word/2006/wordml" xmlns:wps="http://schemas.microsoft.com/office/word/2010/wordprocessingShape" mc:Ignorable="w14 w15 w16se w16cid w16 w16cex w16sdtdh wp14">
   <w:footnote w:type="separator" w:id="-1">
     <w:p>
       <w:pPr>
@@ -7649,7 +7927,7 @@
 </file>
 
 <file path=word/header1.xml><?xml version="1.0" encoding="utf-8"?>
-<w:hdr xmlns:wpc="http://schemas.microsoft.com/office/word/2010/wordprocessingCanvas" xmlns:cx="http://schemas.microsoft.com/office/drawing/2014/chartex" xmlns:cx1="http://schemas.microsoft.com/office/drawing/2015/9/8/chartex" xmlns:cx2="http://schemas.microsoft.com/office/drawing/2015/10/21/chartex" xmlns:cx3="http://schemas.microsoft.com/office/drawing/2016/5/9/chartex" xmlns:cx4="http://schemas.microsoft.com/office/drawing/2016/5/10/chartex" xmlns:cx5="http://schemas.microsoft.com/office/drawing/2016/5/11/chartex" xmlns:cx6="http://schemas.microsoft.com/office/drawing/2016/5/12/chartex" xmlns:cx7="http://schemas.microsoft.com/office/drawing/2016/5/13/chartex" xmlns:cx8="http://schemas.microsoft.com/office/drawing/2016/5/14/chartex" xmlns:mc="http://schemas.openxmlformats.org/markup-compatibility/2006" xmlns:aink="http://schemas.microsoft.com/office/drawing/2016/ink" xmlns:am3d="http://schemas.microsoft.com/office/drawing/2017/model3d" xmlns:o="urn:schemas-microsoft-com:office:office" xmlns:oel="http://schemas.microsoft.com/office/2019/extlst" xmlns:r="http://schemas.openxmlformats.org/officeDocument/2006/relationships" xmlns:m="http://schemas.openxmlformats.org/officeDocument/2006/math" xmlns:v="urn:schemas-microsoft-com:vml" xmlns:wp14="http://schemas.microsoft.com/office/word/2010/wordprocessingDrawing" xmlns:wp="http://schemas.openxmlformats.org/drawingml/2006/wordprocessingDrawing" xmlns:w10="urn:schemas-microsoft-com:office:word" xmlns:w="http://schemas.openxmlformats.org/wordprocessingml/2006/main" xmlns:w14="http://schemas.microsoft.com/office/word/2010/wordml" xmlns:w15="http://schemas.microsoft.com/office/word/2012/wordml" xmlns:w16cex="http://schemas.microsoft.com/office/word/2018/wordml/cex" xmlns:w16cid="http://schemas.microsoft.com/office/word/2016/wordml/cid" xmlns:w16="http://schemas.microsoft.com/office/word/2018/wordml" xmlns:w16du="http://schemas.microsoft.com/office/word/2023/wordml/word16du" xmlns:w16sdtdh="http://schemas.microsoft.com/office/word/2020/wordml/sdtdatahash" xmlns:w16sdtfl="http://schemas.microsoft.com/office/word/2024/wordml/sdtformatlock" xmlns:w16se="http://schemas.microsoft.com/office/word/2015/wordml/symex" xmlns:wpg="http://schemas.microsoft.com/office/word/2010/wordprocessingGroup" xmlns:wpi="http://schemas.microsoft.com/office/word/2010/wordprocessingInk" xmlns:wne="http://schemas.microsoft.com/office/word/2006/wordml" xmlns:wps="http://schemas.microsoft.com/office/word/2010/wordprocessingShape" mc:Ignorable="w14 w15 w16se w16cid w16 w16cex w16sdtdh w16sdtfl w16du wp14">
+<w:hdr xmlns:wpc="http://schemas.microsoft.com/office/word/2010/wordprocessingCanvas" xmlns:cx="http://schemas.microsoft.com/office/drawing/2014/chartex" xmlns:cx1="http://schemas.microsoft.com/office/drawing/2015/9/8/chartex" xmlns:cx2="http://schemas.microsoft.com/office/drawing/2015/10/21/chartex" xmlns:cx3="http://schemas.microsoft.com/office/drawing/2016/5/9/chartex" xmlns:cx4="http://schemas.microsoft.com/office/drawing/2016/5/10/chartex" xmlns:cx5="http://schemas.microsoft.com/office/drawing/2016/5/11/chartex" xmlns:cx6="http://schemas.microsoft.com/office/drawing/2016/5/12/chartex" xmlns:cx7="http://schemas.microsoft.com/office/drawing/2016/5/13/chartex" xmlns:cx8="http://schemas.microsoft.com/office/drawing/2016/5/14/chartex" xmlns:mc="http://schemas.openxmlformats.org/markup-compatibility/2006" xmlns:aink="http://schemas.microsoft.com/office/drawing/2016/ink" xmlns:am3d="http://schemas.microsoft.com/office/drawing/2017/model3d" xmlns:o="urn:schemas-microsoft-com:office:office" xmlns:r="http://schemas.openxmlformats.org/officeDocument/2006/relationships" xmlns:m="http://schemas.openxmlformats.org/officeDocument/2006/math" xmlns:v="urn:schemas-microsoft-com:vml" xmlns:wp14="http://schemas.microsoft.com/office/word/2010/wordprocessingDrawing" xmlns:wp="http://schemas.openxmlformats.org/drawingml/2006/wordprocessingDrawing" xmlns:w10="urn:schemas-microsoft-com:office:word" xmlns:w="http://schemas.openxmlformats.org/wordprocessingml/2006/main" xmlns:w14="http://schemas.microsoft.com/office/word/2010/wordml" xmlns:w15="http://schemas.microsoft.com/office/word/2012/wordml" xmlns:w16cex="http://schemas.microsoft.com/office/word/2018/wordml/cex" xmlns:w16cid="http://schemas.microsoft.com/office/word/2016/wordml/cid" xmlns:w16="http://schemas.microsoft.com/office/word/2018/wordml" xmlns:w16sdtdh="http://schemas.microsoft.com/office/word/2020/wordml/sdtdatahash" xmlns:w16se="http://schemas.microsoft.com/office/word/2015/wordml/symex" xmlns:wpg="http://schemas.microsoft.com/office/word/2010/wordprocessingGroup" xmlns:wpi="http://schemas.microsoft.com/office/word/2010/wordprocessingInk" xmlns:wne="http://schemas.microsoft.com/office/word/2006/wordml" xmlns:wps="http://schemas.microsoft.com/office/word/2010/wordprocessingShape" mc:Ignorable="w14 w15 w16se w16cid w16 w16cex w16sdtdh wp14">
   <w:p>
     <w:pPr>
       <w:tabs>
@@ -7785,7 +8063,7 @@
 </file>
 
 <file path=word/numbering.xml><?xml version="1.0" encoding="utf-8"?>
-<w:numbering xmlns:wpc="http://schemas.microsoft.com/office/word/2010/wordprocessingCanvas" xmlns:cx="http://schemas.microsoft.com/office/drawing/2014/chartex" xmlns:cx1="http://schemas.microsoft.com/office/drawing/2015/9/8/chartex" xmlns:cx2="http://schemas.microsoft.com/office/drawing/2015/10/21/chartex" xmlns:cx3="http://schemas.microsoft.com/office/drawing/2016/5/9/chartex" xmlns:cx4="http://schemas.microsoft.com/office/drawing/2016/5/10/chartex" xmlns:cx5="http://schemas.microsoft.com/office/drawing/2016/5/11/chartex" xmlns:cx6="http://schemas.microsoft.com/office/drawing/2016/5/12/chartex" xmlns:cx7="http://schemas.microsoft.com/office/drawing/2016/5/13/chartex" xmlns:cx8="http://schemas.microsoft.com/office/drawing/2016/5/14/chartex" xmlns:mc="http://schemas.openxmlformats.org/markup-compatibility/2006" xmlns:aink="http://schemas.microsoft.com/office/drawing/2016/ink" xmlns:am3d="http://schemas.microsoft.com/office/drawing/2017/model3d" xmlns:o="urn:schemas-microsoft-com:office:office" xmlns:oel="http://schemas.microsoft.com/office/2019/extlst" xmlns:r="http://schemas.openxmlformats.org/officeDocument/2006/relationships" xmlns:m="http://schemas.openxmlformats.org/officeDocument/2006/math" xmlns:v="urn:schemas-microsoft-com:vml" xmlns:wp14="http://schemas.microsoft.com/office/word/2010/wordprocessingDrawing" xmlns:wp="http://schemas.openxmlformats.org/drawingml/2006/wordprocessingDrawing" xmlns:w10="urn:schemas-microsoft-com:office:word" xmlns:w="http://schemas.openxmlformats.org/wordprocessingml/2006/main" xmlns:w14="http://schemas.microsoft.com/office/word/2010/wordml" xmlns:w15="http://schemas.microsoft.com/office/word/2012/wordml" xmlns:w16cex="http://schemas.microsoft.com/office/word/2018/wordml/cex" xmlns:w16cid="http://schemas.microsoft.com/office/word/2016/wordml/cid" xmlns:w16="http://schemas.microsoft.com/office/word/2018/wordml" xmlns:w16du="http://schemas.microsoft.com/office/word/2023/wordml/word16du" xmlns:w16sdtdh="http://schemas.microsoft.com/office/word/2020/wordml/sdtdatahash" xmlns:w16sdtfl="http://schemas.microsoft.com/office/word/2024/wordml/sdtformatlock" xmlns:w16se="http://schemas.microsoft.com/office/word/2015/wordml/symex" xmlns:wpg="http://schemas.microsoft.com/office/word/2010/wordprocessingGroup" xmlns:wpi="http://schemas.microsoft.com/office/word/2010/wordprocessingInk" xmlns:wne="http://schemas.microsoft.com/office/word/2006/wordml" xmlns:wps="http://schemas.microsoft.com/office/word/2010/wordprocessingShape" mc:Ignorable="w14 w15 w16se w16cid w16 w16cex w16sdtdh w16sdtfl w16du wp14">
+<w:numbering xmlns:wpc="http://schemas.microsoft.com/office/word/2010/wordprocessingCanvas" xmlns:cx="http://schemas.microsoft.com/office/drawing/2014/chartex" xmlns:cx1="http://schemas.microsoft.com/office/drawing/2015/9/8/chartex" xmlns:cx2="http://schemas.microsoft.com/office/drawing/2015/10/21/chartex" xmlns:cx3="http://schemas.microsoft.com/office/drawing/2016/5/9/chartex" xmlns:cx4="http://schemas.microsoft.com/office/drawing/2016/5/10/chartex" xmlns:cx5="http://schemas.microsoft.com/office/drawing/2016/5/11/chartex" xmlns:cx6="http://schemas.microsoft.com/office/drawing/2016/5/12/chartex" xmlns:cx7="http://schemas.microsoft.com/office/drawing/2016/5/13/chartex" xmlns:cx8="http://schemas.microsoft.com/office/drawing/2016/5/14/chartex" xmlns:mc="http://schemas.openxmlformats.org/markup-compatibility/2006" xmlns:aink="http://schemas.microsoft.com/office/drawing/2016/ink" xmlns:am3d="http://schemas.microsoft.com/office/drawing/2017/model3d" xmlns:o="urn:schemas-microsoft-com:office:office" xmlns:r="http://schemas.openxmlformats.org/officeDocument/2006/relationships" xmlns:m="http://schemas.openxmlformats.org/officeDocument/2006/math" xmlns:v="urn:schemas-microsoft-com:vml" xmlns:wp14="http://schemas.microsoft.com/office/word/2010/wordprocessingDrawing" xmlns:wp="http://schemas.openxmlformats.org/drawingml/2006/wordprocessingDrawing" xmlns:w10="urn:schemas-microsoft-com:office:word" xmlns:w="http://schemas.openxmlformats.org/wordprocessingml/2006/main" xmlns:w14="http://schemas.microsoft.com/office/word/2010/wordml" xmlns:w15="http://schemas.microsoft.com/office/word/2012/wordml" xmlns:w16cex="http://schemas.microsoft.com/office/word/2018/wordml/cex" xmlns:w16cid="http://schemas.microsoft.com/office/word/2016/wordml/cid" xmlns:w16="http://schemas.microsoft.com/office/word/2018/wordml" xmlns:w16sdtdh="http://schemas.microsoft.com/office/word/2020/wordml/sdtdatahash" xmlns:w16se="http://schemas.microsoft.com/office/word/2015/wordml/symex" xmlns:wpg="http://schemas.microsoft.com/office/word/2010/wordprocessingGroup" xmlns:wpi="http://schemas.microsoft.com/office/word/2010/wordprocessingInk" xmlns:wne="http://schemas.microsoft.com/office/word/2006/wordml" xmlns:wps="http://schemas.microsoft.com/office/word/2010/wordprocessingShape" mc:Ignorable="w14 w15 w16se w16cid w16 w16cex w16sdtdh wp14">
   <w:abstractNum w:abstractNumId="0" w15:restartNumberingAfterBreak="0">
     <w:nsid w:val="0B73725B"/>
     <w:multiLevelType w:val="hybridMultilevel"/>
@@ -9499,56 +9777,56 @@
       </w:rPr>
     </w:lvl>
   </w:abstractNum>
-  <w:num w:numId="1" w16cid:durableId="2056077662">
+  <w:num w:numId="1">
     <w:abstractNumId w:val="14"/>
   </w:num>
-  <w:num w:numId="2" w16cid:durableId="207180683">
+  <w:num w:numId="2">
     <w:abstractNumId w:val="6"/>
   </w:num>
-  <w:num w:numId="3" w16cid:durableId="317997399">
+  <w:num w:numId="3">
     <w:abstractNumId w:val="5"/>
   </w:num>
-  <w:num w:numId="4" w16cid:durableId="1059671073">
+  <w:num w:numId="4">
     <w:abstractNumId w:val="8"/>
   </w:num>
-  <w:num w:numId="5" w16cid:durableId="941497926">
+  <w:num w:numId="5">
     <w:abstractNumId w:val="7"/>
   </w:num>
-  <w:num w:numId="6" w16cid:durableId="1201211801">
+  <w:num w:numId="6">
     <w:abstractNumId w:val="1"/>
   </w:num>
-  <w:num w:numId="7" w16cid:durableId="966663894">
+  <w:num w:numId="7">
     <w:abstractNumId w:val="13"/>
   </w:num>
-  <w:num w:numId="8" w16cid:durableId="496580968">
+  <w:num w:numId="8">
     <w:abstractNumId w:val="3"/>
   </w:num>
-  <w:num w:numId="9" w16cid:durableId="1229918295">
+  <w:num w:numId="9">
     <w:abstractNumId w:val="0"/>
   </w:num>
-  <w:num w:numId="10" w16cid:durableId="63450755">
+  <w:num w:numId="10">
     <w:abstractNumId w:val="4"/>
   </w:num>
-  <w:num w:numId="11" w16cid:durableId="1894080372">
+  <w:num w:numId="11">
     <w:abstractNumId w:val="12"/>
   </w:num>
-  <w:num w:numId="12" w16cid:durableId="2063364277">
+  <w:num w:numId="12">
     <w:abstractNumId w:val="9"/>
   </w:num>
-  <w:num w:numId="13" w16cid:durableId="422265359">
+  <w:num w:numId="13">
     <w:abstractNumId w:val="11"/>
   </w:num>
-  <w:num w:numId="14" w16cid:durableId="520823779">
+  <w:num w:numId="14">
     <w:abstractNumId w:val="10"/>
   </w:num>
-  <w:num w:numId="15" w16cid:durableId="398672926">
+  <w:num w:numId="15">
     <w:abstractNumId w:val="2"/>
   </w:num>
 </w:numbering>
 </file>
 
 <file path=word/styles.xml><?xml version="1.0" encoding="utf-8"?>
-<w:styles xmlns:mc="http://schemas.openxmlformats.org/markup-compatibility/2006" xmlns:r="http://schemas.openxmlformats.org/officeDocument/2006/relationships" xmlns:w="http://schemas.openxmlformats.org/wordprocessingml/2006/main" xmlns:w14="http://schemas.microsoft.com/office/word/2010/wordml" xmlns:w15="http://schemas.microsoft.com/office/word/2012/wordml" xmlns:w16cex="http://schemas.microsoft.com/office/word/2018/wordml/cex" xmlns:w16cid="http://schemas.microsoft.com/office/word/2016/wordml/cid" xmlns:w16="http://schemas.microsoft.com/office/word/2018/wordml" xmlns:w16du="http://schemas.microsoft.com/office/word/2023/wordml/word16du" xmlns:w16sdtdh="http://schemas.microsoft.com/office/word/2020/wordml/sdtdatahash" xmlns:w16sdtfl="http://schemas.microsoft.com/office/word/2024/wordml/sdtformatlock" xmlns:w16se="http://schemas.microsoft.com/office/word/2015/wordml/symex" mc:Ignorable="w14 w15 w16se w16cid w16 w16cex w16sdtdh w16sdtfl w16du">
+<w:styles xmlns:mc="http://schemas.openxmlformats.org/markup-compatibility/2006" xmlns:r="http://schemas.openxmlformats.org/officeDocument/2006/relationships" xmlns:w="http://schemas.openxmlformats.org/wordprocessingml/2006/main" xmlns:w14="http://schemas.microsoft.com/office/word/2010/wordml" xmlns:w15="http://schemas.microsoft.com/office/word/2012/wordml" xmlns:w16cex="http://schemas.microsoft.com/office/word/2018/wordml/cex" xmlns:w16cid="http://schemas.microsoft.com/office/word/2016/wordml/cid" xmlns:w16="http://schemas.microsoft.com/office/word/2018/wordml" xmlns:w16sdtdh="http://schemas.microsoft.com/office/word/2020/wordml/sdtdatahash" xmlns:w16se="http://schemas.microsoft.com/office/word/2015/wordml/symex" mc:Ignorable="w14 w15 w16se w16cid w16 w16cex w16sdtdh">
   <w:docDefaults>
     <w:rPrDefault>
       <w:rPr>

</xml_diff>